<commit_message>
Agregado podcast 1, corregida imagen y text alt  de figura 1, actualizado DI
</commit_message>
<xml_diff>
--- a/fuentes/62330167_CF01_DI.docx
+++ b/fuentes/62330167_CF01_DI.docx
@@ -1,6 +1,6 @@
 
 <file path=word/document.xml><?xml version="1.0" encoding="utf-8"?>
-<w:document xmlns:wpc="http://schemas.microsoft.com/office/word/2010/wordprocessingCanvas" xmlns:cx="http://schemas.microsoft.com/office/drawing/2014/chartex" xmlns:cx1="http://schemas.microsoft.com/office/drawing/2015/9/8/chartex" xmlns:cx2="http://schemas.microsoft.com/office/drawing/2015/10/21/chartex" xmlns:cx3="http://schemas.microsoft.com/office/drawing/2016/5/9/chartex" xmlns:cx4="http://schemas.microsoft.com/office/drawing/2016/5/10/chartex" xmlns:cx5="http://schemas.microsoft.com/office/drawing/2016/5/11/chartex" xmlns:cx6="http://schemas.microsoft.com/office/drawing/2016/5/12/chartex" xmlns:cx7="http://schemas.microsoft.com/office/drawing/2016/5/13/chartex" xmlns:cx8="http://schemas.microsoft.com/office/drawing/2016/5/14/chartex" xmlns:mc="http://schemas.openxmlformats.org/markup-compatibility/2006" xmlns:aink="http://schemas.microsoft.com/office/drawing/2016/ink" xmlns:am3d="http://schemas.microsoft.com/office/drawing/2017/model3d" xmlns:o="urn:schemas-microsoft-com:office:office" xmlns:oel="http://schemas.microsoft.com/office/2019/extlst" xmlns:r="http://schemas.openxmlformats.org/officeDocument/2006/relationships" xmlns:m="http://schemas.openxmlformats.org/officeDocument/2006/math" xmlns:v="urn:schemas-microsoft-com:vml" xmlns:wp14="http://schemas.microsoft.com/office/word/2010/wordprocessingDrawing" xmlns:wp="http://schemas.openxmlformats.org/drawingml/2006/wordprocessingDrawing" xmlns:w10="urn:schemas-microsoft-com:office:word" xmlns:w="http://schemas.openxmlformats.org/wordprocessingml/2006/main" xmlns:w14="http://schemas.microsoft.com/office/word/2010/wordml" xmlns:w15="http://schemas.microsoft.com/office/word/2012/wordml" xmlns:w16cei="http://schemas.microsoft.com/office/word/2026/wordml/cei" xmlns:w16cex="http://schemas.microsoft.com/office/word/2018/wordml/cex" xmlns:w16cid="http://schemas.microsoft.com/office/word/2016/wordml/cid" xmlns:w16="http://schemas.microsoft.com/office/word/2018/wordml" xmlns:w16du="http://schemas.microsoft.com/office/word/2023/wordml/word16du" xmlns:w16sdtdh="http://schemas.microsoft.com/office/word/2020/wordml/sdtdatahash" xmlns:w16sdtfl="http://schemas.microsoft.com/office/word/2024/wordml/sdtformatlock" xmlns:w16se="http://schemas.microsoft.com/office/word/2015/wordml/symex" xmlns:wpg="http://schemas.microsoft.com/office/word/2010/wordprocessingGroup" xmlns:wpi="http://schemas.microsoft.com/office/word/2010/wordprocessingInk" xmlns:wne="http://schemas.microsoft.com/office/word/2006/wordml" xmlns:wps="http://schemas.microsoft.com/office/word/2010/wordprocessingShape" mc:Ignorable="w14 w15 w16se w16cid w16 w16cex w16sdtdh w16sdtfl w16du wp14">
+<w:document xmlns:wpc="http://schemas.microsoft.com/office/word/2010/wordprocessingCanvas" xmlns:cx="http://schemas.microsoft.com/office/drawing/2014/chartex" xmlns:cx1="http://schemas.microsoft.com/office/drawing/2015/9/8/chartex" xmlns:cx2="http://schemas.microsoft.com/office/drawing/2015/10/21/chartex" xmlns:cx3="http://schemas.microsoft.com/office/drawing/2016/5/9/chartex" xmlns:cx4="http://schemas.microsoft.com/office/drawing/2016/5/10/chartex" xmlns:cx5="http://schemas.microsoft.com/office/drawing/2016/5/11/chartex" xmlns:cx6="http://schemas.microsoft.com/office/drawing/2016/5/12/chartex" xmlns:cx7="http://schemas.microsoft.com/office/drawing/2016/5/13/chartex" xmlns:cx8="http://schemas.microsoft.com/office/drawing/2016/5/14/chartex" xmlns:mc="http://schemas.openxmlformats.org/markup-compatibility/2006" xmlns:aink="http://schemas.microsoft.com/office/drawing/2016/ink" xmlns:am3d="http://schemas.microsoft.com/office/drawing/2017/model3d" xmlns:o="urn:schemas-microsoft-com:office:office" xmlns:oel="http://schemas.microsoft.com/office/2019/extlst" xmlns:r="http://schemas.openxmlformats.org/officeDocument/2006/relationships" xmlns:m="http://schemas.openxmlformats.org/officeDocument/2006/math" xmlns:v="urn:schemas-microsoft-com:vml" xmlns:wp14="http://schemas.microsoft.com/office/word/2010/wordprocessingDrawing" xmlns:wp="http://schemas.openxmlformats.org/drawingml/2006/wordprocessingDrawing" xmlns:w10="urn:schemas-microsoft-com:office:word" xmlns:w="http://schemas.openxmlformats.org/wordprocessingml/2006/main" xmlns:w14="http://schemas.microsoft.com/office/word/2010/wordml" xmlns:w15="http://schemas.microsoft.com/office/word/2012/wordml" xmlns:w16cei="http://schemas.microsoft.com/office/word/2026/wordml/cei" xmlns:w16cex="http://schemas.microsoft.com/office/word/2018/wordml/cex" xmlns:w16cid="http://schemas.microsoft.com/office/word/2016/wordml/cid" xmlns:w16="http://schemas.microsoft.com/office/word/2018/wordml" xmlns:w16du="http://schemas.microsoft.com/office/word/2023/wordml/word16du" xmlns:w16sdtdh="http://schemas.microsoft.com/office/word/2020/wordml/sdtdatahash" xmlns:w16sdtfl="http://schemas.microsoft.com/office/word/2024/wordml/sdtformatlock" xmlns:w16se="http://schemas.microsoft.com/office/word/2015/wordml/symex" xmlns:wpg="http://schemas.microsoft.com/office/word/2010/wordprocessingGroup" xmlns:wpi="http://schemas.microsoft.com/office/word/2010/wordprocessingInk" xmlns:wne="http://schemas.microsoft.com/office/word/2006/wordml" xmlns:wps="http://schemas.microsoft.com/office/word/2010/wordprocessingShape" xmlns:a="http://schemas.openxmlformats.org/drawingml/2006/main" xmlns:pic="http://schemas.openxmlformats.org/drawingml/2006/picture" xmlns:a14="http://schemas.microsoft.com/office/drawing/2010/main" xmlns:dgm="http://schemas.openxmlformats.org/drawingml/2006/diagram" mc:Ignorable="w14 w15 w16se w16cid w16 w16cex w16sdtdh w16sdtfl w16du wp14">
   <w:body>
     <w:p>
       <w:pPr>
@@ -11,7 +11,7 @@
           <w:szCs w:val="20"/>
         </w:rPr>
       </w:pPr>
-      <w:bookmarkStart w:id="0" w:name="_Hlk201243306"/>
+      <w:bookmarkStart w:name="_Hlk201243306" w:id="0"/>
       <w:bookmarkEnd w:id="0"/>
       <w:r>
         <w:rPr>
@@ -60,12 +60,12 @@
         <w:tblW w:w="9962" w:type="dxa"/>
         <w:tblInd w:w="0" w:type="dxa"/>
         <w:tblBorders>
-          <w:top w:val="single" w:sz="4" w:space="0" w:color="000000"/>
-          <w:left w:val="single" w:sz="4" w:space="0" w:color="000000"/>
-          <w:bottom w:val="single" w:sz="4" w:space="0" w:color="000000"/>
-          <w:right w:val="single" w:sz="4" w:space="0" w:color="000000"/>
-          <w:insideH w:val="single" w:sz="4" w:space="0" w:color="000000"/>
-          <w:insideV w:val="single" w:sz="4" w:space="0" w:color="000000"/>
+          <w:top w:val="single" w:color="000000" w:sz="4" w:space="0"/>
+          <w:left w:val="single" w:color="000000" w:sz="4" w:space="0"/>
+          <w:bottom w:val="single" w:color="000000" w:sz="4" w:space="0"/>
+          <w:right w:val="single" w:color="000000" w:sz="4" w:space="0"/>
+          <w:insideH w:val="single" w:color="000000" w:sz="4" w:space="0"/>
+          <w:insideV w:val="single" w:color="000000" w:sz="4" w:space="0"/>
         </w:tblBorders>
         <w:tblLayout w:type="fixed"/>
         <w:tblLook w:val="0400" w:firstRow="0" w:lastRow="0" w:firstColumn="0" w:lastColumn="0" w:noHBand="0" w:noVBand="1"/>
@@ -152,12 +152,12 @@
         <w:tblW w:w="9962" w:type="dxa"/>
         <w:tblInd w:w="0" w:type="dxa"/>
         <w:tblBorders>
-          <w:top w:val="single" w:sz="4" w:space="0" w:color="000000"/>
-          <w:left w:val="single" w:sz="4" w:space="0" w:color="000000"/>
-          <w:bottom w:val="single" w:sz="4" w:space="0" w:color="000000"/>
-          <w:right w:val="single" w:sz="4" w:space="0" w:color="000000"/>
-          <w:insideH w:val="single" w:sz="4" w:space="0" w:color="000000"/>
-          <w:insideV w:val="single" w:sz="4" w:space="0" w:color="000000"/>
+          <w:top w:val="single" w:color="000000" w:sz="4" w:space="0"/>
+          <w:left w:val="single" w:color="000000" w:sz="4" w:space="0"/>
+          <w:bottom w:val="single" w:color="000000" w:sz="4" w:space="0"/>
+          <w:right w:val="single" w:color="000000" w:sz="4" w:space="0"/>
+          <w:insideH w:val="single" w:color="000000" w:sz="4" w:space="0"/>
+          <w:insideV w:val="single" w:color="000000" w:sz="4" w:space="0"/>
         </w:tblBorders>
         <w:tblLayout w:type="fixed"/>
         <w:tblLook w:val="0400" w:firstRow="0" w:lastRow="0" w:firstColumn="0" w:lastColumn="0" w:noHBand="0" w:noVBand="1"/>
@@ -354,12 +354,12 @@
         <w:tblW w:w="9962" w:type="dxa"/>
         <w:tblInd w:w="0" w:type="dxa"/>
         <w:tblBorders>
-          <w:top w:val="single" w:sz="4" w:space="0" w:color="000000"/>
-          <w:left w:val="single" w:sz="4" w:space="0" w:color="000000"/>
-          <w:bottom w:val="single" w:sz="4" w:space="0" w:color="000000"/>
-          <w:right w:val="single" w:sz="4" w:space="0" w:color="000000"/>
-          <w:insideH w:val="single" w:sz="4" w:space="0" w:color="000000"/>
-          <w:insideV w:val="single" w:sz="4" w:space="0" w:color="000000"/>
+          <w:top w:val="single" w:color="000000" w:sz="4" w:space="0"/>
+          <w:left w:val="single" w:color="000000" w:sz="4" w:space="0"/>
+          <w:bottom w:val="single" w:color="000000" w:sz="4" w:space="0"/>
+          <w:right w:val="single" w:color="000000" w:sz="4" w:space="0"/>
+          <w:insideH w:val="single" w:color="000000" w:sz="4" w:space="0"/>
+          <w:insideV w:val="single" w:color="000000" w:sz="4" w:space="0"/>
         </w:tblBorders>
         <w:tblLayout w:type="fixed"/>
         <w:tblLook w:val="0400" w:firstRow="0" w:lastRow="0" w:firstColumn="0" w:lastColumn="0" w:noHBand="0" w:noVBand="1"/>
@@ -632,12 +632,12 @@
         <w:tblW w:w="9962" w:type="dxa"/>
         <w:tblInd w:w="0" w:type="dxa"/>
         <w:tblBorders>
-          <w:top w:val="single" w:sz="4" w:space="0" w:color="000000"/>
-          <w:left w:val="single" w:sz="4" w:space="0" w:color="000000"/>
-          <w:bottom w:val="single" w:sz="4" w:space="0" w:color="000000"/>
-          <w:right w:val="single" w:sz="4" w:space="0" w:color="000000"/>
-          <w:insideH w:val="single" w:sz="4" w:space="0" w:color="000000"/>
-          <w:insideV w:val="single" w:sz="4" w:space="0" w:color="000000"/>
+          <w:top w:val="single" w:color="000000" w:sz="4" w:space="0"/>
+          <w:left w:val="single" w:color="000000" w:sz="4" w:space="0"/>
+          <w:bottom w:val="single" w:color="000000" w:sz="4" w:space="0"/>
+          <w:right w:val="single" w:color="000000" w:sz="4" w:space="0"/>
+          <w:insideH w:val="single" w:color="000000" w:sz="4" w:space="0"/>
+          <w:insideV w:val="single" w:color="000000" w:sz="4" w:space="0"/>
         </w:tblBorders>
         <w:tblLayout w:type="fixed"/>
         <w:tblLook w:val="0400" w:firstRow="0" w:lastRow="0" w:firstColumn="0" w:lastColumn="0" w:noHBand="0" w:noVBand="1"/>
@@ -1669,7 +1669,7 @@
                 <w:szCs w:val="20"/>
               </w:rPr>
               <w:drawing>
-                <wp:anchor distT="0" distB="0" distL="114300" distR="114300" simplePos="0" relativeHeight="251671552" behindDoc="1" locked="0" layoutInCell="1" allowOverlap="1" wp14:anchorId="6623A156" wp14:editId="32ADE21C">
+                <wp:anchor distT="0" distB="0" distL="114300" distR="114300" simplePos="0" relativeHeight="251671552" behindDoc="1" locked="0" layoutInCell="1" allowOverlap="1" wp14:anchorId="6623A156" wp14:editId="27FAE30F">
                   <wp:simplePos x="0" y="0"/>
                   <wp:positionH relativeFrom="margin">
                     <wp:posOffset>24130</wp:posOffset>
@@ -1986,7 +1986,7 @@
                 <w:szCs w:val="20"/>
               </w:rPr>
             </w:pPr>
-            <w:hyperlink r:id="rId15" w:history="1">
+            <w:hyperlink w:history="1" r:id="rId15">
               <w:r>
                 <w:rPr>
                   <w:rStyle w:val="Hipervnculo"/>
@@ -2494,7 +2494,6 @@
               </w:tc>
             </w:tr>
           </w:tbl>
-          <w:commentRangeEnd w:id="4"/>
           <w:p>
             <w:pPr>
               <w:jc w:val="both"/>
@@ -2507,6 +2506,7 @@
                 <w:szCs w:val="20"/>
               </w:rPr>
             </w:pPr>
+            <w:commentRangeEnd w:id="4"/>
             <w:r>
               <w:rPr>
                 <w:rStyle w:val="Refdecomentario"/>
@@ -3381,7 +3381,6 @@
         </w:tc>
       </w:tr>
     </w:tbl>
-    <w:commentRangeEnd w:id="5"/>
     <w:p>
       <w:pPr>
         <w:jc w:val="both"/>
@@ -3390,6 +3389,7 @@
           <w:szCs w:val="20"/>
         </w:rPr>
       </w:pPr>
+      <w:commentRangeEnd w:id="5"/>
       <w:r>
         <w:rPr>
           <w:rStyle w:val="Refdecomentario"/>
@@ -4264,7 +4264,7 @@
           <w:szCs w:val="20"/>
         </w:rPr>
         <w:drawing>
-          <wp:anchor distT="0" distB="0" distL="114300" distR="114300" simplePos="0" relativeHeight="251655168" behindDoc="0" locked="0" layoutInCell="1" allowOverlap="1" wp14:anchorId="1A269420" wp14:editId="24718952">
+          <wp:anchor distT="0" distB="0" distL="114300" distR="114300" simplePos="0" relativeHeight="251655168" behindDoc="0" locked="0" layoutInCell="1" allowOverlap="1" wp14:anchorId="1A269420" wp14:editId="081EFDCA">
             <wp:simplePos x="0" y="0"/>
             <wp:positionH relativeFrom="margin">
               <wp:align>left</wp:align>
@@ -5056,7 +5056,6 @@
         </w:tc>
       </w:tr>
     </w:tbl>
-    <w:commentRangeEnd w:id="9"/>
     <w:p>
       <w:pPr>
         <w:jc w:val="both"/>
@@ -5065,6 +5064,7 @@
           <w:szCs w:val="20"/>
         </w:rPr>
       </w:pPr>
+      <w:commentRangeEnd w:id="9"/>
       <w:r>
         <w:rPr>
           <w:rStyle w:val="Refdecomentario"/>
@@ -6260,7 +6260,6 @@
         </w:tc>
       </w:tr>
     </w:tbl>
-    <w:commentRangeEnd w:id="10"/>
     <w:p>
       <w:pPr>
         <w:jc w:val="both"/>
@@ -6269,6 +6268,7 @@
           <w:szCs w:val="20"/>
         </w:rPr>
       </w:pPr>
+      <w:commentRangeEnd w:id="10"/>
       <w:r>
         <w:rPr>
           <w:rStyle w:val="Refdecomentario"/>
@@ -7918,7 +7918,6 @@
               </w:tc>
             </w:tr>
           </w:tbl>
-          <w:commentRangeEnd w:id="11"/>
           <w:p>
             <w:pPr>
               <w:jc w:val="both"/>
@@ -7931,6 +7930,7 @@
                 <w:szCs w:val="20"/>
               </w:rPr>
             </w:pPr>
+            <w:commentRangeEnd w:id="11"/>
             <w:r>
               <w:rPr>
                 <w:rStyle w:val="Refdecomentario"/>
@@ -8895,8 +8895,8 @@
           </mc:Choice>
           <mc:Fallback>
             <w:pict>
-              <v:roundrect w14:anchorId="35E77F47" id="Rectángulo: esquinas redondeadas 15" o:spid="_x0000_s1026" style="position:absolute;left:0;text-align:left;margin-left:20.2pt;margin-top:4.75pt;width:450.35pt;height:42.8pt;z-index:251692032;visibility:visible;mso-wrap-style:square;mso-wrap-distance-left:9pt;mso-wrap-distance-top:0;mso-wrap-distance-right:9pt;mso-wrap-distance-bottom:0;mso-position-horizontal:absolute;mso-position-horizontal-relative:text;mso-position-vertical:absolute;mso-position-vertical-relative:text;v-text-anchor:middle" arcsize="10923f" o:gfxdata="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" fillcolor="#9bbb59 [3206]" strokecolor="white [3201]" strokeweight="3pt">
-                <v:shadow on="t" color="black" opacity="24903f" origin=",.5" offset="0,.55556mm"/>
+              <v:roundrect id="Rectángulo: esquinas redondeadas 15" style="position:absolute;left:0;text-align:left;margin-left:20.2pt;margin-top:4.75pt;width:450.35pt;height:42.8pt;z-index:251692032;visibility:visible;mso-wrap-style:square;mso-wrap-distance-left:9pt;mso-wrap-distance-top:0;mso-wrap-distance-right:9pt;mso-wrap-distance-bottom:0;mso-position-horizontal:absolute;mso-position-horizontal-relative:text;mso-position-vertical:absolute;mso-position-vertical-relative:text;v-text-anchor:middle" o:spid="_x0000_s1026" fillcolor="#9bbb59 [3206]" strokecolor="white [3201]" strokeweight="3pt" arcsize="10923f" w14:anchorId="35E77F47" o:gfxdata="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">
+                <v:shadow on="t" color="black" opacity="24903f" offset="0,.55556mm" origin=",.5"/>
                 <v:textbox>
                   <w:txbxContent>
                     <w:p>
@@ -9058,7 +9058,7 @@
                 <w:szCs w:val="20"/>
               </w:rPr>
               <w:drawing>
-                <wp:anchor distT="0" distB="0" distL="114300" distR="114300" simplePos="0" relativeHeight="251673600" behindDoc="1" locked="0" layoutInCell="1" allowOverlap="1" wp14:anchorId="52762F5D" wp14:editId="0A8ED441">
+                <wp:anchor distT="0" distB="0" distL="114300" distR="114300" simplePos="0" relativeHeight="251673600" behindDoc="1" locked="0" layoutInCell="1" allowOverlap="1" wp14:anchorId="52762F5D" wp14:editId="4490F54A">
                   <wp:simplePos x="0" y="0"/>
                   <wp:positionH relativeFrom="margin">
                     <wp:posOffset>24130</wp:posOffset>
@@ -9329,7 +9329,7 @@
                 <w:szCs w:val="20"/>
               </w:rPr>
             </w:pPr>
-            <w:hyperlink r:id="rId25" w:history="1">
+            <w:hyperlink w:history="1" r:id="rId25">
               <w:r>
                 <w:rPr>
                   <w:rStyle w:val="Hipervnculo"/>
@@ -9357,7 +9357,6 @@
         </w:tc>
       </w:tr>
     </w:tbl>
-    <w:commentRangeEnd w:id="12"/>
     <w:p>
       <w:pPr>
         <w:jc w:val="both"/>
@@ -9368,6 +9367,7 @@
           <w:szCs w:val="20"/>
         </w:rPr>
       </w:pPr>
+      <w:commentRangeEnd w:id="12"/>
       <w:r>
         <w:rPr>
           <w:rStyle w:val="Refdecomentario"/>
@@ -9408,7 +9408,7 @@
           <w:szCs w:val="20"/>
         </w:rPr>
         <w:drawing>
-          <wp:anchor distT="0" distB="0" distL="114300" distR="114300" simplePos="0" relativeHeight="251654144" behindDoc="0" locked="0" layoutInCell="1" allowOverlap="1" wp14:anchorId="40B076EB" wp14:editId="79C80C5A">
+          <wp:anchor distT="0" distB="0" distL="114300" distR="114300" simplePos="0" relativeHeight="251654144" behindDoc="0" locked="0" layoutInCell="1" allowOverlap="1" wp14:anchorId="40B076EB" wp14:editId="466FA81B">
             <wp:simplePos x="0" y="0"/>
             <wp:positionH relativeFrom="margin">
               <wp:align>left</wp:align>
@@ -10152,7 +10152,7 @@
                 <w:szCs w:val="20"/>
               </w:rPr>
               <w:drawing>
-                <wp:anchor distT="0" distB="0" distL="114300" distR="114300" simplePos="0" relativeHeight="251675648" behindDoc="1" locked="0" layoutInCell="1" allowOverlap="1" wp14:anchorId="670BDFB3" wp14:editId="6A7A8833">
+                <wp:anchor distT="0" distB="0" distL="114300" distR="114300" simplePos="0" relativeHeight="251675648" behindDoc="1" locked="0" layoutInCell="1" allowOverlap="1" wp14:anchorId="670BDFB3" wp14:editId="22F5B00D">
                   <wp:simplePos x="0" y="0"/>
                   <wp:positionH relativeFrom="margin">
                     <wp:posOffset>24130</wp:posOffset>
@@ -10435,7 +10435,7 @@
                 <w:szCs w:val="20"/>
               </w:rPr>
             </w:pPr>
-            <w:hyperlink r:id="rId27" w:history="1">
+            <w:hyperlink w:history="1" r:id="rId27">
               <w:r>
                 <w:rPr>
                   <w:rStyle w:val="Hipervnculo"/>
@@ -10485,7 +10485,6 @@
         </w:rPr>
       </w:pPr>
     </w:p>
-    <w:commentRangeEnd w:id="13"/>
     <w:p>
       <w:pPr>
         <w:jc w:val="both"/>
@@ -10494,6 +10493,7 @@
           <w:szCs w:val="20"/>
         </w:rPr>
       </w:pPr>
+      <w:commentRangeEnd w:id="13"/>
       <w:r>
         <w:rPr>
           <w:rStyle w:val="Refdecomentario"/>
@@ -11767,7 +11767,6 @@
         </w:tc>
       </w:tr>
     </w:tbl>
-    <w:commentRangeEnd w:id="17"/>
     <w:p>
       <w:pPr>
         <w:jc w:val="both"/>
@@ -11778,6 +11777,7 @@
           <w:szCs w:val="20"/>
         </w:rPr>
       </w:pPr>
+      <w:commentRangeEnd w:id="17"/>
       <w:r>
         <w:rPr>
           <w:rStyle w:val="Refdecomentario"/>
@@ -14024,7 +14024,7 @@
         <w:spacing w:line="240" w:lineRule="auto"/>
         <w:jc w:val="both"/>
         <w:rPr>
-          <w:rFonts w:ascii="Aptos Narrow" w:eastAsia="Times New Roman" w:hAnsi="Aptos Narrow" w:cs="Times New Roman"/>
+          <w:rFonts w:ascii="Aptos Narrow" w:hAnsi="Aptos Narrow" w:eastAsia="Times New Roman" w:cs="Times New Roman"/>
           <w:b/>
           <w:bCs/>
           <w:color w:val="000000"/>
@@ -14441,23 +14441,18 @@
           <w:szCs w:val="20"/>
         </w:rPr>
       </w:pPr>
-      <w:commentRangeStart w:id="19"/>
-      <w:commentRangeStart w:id="20"/>
-      <w:r>
-        <w:rPr>
-          <w:noProof/>
-        </w:rPr>
-        <w:lastRenderedPageBreak/>
+      <w:commentRangeStart w:id="1987186658"/>
+      <w:r>
         <w:drawing>
-          <wp:inline distT="0" distB="0" distL="0" distR="0" wp14:anchorId="4986B0D1" wp14:editId="45DD8DF9">
+          <wp:inline wp14:editId="312D50F4" wp14:anchorId="4986B0D1">
             <wp:extent cx="5070764" cy="2853821"/>
             <wp:effectExtent l="0" t="0" r="0" b="3810"/>
             <wp:docPr id="1980883400" name="Imagen 2"/>
             <wp:cNvGraphicFramePr>
-              <a:graphicFrameLocks xmlns:a="http://schemas.openxmlformats.org/drawingml/2006/main" noChangeAspect="1"/>
+              <a:graphicFrameLocks noChangeAspect="1"/>
             </wp:cNvGraphicFramePr>
-            <a:graphic xmlns:a="http://schemas.openxmlformats.org/drawingml/2006/main">
-              <a:graphicData uri="http://schemas.openxmlformats.org/drawingml/2006/picture">
+            <a:graphic>
+              <a:graphicData xmlns:a="http://schemas.openxmlformats.org/drawingml/2006/main" uri="http://schemas.openxmlformats.org/drawingml/2006/picture">
                 <pic:pic xmlns:pic="http://schemas.openxmlformats.org/drawingml/2006/picture">
                   <pic:nvPicPr>
                     <pic:cNvPr id="0" name="Picture 5"/>
@@ -14466,7 +14461,7 @@
                     </pic:cNvPicPr>
                   </pic:nvPicPr>
                   <pic:blipFill>
-                    <a:blip r:embed="rId28" cstate="print">
+                    <a:blip xmlns:r="http://schemas.openxmlformats.org/officeDocument/2006/relationships" r:embed="rId28" cstate="print">
                       <a:extLst>
                         <a:ext uri="{28A0092B-C50C-407E-A947-70E740481C1C}">
                           <a14:useLocalDpi xmlns:a14="http://schemas.microsoft.com/office/drawing/2010/main" val="0"/>
@@ -14494,23 +14489,12 @@
           </wp:inline>
         </w:drawing>
       </w:r>
-      <w:commentRangeEnd w:id="20"/>
-      <w:r>
-        <w:rPr>
-          <w:rStyle w:val="Refdecomentario"/>
-          <w:sz w:val="20"/>
-          <w:szCs w:val="20"/>
-        </w:rPr>
-        <w:commentReference w:id="20"/>
-      </w:r>
-      <w:commentRangeEnd w:id="19"/>
-      <w:r>
-        <w:rPr>
-          <w:rStyle w:val="Refdecomentario"/>
-          <w:sz w:val="20"/>
-          <w:szCs w:val="20"/>
-        </w:rPr>
-        <w:commentReference w:id="19"/>
+      <w:commentRangeEnd w:id="1987186658"/>
+      <w:r>
+        <w:rPr>
+          <w:rStyle w:val="CommentReference"/>
+        </w:rPr>
+        <w:commentReference w:id="1987186658"/>
       </w:r>
     </w:p>
     <w:p>
@@ -14640,7 +14624,7 @@
           <w:szCs w:val="20"/>
         </w:rPr>
       </w:pPr>
-      <w:commentRangeStart w:id="21"/>
+      <w:commentRangeStart w:id="20"/>
     </w:p>
     <w:tbl>
       <w:tblPr>
@@ -14709,7 +14693,7 @@
                 <w:szCs w:val="20"/>
               </w:rPr>
               <w:drawing>
-                <wp:anchor distT="0" distB="0" distL="114300" distR="114300" simplePos="0" relativeHeight="251677696" behindDoc="1" locked="0" layoutInCell="1" allowOverlap="1" wp14:anchorId="629DEE32" wp14:editId="63450916">
+                <wp:anchor distT="0" distB="0" distL="114300" distR="114300" simplePos="0" relativeHeight="251677696" behindDoc="1" locked="0" layoutInCell="1" allowOverlap="1" wp14:anchorId="629DEE32" wp14:editId="53594695">
                   <wp:simplePos x="0" y="0"/>
                   <wp:positionH relativeFrom="margin">
                     <wp:posOffset>24130</wp:posOffset>
@@ -14945,7 +14929,7 @@
                 <w:szCs w:val="20"/>
               </w:rPr>
             </w:pPr>
-            <w:commentRangeStart w:id="22"/>
+            <w:commentRangeStart w:id="21"/>
           </w:p>
         </w:tc>
         <w:tc>
@@ -14990,7 +14974,7 @@
                 <w:szCs w:val="20"/>
               </w:rPr>
             </w:pPr>
-            <w:hyperlink r:id="rId29" w:history="1">
+            <w:hyperlink w:history="1" r:id="rId29">
               <w:r>
                 <w:rPr>
                   <w:rStyle w:val="Hipervnculo"/>
@@ -15000,20 +14984,19 @@
                 <w:t>https://www.youtube.com/watch?v=EmGQqh0hoNc</w:t>
               </w:r>
             </w:hyperlink>
-            <w:commentRangeEnd w:id="22"/>
+            <w:commentRangeEnd w:id="21"/>
             <w:r>
               <w:rPr>
                 <w:rStyle w:val="Refdecomentario"/>
                 <w:sz w:val="20"/>
                 <w:szCs w:val="20"/>
               </w:rPr>
-              <w:commentReference w:id="22"/>
+              <w:commentReference w:id="21"/>
             </w:r>
           </w:p>
         </w:tc>
       </w:tr>
     </w:tbl>
-    <w:commentRangeEnd w:id="21"/>
     <w:p>
       <w:pPr>
         <w:jc w:val="both"/>
@@ -15024,6 +15007,7 @@
           <w:szCs w:val="20"/>
         </w:rPr>
       </w:pPr>
+      <w:commentRangeEnd w:id="20"/>
       <w:r>
         <w:rPr>
           <w:rStyle w:val="Refdecomentario"/>
@@ -15032,7 +15016,7 @@
           <w:sz w:val="20"/>
           <w:szCs w:val="20"/>
         </w:rPr>
-        <w:commentReference w:id="21"/>
+        <w:commentReference w:id="20"/>
       </w:r>
     </w:p>
     <w:p>
@@ -15159,8 +15143,8 @@
           </mc:Choice>
           <mc:Fallback>
             <w:pict>
-              <v:roundrect w14:anchorId="0CB0E41A" id="_x0000_s1027" style="position:absolute;left:0;text-align:left;margin-left:399.15pt;margin-top:12.25pt;width:450.35pt;height:42.8pt;z-index:251694080;visibility:visible;mso-wrap-style:square;mso-wrap-distance-left:9pt;mso-wrap-distance-top:0;mso-wrap-distance-right:9pt;mso-wrap-distance-bottom:0;mso-position-horizontal:right;mso-position-horizontal-relative:margin;mso-position-vertical:absolute;mso-position-vertical-relative:text;v-text-anchor:middle" arcsize="10923f" o:gfxdata="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" fillcolor="#9bbb59 [3206]" strokecolor="white [3201]" strokeweight="3pt">
-                <v:shadow on="t" color="black" opacity="24903f" origin=",.5" offset="0,.55556mm"/>
+              <v:roundrect id="_x0000_s1027" style="position:absolute;left:0;text-align:left;margin-left:399.15pt;margin-top:12.25pt;width:450.35pt;height:42.8pt;z-index:251694080;visibility:visible;mso-wrap-style:square;mso-wrap-distance-left:9pt;mso-wrap-distance-top:0;mso-wrap-distance-right:9pt;mso-wrap-distance-bottom:0;mso-position-horizontal:right;mso-position-horizontal-relative:margin;mso-position-vertical:absolute;mso-position-vertical-relative:text;v-text-anchor:middle" fillcolor="#9bbb59 [3206]" strokecolor="white [3201]" strokeweight="3pt" arcsize="10923f" w14:anchorId="0CB0E41A" o:gfxdata="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">
+                <v:shadow on="t" color="black" opacity="24903f" offset="0,.55556mm" origin=",.5"/>
                 <v:textbox>
                   <w:txbxContent>
                     <w:p>
@@ -15292,7 +15276,7 @@
           <w:szCs w:val="20"/>
         </w:rPr>
         <w:drawing>
-          <wp:anchor distT="0" distB="0" distL="114300" distR="114300" simplePos="0" relativeHeight="251653120" behindDoc="0" locked="0" layoutInCell="1" allowOverlap="1" wp14:anchorId="0A830571" wp14:editId="63021DFB">
+          <wp:anchor distT="0" distB="0" distL="114300" distR="114300" simplePos="0" relativeHeight="251653120" behindDoc="0" locked="0" layoutInCell="1" allowOverlap="1" wp14:anchorId="0A830571" wp14:editId="50C5E7C5">
             <wp:simplePos x="0" y="0"/>
             <wp:positionH relativeFrom="margin">
               <wp:align>left</wp:align>
@@ -15733,7 +15717,7 @@
                 <w:szCs w:val="20"/>
               </w:rPr>
             </w:pPr>
-            <w:commentRangeStart w:id="23"/>
+            <w:commentRangeStart w:id="22"/>
             <w:r>
               <w:rPr>
                 <w:rFonts w:ascii="Segoe UI Emoji" w:hAnsi="Segoe UI Emoji" w:cs="Segoe UI Emoji"/>
@@ -16152,7 +16136,6 @@
               </w:tc>
             </w:tr>
           </w:tbl>
-          <w:commentRangeEnd w:id="23"/>
           <w:p>
             <w:pPr>
               <w:jc w:val="both"/>
@@ -16165,6 +16148,7 @@
                 <w:szCs w:val="20"/>
               </w:rPr>
             </w:pPr>
+            <w:commentRangeEnd w:id="22"/>
             <w:r>
               <w:rPr>
                 <w:rStyle w:val="Refdecomentario"/>
@@ -16175,7 +16159,7 @@
                 <w:sz w:val="20"/>
                 <w:szCs w:val="20"/>
               </w:rPr>
-              <w:commentReference w:id="23"/>
+              <w:commentReference w:id="22"/>
             </w:r>
           </w:p>
         </w:tc>
@@ -17341,7 +17325,7 @@
                 <w:szCs w:val="20"/>
               </w:rPr>
             </w:pPr>
-            <w:commentRangeStart w:id="24"/>
+            <w:commentRangeStart w:id="23"/>
             <w:r>
               <w:rPr>
                 <w:rFonts w:ascii="Segoe UI Emoji" w:hAnsi="Segoe UI Emoji" w:cs="Segoe UI Emoji"/>
@@ -17648,7 +17632,6 @@
               </w:tc>
             </w:tr>
           </w:tbl>
-          <w:commentRangeEnd w:id="24"/>
           <w:p>
             <w:pPr>
               <w:jc w:val="both"/>
@@ -17661,6 +17644,7 @@
                 <w:szCs w:val="20"/>
               </w:rPr>
             </w:pPr>
+            <w:commentRangeEnd w:id="23"/>
             <w:r>
               <w:rPr>
                 <w:rStyle w:val="Refdecomentario"/>
@@ -17671,7 +17655,7 @@
                 <w:sz w:val="20"/>
                 <w:szCs w:val="20"/>
               </w:rPr>
-              <w:commentReference w:id="24"/>
+              <w:commentReference w:id="23"/>
             </w:r>
           </w:p>
         </w:tc>
@@ -18640,7 +18624,7 @@
           <w:szCs w:val="20"/>
         </w:rPr>
       </w:pPr>
-      <w:commentRangeStart w:id="25"/>
+      <w:commentRangeStart w:id="24"/>
       <w:r>
         <w:rPr>
           <w:b/>
@@ -18741,7 +18725,7 @@
                 <w:szCs w:val="20"/>
               </w:rPr>
               <w:drawing>
-                <wp:anchor distT="0" distB="0" distL="114300" distR="114300" simplePos="0" relativeHeight="251679744" behindDoc="1" locked="0" layoutInCell="1" allowOverlap="1" wp14:anchorId="71FA9310" wp14:editId="1593D293">
+                <wp:anchor distT="0" distB="0" distL="114300" distR="114300" simplePos="0" relativeHeight="251679744" behindDoc="1" locked="0" layoutInCell="1" allowOverlap="1" wp14:anchorId="71FA9310" wp14:editId="0ACF60EC">
                   <wp:simplePos x="0" y="0"/>
                   <wp:positionH relativeFrom="margin">
                     <wp:posOffset>24130</wp:posOffset>
@@ -19008,7 +18992,7 @@
                 <w:szCs w:val="20"/>
               </w:rPr>
             </w:pPr>
-            <w:commentRangeStart w:id="26"/>
+            <w:commentRangeStart w:id="25"/>
           </w:p>
         </w:tc>
         <w:tc>
@@ -19047,7 +19031,7 @@
                 <w:szCs w:val="20"/>
               </w:rPr>
             </w:pPr>
-            <w:hyperlink r:id="rId31" w:history="1">
+            <w:hyperlink w:history="1" r:id="rId31">
               <w:r>
                 <w:rPr>
                   <w:rStyle w:val="Hipervnculo"/>
@@ -19064,20 +19048,19 @@
               </w:rPr>
               <w:t xml:space="preserve"> </w:t>
             </w:r>
-            <w:commentRangeEnd w:id="26"/>
+            <w:commentRangeEnd w:id="25"/>
             <w:r>
               <w:rPr>
                 <w:rStyle w:val="Refdecomentario"/>
                 <w:sz w:val="20"/>
                 <w:szCs w:val="20"/>
               </w:rPr>
-              <w:commentReference w:id="26"/>
+              <w:commentReference w:id="25"/>
             </w:r>
           </w:p>
         </w:tc>
       </w:tr>
     </w:tbl>
-    <w:commentRangeEnd w:id="25"/>
     <w:p>
       <w:pPr>
         <w:jc w:val="both"/>
@@ -19086,13 +19069,14 @@
           <w:szCs w:val="20"/>
         </w:rPr>
       </w:pPr>
+      <w:commentRangeEnd w:id="24"/>
       <w:r>
         <w:rPr>
           <w:rStyle w:val="Refdecomentario"/>
           <w:sz w:val="20"/>
           <w:szCs w:val="20"/>
         </w:rPr>
-        <w:commentReference w:id="25"/>
+        <w:commentReference w:id="24"/>
       </w:r>
     </w:p>
     <w:p>
@@ -19248,7 +19232,7 @@
           <w:szCs w:val="20"/>
         </w:rPr>
         <w:drawing>
-          <wp:anchor distT="0" distB="0" distL="114300" distR="114300" simplePos="0" relativeHeight="251652096" behindDoc="0" locked="0" layoutInCell="1" allowOverlap="1" wp14:anchorId="7CC84812" wp14:editId="01FE5873">
+          <wp:anchor distT="0" distB="0" distL="114300" distR="114300" simplePos="0" relativeHeight="251652096" behindDoc="0" locked="0" layoutInCell="1" allowOverlap="1" wp14:anchorId="7CC84812" wp14:editId="42928A45">
             <wp:simplePos x="0" y="0"/>
             <wp:positionH relativeFrom="margin">
               <wp:align>left</wp:align>
@@ -19525,7 +19509,7 @@
         </w:rPr>
         <w:t>Asimismo, el componente fortalece la capacidad del aprendiz para analizar el mercado, segmentar consumidores y reconocer oportunidades comerciales sostenibles en función del contexto local. Mediante el uso de herramientas, métodos y técnicas de prospección, se promueve la toma de decisiones fundamentadas que integran criterios ambientales, sociales y económicos, contribuyendo al desarrollo</w:t>
       </w:r>
-      <w:commentRangeStart w:id="27"/>
+      <w:commentRangeStart w:id="26"/>
       <w:r>
         <w:rPr>
           <w:noProof/>
@@ -19534,7 +19518,7 @@
         </w:rPr>
         <w:t xml:space="preserve"> de competencias necesarias para la caracterización del cliente y la identificación de oportunidades en negocios sostenibles.</w:t>
       </w:r>
-      <w:commentRangeEnd w:id="27"/>
+      <w:commentRangeEnd w:id="26"/>
       <w:r>
         <w:rPr>
           <w:rStyle w:val="Refdecomentario"/>
@@ -19542,7 +19526,7 @@
           <w:sz w:val="20"/>
           <w:szCs w:val="20"/>
         </w:rPr>
-        <w:commentReference w:id="27"/>
+        <w:commentReference w:id="26"/>
       </w:r>
     </w:p>
     <w:p>
@@ -19572,7 +19556,7 @@
         </w:rPr>
         <w:lastRenderedPageBreak/>
         <w:drawing>
-          <wp:inline distT="0" distB="0" distL="0" distR="0" wp14:anchorId="51BC55B6" wp14:editId="6EB03F55">
+          <wp:inline distT="0" distB="0" distL="0" distR="0" wp14:anchorId="51BC55B6" wp14:editId="1B6348B4">
             <wp:extent cx="5486400" cy="3200400"/>
             <wp:effectExtent l="0" t="0" r="0" b="19050"/>
             <wp:docPr id="972893344" name="Diagrama 1"/>
@@ -19642,12 +19626,12 @@
         <w:tblW w:w="0" w:type="auto"/>
         <w:tblInd w:w="421" w:type="dxa"/>
         <w:tblBorders>
-          <w:top w:val="single" w:sz="4" w:space="0" w:color="000000"/>
-          <w:left w:val="single" w:sz="4" w:space="0" w:color="000000"/>
-          <w:bottom w:val="single" w:sz="4" w:space="0" w:color="000000"/>
-          <w:right w:val="single" w:sz="4" w:space="0" w:color="000000"/>
-          <w:insideH w:val="single" w:sz="4" w:space="0" w:color="000000"/>
-          <w:insideV w:val="single" w:sz="4" w:space="0" w:color="000000"/>
+          <w:top w:val="single" w:color="000000" w:sz="4" w:space="0"/>
+          <w:left w:val="single" w:color="000000" w:sz="4" w:space="0"/>
+          <w:bottom w:val="single" w:color="000000" w:sz="4" w:space="0"/>
+          <w:right w:val="single" w:color="000000" w:sz="4" w:space="0"/>
+          <w:insideH w:val="single" w:color="000000" w:sz="4" w:space="0"/>
+          <w:insideV w:val="single" w:color="000000" w:sz="4" w:space="0"/>
         </w:tblBorders>
         <w:tblLook w:val="0400" w:firstRow="0" w:lastRow="0" w:firstColumn="0" w:lastColumn="0" w:noHBand="0" w:noVBand="1"/>
       </w:tblPr>
@@ -20039,12 +20023,12 @@
         <w:tblW w:w="9962" w:type="dxa"/>
         <w:tblInd w:w="0" w:type="dxa"/>
         <w:tblBorders>
-          <w:top w:val="single" w:sz="4" w:space="0" w:color="000000"/>
-          <w:left w:val="single" w:sz="4" w:space="0" w:color="000000"/>
-          <w:bottom w:val="single" w:sz="4" w:space="0" w:color="000000"/>
-          <w:right w:val="single" w:sz="4" w:space="0" w:color="000000"/>
-          <w:insideH w:val="single" w:sz="4" w:space="0" w:color="000000"/>
-          <w:insideV w:val="single" w:sz="4" w:space="0" w:color="000000"/>
+          <w:top w:val="single" w:color="000000" w:sz="4" w:space="0"/>
+          <w:left w:val="single" w:color="000000" w:sz="4" w:space="0"/>
+          <w:bottom w:val="single" w:color="000000" w:sz="4" w:space="0"/>
+          <w:right w:val="single" w:color="000000" w:sz="4" w:space="0"/>
+          <w:insideH w:val="single" w:color="000000" w:sz="4" w:space="0"/>
+          <w:insideV w:val="single" w:color="000000" w:sz="4" w:space="0"/>
         </w:tblBorders>
         <w:tblLayout w:type="fixed"/>
         <w:tblLook w:val="0420" w:firstRow="1" w:lastRow="0" w:firstColumn="0" w:lastColumn="0" w:noHBand="0" w:noVBand="1"/>
@@ -20950,7 +20934,7 @@
           <w:color w:val="000000"/>
         </w:rPr>
       </w:pPr>
-      <w:hyperlink r:id="rId37" w:history="1">
+      <w:hyperlink w:history="1" r:id="rId37">
         <w:r>
           <w:rPr>
             <w:rStyle w:val="Hipervnculo"/>
@@ -21008,7 +20992,7 @@
           <w:lang w:val="en-GB"/>
         </w:rPr>
       </w:pPr>
-      <w:hyperlink r:id="rId38" w:history="1">
+      <w:hyperlink w:history="1" r:id="rId38">
         <w:r>
           <w:rPr>
             <w:rStyle w:val="Hipervnculo"/>
@@ -21056,7 +21040,7 @@
         </w:rPr>
         <w:br/>
       </w:r>
-      <w:hyperlink r:id="rId39" w:history="1">
+      <w:hyperlink w:history="1" r:id="rId39">
         <w:r>
           <w:rPr>
             <w:rStyle w:val="Hipervnculo"/>
@@ -21119,7 +21103,7 @@
         <w:ind w:left="1004"/>
         <w:jc w:val="both"/>
       </w:pPr>
-      <w:hyperlink r:id="rId40" w:history="1">
+      <w:hyperlink w:history="1" r:id="rId40">
         <w:r>
           <w:rPr>
             <w:rStyle w:val="Hipervnculo"/>
@@ -21189,7 +21173,7 @@
         <w:ind w:left="1004"/>
         <w:jc w:val="both"/>
       </w:pPr>
-      <w:hyperlink r:id="rId41" w:history="1">
+      <w:hyperlink w:history="1" r:id="rId41">
         <w:r>
           <w:rPr>
             <w:rStyle w:val="Hipervnculo"/>
@@ -21236,7 +21220,7 @@
           <w:lang w:val="en-GB"/>
         </w:rPr>
       </w:pPr>
-      <w:hyperlink r:id="rId42" w:history="1">
+      <w:hyperlink w:history="1" r:id="rId42">
         <w:r>
           <w:rPr>
             <w:rStyle w:val="Hipervnculo"/>
@@ -21296,7 +21280,7 @@
         </w:rPr>
         <w:br/>
       </w:r>
-      <w:hyperlink r:id="rId43" w:tgtFrame="_new" w:history="1">
+      <w:hyperlink w:tgtFrame="_new" w:history="1" r:id="rId43">
         <w:r>
           <w:rPr>
             <w:rStyle w:val="Hipervnculo"/>
@@ -21395,12 +21379,12 @@
         <w:tblW w:w="9967" w:type="dxa"/>
         <w:tblInd w:w="0" w:type="dxa"/>
         <w:tblBorders>
-          <w:top w:val="single" w:sz="4" w:space="0" w:color="000000"/>
-          <w:left w:val="single" w:sz="4" w:space="0" w:color="000000"/>
-          <w:bottom w:val="single" w:sz="4" w:space="0" w:color="000000"/>
-          <w:right w:val="single" w:sz="4" w:space="0" w:color="000000"/>
-          <w:insideH w:val="single" w:sz="4" w:space="0" w:color="000000"/>
-          <w:insideV w:val="single" w:sz="4" w:space="0" w:color="000000"/>
+          <w:top w:val="single" w:color="000000" w:sz="4" w:space="0"/>
+          <w:left w:val="single" w:color="000000" w:sz="4" w:space="0"/>
+          <w:bottom w:val="single" w:color="000000" w:sz="4" w:space="0"/>
+          <w:right w:val="single" w:color="000000" w:sz="4" w:space="0"/>
+          <w:insideH w:val="single" w:color="000000" w:sz="4" w:space="0"/>
+          <w:insideV w:val="single" w:color="000000" w:sz="4" w:space="0"/>
         </w:tblBorders>
         <w:tblLayout w:type="fixed"/>
         <w:tblLook w:val="0420" w:firstRow="1" w:lastRow="0" w:firstColumn="0" w:lastColumn="0" w:noHBand="0" w:noVBand="1"/>
@@ -21905,12 +21889,12 @@
         <w:tblW w:w="9967" w:type="dxa"/>
         <w:tblInd w:w="0" w:type="dxa"/>
         <w:tblBorders>
-          <w:top w:val="single" w:sz="4" w:space="0" w:color="000000"/>
-          <w:left w:val="single" w:sz="4" w:space="0" w:color="000000"/>
-          <w:bottom w:val="single" w:sz="4" w:space="0" w:color="000000"/>
-          <w:right w:val="single" w:sz="4" w:space="0" w:color="000000"/>
-          <w:insideH w:val="single" w:sz="4" w:space="0" w:color="000000"/>
-          <w:insideV w:val="single" w:sz="4" w:space="0" w:color="000000"/>
+          <w:top w:val="single" w:color="000000" w:sz="4" w:space="0"/>
+          <w:left w:val="single" w:color="000000" w:sz="4" w:space="0"/>
+          <w:bottom w:val="single" w:color="000000" w:sz="4" w:space="0"/>
+          <w:right w:val="single" w:color="000000" w:sz="4" w:space="0"/>
+          <w:insideH w:val="single" w:color="000000" w:sz="4" w:space="0"/>
+          <w:insideV w:val="single" w:color="000000" w:sz="4" w:space="0"/>
         </w:tblBorders>
         <w:tblLayout w:type="fixed"/>
         <w:tblLook w:val="0420" w:firstRow="1" w:lastRow="0" w:firstColumn="0" w:lastColumn="0" w:noHBand="0" w:noVBand="1"/>
@@ -22210,7 +22194,7 @@
     <w:sectPr>
       <w:headerReference w:type="default" r:id="rId44"/>
       <w:footerReference w:type="default" r:id="rId45"/>
-      <w:pgSz w:w="12240" w:h="15840"/>
+      <w:pgSz w:w="12240" w:h="15840" w:orient="portrait"/>
       <w:pgMar w:top="1701" w:right="1134" w:bottom="1134" w:left="1134" w:header="720" w:footer="0" w:gutter="0"/>
       <w:pgNumType w:start="1"/>
       <w:cols w:space="720"/>
@@ -22220,8 +22204,8 @@
 </file>
 
 <file path=word/comments.xml><?xml version="1.0" encoding="utf-8"?>
-<w:comments xmlns:wpc="http://schemas.microsoft.com/office/word/2010/wordprocessingCanvas" xmlns:cx="http://schemas.microsoft.com/office/drawing/2014/chartex" xmlns:cx1="http://schemas.microsoft.com/office/drawing/2015/9/8/chartex" xmlns:cx2="http://schemas.microsoft.com/office/drawing/2015/10/21/chartex" xmlns:cx3="http://schemas.microsoft.com/office/drawing/2016/5/9/chartex" xmlns:cx4="http://schemas.microsoft.com/office/drawing/2016/5/10/chartex" xmlns:cx5="http://schemas.microsoft.com/office/drawing/2016/5/11/chartex" xmlns:cx6="http://schemas.microsoft.com/office/drawing/2016/5/12/chartex" xmlns:cx7="http://schemas.microsoft.com/office/drawing/2016/5/13/chartex" xmlns:cx8="http://schemas.microsoft.com/office/drawing/2016/5/14/chartex" xmlns:mc="http://schemas.openxmlformats.org/markup-compatibility/2006" xmlns:aink="http://schemas.microsoft.com/office/drawing/2016/ink" xmlns:am3d="http://schemas.microsoft.com/office/drawing/2017/model3d" xmlns:o="urn:schemas-microsoft-com:office:office" xmlns:oel="http://schemas.microsoft.com/office/2019/extlst" xmlns:r="http://schemas.openxmlformats.org/officeDocument/2006/relationships" xmlns:m="http://schemas.openxmlformats.org/officeDocument/2006/math" xmlns:v="urn:schemas-microsoft-com:vml" xmlns:wp14="http://schemas.microsoft.com/office/word/2010/wordprocessingDrawing" xmlns:wp="http://schemas.openxmlformats.org/drawingml/2006/wordprocessingDrawing" xmlns:w10="urn:schemas-microsoft-com:office:word" xmlns:w="http://schemas.openxmlformats.org/wordprocessingml/2006/main" xmlns:w14="http://schemas.microsoft.com/office/word/2010/wordml" xmlns:w15="http://schemas.microsoft.com/office/word/2012/wordml" xmlns:w16cei="http://schemas.microsoft.com/office/word/2026/wordml/cei" xmlns:w16cex="http://schemas.microsoft.com/office/word/2018/wordml/cex" xmlns:w16cid="http://schemas.microsoft.com/office/word/2016/wordml/cid" xmlns:w16="http://schemas.microsoft.com/office/word/2018/wordml" xmlns:w16du="http://schemas.microsoft.com/office/word/2023/wordml/word16du" xmlns:w16sdtdh="http://schemas.microsoft.com/office/word/2020/wordml/sdtdatahash" xmlns:w16sdtfl="http://schemas.microsoft.com/office/word/2024/wordml/sdtformatlock" xmlns:w16se="http://schemas.microsoft.com/office/word/2015/wordml/symex" xmlns:wpg="http://schemas.microsoft.com/office/word/2010/wordprocessingGroup" xmlns:wpi="http://schemas.microsoft.com/office/word/2010/wordprocessingInk" xmlns:wne="http://schemas.microsoft.com/office/word/2006/wordml" xmlns:wps="http://schemas.microsoft.com/office/word/2010/wordprocessingShape" mc:Ignorable="w14 w15 w16se w16cid w16 w16cex w16sdtdh w16sdtfl w16du wp14">
-  <w:comment w:id="3" w:author="Carolina Coca Salazar" w:date="2026-07-20T18:37:00Z" w:initials="CC">
+<w:comments xmlns:wpc="http://schemas.microsoft.com/office/word/2010/wordprocessingCanvas" xmlns:cx="http://schemas.microsoft.com/office/drawing/2014/chartex" xmlns:cx1="http://schemas.microsoft.com/office/drawing/2015/9/8/chartex" xmlns:cx2="http://schemas.microsoft.com/office/drawing/2015/10/21/chartex" xmlns:cx3="http://schemas.microsoft.com/office/drawing/2016/5/9/chartex" xmlns:cx4="http://schemas.microsoft.com/office/drawing/2016/5/10/chartex" xmlns:cx5="http://schemas.microsoft.com/office/drawing/2016/5/11/chartex" xmlns:cx6="http://schemas.microsoft.com/office/drawing/2016/5/12/chartex" xmlns:cx7="http://schemas.microsoft.com/office/drawing/2016/5/13/chartex" xmlns:cx8="http://schemas.microsoft.com/office/drawing/2016/5/14/chartex" xmlns:mc="http://schemas.openxmlformats.org/markup-compatibility/2006" xmlns:aink="http://schemas.microsoft.com/office/drawing/2016/ink" xmlns:am3d="http://schemas.microsoft.com/office/drawing/2017/model3d" xmlns:o="urn:schemas-microsoft-com:office:office" xmlns:oel="http://schemas.microsoft.com/office/2019/extlst" xmlns:r="http://schemas.openxmlformats.org/officeDocument/2006/relationships" xmlns:m="http://schemas.openxmlformats.org/officeDocument/2006/math" xmlns:v="urn:schemas-microsoft-com:vml" xmlns:wp14="http://schemas.microsoft.com/office/word/2010/wordprocessingDrawing" xmlns:wp="http://schemas.openxmlformats.org/drawingml/2006/wordprocessingDrawing" xmlns:w10="urn:schemas-microsoft-com:office:word" xmlns:w="http://schemas.openxmlformats.org/wordprocessingml/2006/main" xmlns:w14="http://schemas.microsoft.com/office/word/2010/wordml" xmlns:w15="http://schemas.microsoft.com/office/word/2012/wordml" xmlns:w16cei="http://schemas.microsoft.com/office/word/2026/wordml/cei" xmlns:w16cex="http://schemas.microsoft.com/office/word/2018/wordml/cex" xmlns:w16cid="http://schemas.microsoft.com/office/word/2016/wordml/cid" xmlns:w16="http://schemas.microsoft.com/office/word/2018/wordml" xmlns:w16du="http://schemas.microsoft.com/office/word/2023/wordml/word16du" xmlns:w16sdtdh="http://schemas.microsoft.com/office/word/2020/wordml/sdtdatahash" xmlns:w16sdtfl="http://schemas.microsoft.com/office/word/2024/wordml/sdtformatlock" xmlns:w16se="http://schemas.microsoft.com/office/word/2015/wordml/symex" xmlns:wpg="http://schemas.microsoft.com/office/word/2010/wordprocessingGroup" xmlns:wpi="http://schemas.microsoft.com/office/word/2010/wordprocessingInk" xmlns:wne="http://schemas.microsoft.com/office/word/2006/wordml" xmlns:wps="http://schemas.microsoft.com/office/word/2010/wordprocessingShape" xmlns:a="http://schemas.openxmlformats.org/drawingml/2006/main" xmlns:pic="http://schemas.openxmlformats.org/drawingml/2006/picture" mc:Ignorable="w14 w15 w16se w16cid w16 w16cex w16sdtdh w16sdtfl w16du wp14">
+  <w:comment w:initials="CC" w:author="Carolina Coca Salazar" w:date="2026-07-20T18:37:00Z" w:id="3">
     <w:p>
       <w:pPr>
         <w:pStyle w:val="Textocomentario"/>
@@ -22234,7 +22218,7 @@
       </w:r>
     </w:p>
   </w:comment>
-  <w:comment w:id="2" w:author="Carolina Coca Salazar" w:date="2026-07-20T18:38:00Z" w:initials="CC">
+  <w:comment w:initials="CC" w:author="Carolina Coca Salazar" w:date="2026-07-20T18:38:00Z" w:id="2">
     <w:p>
       <w:pPr>
         <w:pStyle w:val="Textocomentario"/>
@@ -22247,7 +22231,7 @@
       </w:r>
     </w:p>
   </w:comment>
-  <w:comment w:id="1" w:author="Carolina Coca Salazar" w:date="2026-07-20T18:38:00Z" w:initials="CC">
+  <w:comment w:initials="CC" w:author="Carolina Coca Salazar" w:date="2026-07-20T18:38:00Z" w:id="1">
     <w:p>
       <w:pPr>
         <w:pStyle w:val="Textocomentario"/>
@@ -22313,7 +22297,7 @@
       </w:r>
     </w:p>
   </w:comment>
-  <w:comment w:id="4" w:author="Carolina Coca Salazar" w:date="2026-07-20T18:41:00Z" w:initials="CC">
+  <w:comment w:initials="CC" w:author="Carolina Coca Salazar" w:date="2026-07-20T18:41:00Z" w:id="4">
     <w:p>
       <w:pPr>
         <w:pStyle w:val="Textocomentario"/>
@@ -22375,7 +22359,7 @@
       </w:r>
     </w:p>
   </w:comment>
-  <w:comment w:id="5" w:author="Carolina Coca Salazar" w:date="2026-07-20T19:02:00Z" w:initials="CC">
+  <w:comment w:initials="CC" w:author="Carolina Coca Salazar" w:date="2026-07-20T19:02:00Z" w:id="5">
     <w:p>
       <w:pPr>
         <w:pStyle w:val="Textocomentario"/>
@@ -22431,7 +22415,7 @@
       </w:r>
     </w:p>
   </w:comment>
-  <w:comment w:id="6" w:author="Carolina Coca Salazar" w:date="2026-07-20T19:07:00Z" w:initials="CC">
+  <w:comment w:initials="CC" w:author="Carolina Coca Salazar" w:date="2026-07-20T19:07:00Z" w:id="6">
     <w:p>
       <w:pPr>
         <w:pStyle w:val="Textocomentario"/>
@@ -22484,7 +22468,7 @@
       </w:r>
     </w:p>
   </w:comment>
-  <w:comment w:id="7" w:author="Nicolás Cruz Ríos" w:date="2025-08-20T10:30:00Z" w:initials="NC">
+  <w:comment w:initials="NC" w:author="Nicolás Cruz Ríos" w:date="2025-08-20T10:30:00Z" w:id="7">
     <w:p>
       <w:pPr>
         <w:pStyle w:val="Textocomentario"/>
@@ -22495,7 +22479,7 @@
         </w:rPr>
         <w:annotationRef/>
       </w:r>
-      <w:hyperlink r:id="rId4" w:history="1">
+      <w:hyperlink w:history="1" r:id="rId4">
         <w:r>
           <w:rPr>
             <w:rStyle w:val="Hipervnculo"/>
@@ -22505,7 +22489,7 @@
       </w:hyperlink>
     </w:p>
   </w:comment>
-  <w:comment w:id="8" w:author="Nicolás Cruz Ríos" w:date="2026-04-29T10:30:00Z" w:initials="NC">
+  <w:comment w:initials="NC" w:author="Nicolás Cruz Ríos" w:date="2026-04-29T10:30:00Z" w:id="8">
     <w:p>
       <w:pPr>
         <w:pStyle w:val="Textocomentario"/>
@@ -22516,7 +22500,7 @@
         </w:rPr>
         <w:annotationRef/>
       </w:r>
-      <w:hyperlink r:id="rId5" w:history="1">
+      <w:hyperlink w:history="1" r:id="rId5">
         <w:r>
           <w:rPr>
             <w:rStyle w:val="Hipervnculo"/>
@@ -22526,7 +22510,7 @@
       </w:hyperlink>
     </w:p>
   </w:comment>
-  <w:comment w:id="9" w:author="Carolina Coca Salazar" w:date="2026-07-20T20:23:00Z" w:initials="CC">
+  <w:comment w:initials="CC" w:author="Carolina Coca Salazar" w:date="2026-07-20T20:23:00Z" w:id="9">
     <w:p>
       <w:pPr>
         <w:pStyle w:val="Textocomentario"/>
@@ -22579,7 +22563,7 @@
       </w:r>
     </w:p>
   </w:comment>
-  <w:comment w:id="10" w:author="Carolina Coca Salazar" w:date="2026-07-21T07:38:00Z" w:initials="CC">
+  <w:comment w:initials="CC" w:author="Carolina Coca Salazar" w:date="2026-07-21T07:38:00Z" w:id="10">
     <w:p>
       <w:pPr>
         <w:pStyle w:val="Textocomentario"/>
@@ -22632,7 +22616,7 @@
       </w:r>
     </w:p>
   </w:comment>
-  <w:comment w:id="11" w:author="Carolina Coca Salazar" w:date="2026-07-21T07:38:00Z" w:initials="CC">
+  <w:comment w:initials="CC" w:author="Carolina Coca Salazar" w:date="2026-07-21T07:38:00Z" w:id="11">
     <w:p>
       <w:pPr>
         <w:pStyle w:val="Textocomentario"/>
@@ -22685,7 +22669,7 @@
       </w:r>
     </w:p>
   </w:comment>
-  <w:comment w:id="12" w:author="Carolina Coca Salazar" w:date="2026-07-21T07:36:00Z" w:initials="CC">
+  <w:comment w:initials="CC" w:author="Carolina Coca Salazar" w:date="2026-07-21T07:36:00Z" w:id="12">
     <w:p>
       <w:pPr>
         <w:pStyle w:val="Textocomentario"/>
@@ -22738,7 +22722,7 @@
       </w:r>
     </w:p>
   </w:comment>
-  <w:comment w:id="16" w:author="Carolina Coca Salazar" w:date="2026-07-21T07:36:00Z" w:initials="CC">
+  <w:comment w:initials="CC" w:author="Carolina Coca Salazar" w:date="2026-07-21T07:36:00Z" w:id="16">
     <w:p>
       <w:pPr>
         <w:pStyle w:val="Textocomentario"/>
@@ -22751,7 +22735,7 @@
       </w:r>
     </w:p>
   </w:comment>
-  <w:comment w:id="15" w:author="Carolina Coca Salazar" w:date="2026-07-21T07:36:00Z" w:initials="CC">
+  <w:comment w:initials="CC" w:author="Carolina Coca Salazar" w:date="2026-07-21T07:36:00Z" w:id="15">
     <w:p>
       <w:pPr>
         <w:pStyle w:val="Textocomentario"/>
@@ -22764,7 +22748,7 @@
       </w:r>
     </w:p>
   </w:comment>
-  <w:comment w:id="14" w:author="Carolina Coca Salazar" w:date="2026-07-21T07:36:00Z" w:initials="CC">
+  <w:comment w:initials="CC" w:author="Carolina Coca Salazar" w:date="2026-07-21T07:36:00Z" w:id="14">
     <w:p>
       <w:pPr>
         <w:pStyle w:val="Textocomentario"/>
@@ -22777,7 +22761,7 @@
       </w:r>
     </w:p>
   </w:comment>
-  <w:comment w:id="13" w:author="Carolina Coca Salazar" w:date="2026-07-21T07:36:00Z" w:initials="CC">
+  <w:comment w:initials="CC" w:author="Carolina Coca Salazar" w:date="2026-07-21T07:36:00Z" w:id="13">
     <w:p>
       <w:pPr>
         <w:pStyle w:val="Textocomentario"/>
@@ -22830,7 +22814,7 @@
       </w:r>
     </w:p>
   </w:comment>
-  <w:comment w:id="17" w:author="Carolina Coca Salazar" w:date="2026-07-21T07:39:00Z" w:initials="CC">
+  <w:comment w:initials="CC" w:author="Carolina Coca Salazar" w:date="2026-07-21T07:39:00Z" w:id="17">
     <w:p>
       <w:pPr>
         <w:pStyle w:val="Textocomentario"/>
@@ -22883,7 +22867,7 @@
       </w:r>
     </w:p>
   </w:comment>
-  <w:comment w:id="18" w:author="Carolina Coca Salazar" w:date="2026-07-21T07:39:00Z" w:initials="CC">
+  <w:comment w:initials="CC" w:author="Carolina Coca Salazar" w:date="2026-07-21T07:39:00Z" w:id="18">
     <w:p>
       <w:pPr>
         <w:pStyle w:val="Textocomentario"/>
@@ -22936,7 +22920,7 @@
       </w:r>
     </w:p>
   </w:comment>
-  <w:comment w:id="20" w:author="Nicolás Cruz Ríos" w:date="2026-05-04T08:19:00Z" w:initials="NC">
+  <w:comment w:initials="CC" w:author="Carolina Coca Salazar" w:date="2026-07-21T07:35:00Z" w:id="21">
     <w:p>
       <w:pPr>
         <w:pStyle w:val="Textocomentario"/>
@@ -22947,53 +22931,9 @@
         </w:rPr>
         <w:annotationRef/>
       </w:r>
-      <w:r>
-        <w:rPr>
-          <w:b/>
-          <w:bCs/>
-        </w:rPr>
-        <w:t>Texto de la imagen.</w:t>
-      </w:r>
-    </w:p>
-    <w:p>
-      <w:pPr>
-        <w:pStyle w:val="Textocomentario"/>
-      </w:pPr>
-      <w:r>
-        <w:t xml:space="preserve">Proceso de implementación de estrategias comerciales sostenibles en cuatro etapas: planificación, ejecución, seguimiento y control. Cada etapa incluye ilustraciones de equipos de trabajo, gráficos e indicadores. Se representan acciones como definir objetivos, ejecutar estrategias, monitorear resultados y realizar ajustes. El diseño utiliza colores verdes y azules, con íconos de sostenibilidad y flechas que conectan las etapas, destacando un enfoque de mejora continua. </w:t>
-      </w:r>
     </w:p>
   </w:comment>
-  <w:comment w:id="19" w:author="Nicolás Cruz Ríos" w:date="2026-05-04T08:20:00Z" w:initials="NC">
-    <w:p>
-      <w:pPr>
-        <w:pStyle w:val="Textocomentario"/>
-      </w:pPr>
-      <w:r>
-        <w:rPr>
-          <w:rStyle w:val="Refdecomentario"/>
-        </w:rPr>
-        <w:annotationRef/>
-      </w:r>
-      <w:r>
-        <w:t>Texto alternativo: la figura muestra el proceso de implementación de estrategias comerciales sostenibles.</w:t>
-      </w:r>
-    </w:p>
-  </w:comment>
-  <w:comment w:id="22" w:author="Carolina Coca Salazar" w:date="2026-07-21T07:35:00Z" w:initials="CC">
-    <w:p>
-      <w:pPr>
-        <w:pStyle w:val="Textocomentario"/>
-      </w:pPr>
-      <w:r>
-        <w:rPr>
-          <w:rStyle w:val="Refdecomentario"/>
-        </w:rPr>
-        <w:annotationRef/>
-      </w:r>
-    </w:p>
-  </w:comment>
-  <w:comment w:id="21" w:author="Carolina Coca Salazar" w:date="2026-07-21T07:35:00Z" w:initials="CC">
+  <w:comment w:initials="CC" w:author="Carolina Coca Salazar" w:date="2026-07-21T07:35:00Z" w:id="20">
     <w:p>
       <w:pPr>
         <w:pStyle w:val="Textocomentario"/>
@@ -23046,7 +22986,7 @@
       </w:r>
     </w:p>
   </w:comment>
-  <w:comment w:id="23" w:author="Carolina Coca Salazar" w:date="2026-07-21T07:40:00Z" w:initials="CC">
+  <w:comment w:initials="CC" w:author="Carolina Coca Salazar" w:date="2026-07-21T07:40:00Z" w:id="22">
     <w:p>
       <w:pPr>
         <w:pStyle w:val="Textocomentario"/>
@@ -23099,7 +23039,7 @@
       </w:r>
     </w:p>
   </w:comment>
-  <w:comment w:id="24" w:author="Carolina Coca Salazar" w:date="2026-07-21T07:41:00Z" w:initials="CC">
+  <w:comment w:initials="CC" w:author="Carolina Coca Salazar" w:date="2026-07-21T07:41:00Z" w:id="23">
     <w:p>
       <w:pPr>
         <w:pStyle w:val="Textocomentario"/>
@@ -23152,7 +23092,7 @@
       </w:r>
     </w:p>
   </w:comment>
-  <w:comment w:id="26" w:author="Carolina Coca Salazar" w:date="2026-07-20T18:36:00Z" w:initials="CC">
+  <w:comment w:initials="CC" w:author="Carolina Coca Salazar" w:date="2026-07-20T18:36:00Z" w:id="25">
     <w:p>
       <w:pPr>
         <w:pStyle w:val="Textocomentario"/>
@@ -23165,7 +23105,7 @@
       </w:r>
     </w:p>
   </w:comment>
-  <w:comment w:id="25" w:author="Carolina Coca Salazar" w:date="2026-07-20T18:36:00Z" w:initials="CC">
+  <w:comment w:initials="CC" w:author="Carolina Coca Salazar" w:date="2026-07-20T18:36:00Z" w:id="24">
     <w:p>
       <w:pPr>
         <w:pStyle w:val="Textocomentario"/>
@@ -23231,7 +23171,7 @@
       </w:r>
     </w:p>
   </w:comment>
-  <w:comment w:id="27" w:author="Carolina Coca Salazar" w:date="2026-08-19T09:21:00Z" w:initials="CS">
+  <w:comment w:initials="CS" w:author="Carolina Coca Salazar" w:date="2026-08-19T09:21:00Z" w:id="26">
     <w:p>
       <w:r>
         <w:annotationRef/>
@@ -23260,6 +23200,22 @@
       </w:r>
       <w:r>
         <w:t xml:space="preserve"> y economía circular. El capítulo tres corresponde a mercado, en donde se aborda su concepto, segmentación, estrategias, procedimiento de identificación, técnicas de selección y de evaluación, variables y culmina con proceso de implementación, y tipologías. Por último, está el capítulo de prospección, donde se desarrollan sus objetivos, métodos, herramientas y técnicas.</w:t>
+      </w:r>
+    </w:p>
+  </w:comment>
+  <w:comment xmlns:w="http://schemas.openxmlformats.org/wordprocessingml/2006/main" w:initials="CS" w:author="Carolina Coca Salazar" w:date="2026-08-20T11:24:25" w:id="1987186658">
+    <w:p xmlns:w14="http://schemas.microsoft.com/office/word/2010/wordml" xmlns:w="http://schemas.openxmlformats.org/wordprocessingml/2006/main">
+      <w:pPr>
+        <w:pStyle w:val="CommentText"/>
+      </w:pPr>
+      <w:r>
+        <w:rPr>
+          <w:rStyle w:val="CommentReference"/>
+        </w:rPr>
+        <w:annotationRef/>
+      </w:r>
+      <w:r>
+        <w:t>Presenta cuatro etapas conectadas mediante flechas: Planificación, donde se definen objetivos, recursos, acciones, tiempos y responsables; Ejecución, donde se implementan las acciones, asignan tareas y responsabilidades, comunican la propuesta de valor y se pone en marcha la estrategia; Seguimiento, que comprende el monitoreo del desempeño, análisis de indicadores, detección de desviaciones y generación de informes; y Control, donde se evalúan los resultados, ajustan acciones y estrategias, optimizan procesos y recursos y se promueve la mejora continua. En la parte inferior se destacan los conceptos “Decisiones responsables para un impacto positivo”, “Mejora continua y enfoque sostenible” y “Equipos comprometidos con la sostenibilidad”. La infografía utiliza ilustraciones de personas trabajando, gráficos, elementos naturales y símbolos relacionados con sostenibilidad y gestión.</w:t>
       </w:r>
     </w:p>
   </w:comment>
@@ -23267,39 +23223,38 @@
 </file>
 
 <file path=word/commentsExtended.xml><?xml version="1.0" encoding="utf-8"?>
-<w15:commentsEx xmlns:wpc="http://schemas.microsoft.com/office/word/2010/wordprocessingCanvas" xmlns:cx="http://schemas.microsoft.com/office/drawing/2014/chartex" xmlns:cx1="http://schemas.microsoft.com/office/drawing/2015/9/8/chartex" xmlns:cx2="http://schemas.microsoft.com/office/drawing/2015/10/21/chartex" xmlns:cx3="http://schemas.microsoft.com/office/drawing/2016/5/9/chartex" xmlns:cx4="http://schemas.microsoft.com/office/drawing/2016/5/10/chartex" xmlns:cx5="http://schemas.microsoft.com/office/drawing/2016/5/11/chartex" xmlns:cx6="http://schemas.microsoft.com/office/drawing/2016/5/12/chartex" xmlns:cx7="http://schemas.microsoft.com/office/drawing/2016/5/13/chartex" xmlns:cx8="http://schemas.microsoft.com/office/drawing/2016/5/14/chartex" xmlns:mc="http://schemas.openxmlformats.org/markup-compatibility/2006" xmlns:aink="http://schemas.microsoft.com/office/drawing/2016/ink" xmlns:am3d="http://schemas.microsoft.com/office/drawing/2017/model3d" xmlns:o="urn:schemas-microsoft-com:office:office" xmlns:oel="http://schemas.microsoft.com/office/2019/extlst" xmlns:r="http://schemas.openxmlformats.org/officeDocument/2006/relationships" xmlns:m="http://schemas.openxmlformats.org/officeDocument/2006/math" xmlns:v="urn:schemas-microsoft-com:vml" xmlns:wp14="http://schemas.microsoft.com/office/word/2010/wordprocessingDrawing" xmlns:wp="http://schemas.openxmlformats.org/drawingml/2006/wordprocessingDrawing" xmlns:w10="urn:schemas-microsoft-com:office:word" xmlns:w="http://schemas.openxmlformats.org/wordprocessingml/2006/main" xmlns:w14="http://schemas.microsoft.com/office/word/2010/wordml" xmlns:w15="http://schemas.microsoft.com/office/word/2012/wordml" xmlns:w16cei="http://schemas.microsoft.com/office/word/2026/wordml/cei" xmlns:w16cex="http://schemas.microsoft.com/office/word/2018/wordml/cex" xmlns:w16cid="http://schemas.microsoft.com/office/word/2016/wordml/cid" xmlns:w16="http://schemas.microsoft.com/office/word/2018/wordml" xmlns:w16du="http://schemas.microsoft.com/office/word/2023/wordml/word16du" xmlns:w16sdtdh="http://schemas.microsoft.com/office/word/2020/wordml/sdtdatahash" xmlns:w16sdtfl="http://schemas.microsoft.com/office/word/2024/wordml/sdtformatlock" xmlns:w16se="http://schemas.microsoft.com/office/word/2015/wordml/symex" xmlns:wpg="http://schemas.microsoft.com/office/word/2010/wordprocessingGroup" xmlns:wpi="http://schemas.microsoft.com/office/word/2010/wordprocessingInk" xmlns:wne="http://schemas.microsoft.com/office/word/2006/wordml" xmlns:wps="http://schemas.microsoft.com/office/word/2010/wordprocessingShape" mc:Ignorable="w14 w15 w16se w16cid w16 w16cex w16sdtdh w16sdtfl w16du wp14">
-  <w15:commentEx w15:paraId="551BF6D1" w15:done="0"/>
-  <w15:commentEx w15:paraId="0C299EDC" w15:done="0"/>
-  <w15:commentEx w15:paraId="69A4D085" w15:done="0"/>
-  <w15:commentEx w15:paraId="608287DB" w15:done="0"/>
-  <w15:commentEx w15:paraId="610A36F2" w15:done="0"/>
-  <w15:commentEx w15:paraId="0FAFBB1A" w15:done="0"/>
-  <w15:commentEx w15:paraId="79162B24" w15:done="0"/>
-  <w15:commentEx w15:paraId="6BF8C591" w15:done="0"/>
-  <w15:commentEx w15:paraId="5559E683" w15:done="0"/>
-  <w15:commentEx w15:paraId="2AEEF62E" w15:done="0"/>
-  <w15:commentEx w15:paraId="6DC9C96C" w15:done="0"/>
-  <w15:commentEx w15:paraId="2B8B2A01" w15:done="0"/>
-  <w15:commentEx w15:paraId="320687FC" w15:done="0"/>
-  <w15:commentEx w15:paraId="50613D9A" w15:done="0"/>
-  <w15:commentEx w15:paraId="392C07A3" w15:done="0"/>
-  <w15:commentEx w15:paraId="1B4552C4" w15:done="0"/>
-  <w15:commentEx w15:paraId="3E8D8183" w15:done="0"/>
-  <w15:commentEx w15:paraId="1B510BEB" w15:done="0"/>
-  <w15:commentEx w15:paraId="03584FB6" w15:done="0"/>
-  <w15:commentEx w15:paraId="26808C78" w15:done="0"/>
-  <w15:commentEx w15:paraId="1E0E1CD8" w15:done="0"/>
-  <w15:commentEx w15:paraId="169093A7" w15:done="0"/>
-  <w15:commentEx w15:paraId="281D543C" w15:done="0"/>
-  <w15:commentEx w15:paraId="5866BBBD" w15:done="0"/>
-  <w15:commentEx w15:paraId="41AF3EBE" w15:done="0"/>
-  <w15:commentEx w15:paraId="4F182ABC" w15:done="0"/>
-  <w15:commentEx w15:paraId="5142FE42" w15:done="0"/>
+<w15:commentsEx xmlns:mc="http://schemas.openxmlformats.org/markup-compatibility/2006" xmlns:w15="http://schemas.microsoft.com/office/word/2012/wordml" mc:Ignorable="w15">
+  <w15:commentEx w15:done="0" w15:paraId="551BF6D1"/>
+  <w15:commentEx w15:done="0" w15:paraId="0C299EDC"/>
+  <w15:commentEx w15:done="0" w15:paraId="69A4D085"/>
+  <w15:commentEx w15:done="0" w15:paraId="608287DB"/>
+  <w15:commentEx w15:done="0" w15:paraId="610A36F2"/>
+  <w15:commentEx w15:done="0" w15:paraId="0FAFBB1A"/>
+  <w15:commentEx w15:done="0" w15:paraId="79162B24"/>
+  <w15:commentEx w15:done="0" w15:paraId="6BF8C591"/>
+  <w15:commentEx w15:done="0" w15:paraId="5559E683"/>
+  <w15:commentEx w15:done="0" w15:paraId="2AEEF62E"/>
+  <w15:commentEx w15:done="0" w15:paraId="6DC9C96C"/>
+  <w15:commentEx w15:done="0" w15:paraId="2B8B2A01"/>
+  <w15:commentEx w15:done="0" w15:paraId="320687FC"/>
+  <w15:commentEx w15:done="0" w15:paraId="50613D9A"/>
+  <w15:commentEx w15:done="0" w15:paraId="392C07A3"/>
+  <w15:commentEx w15:done="0" w15:paraId="1B4552C4"/>
+  <w15:commentEx w15:done="0" w15:paraId="3E8D8183"/>
+  <w15:commentEx w15:done="0" w15:paraId="1B510BEB"/>
+  <w15:commentEx w15:done="0" w15:paraId="0BDB8FC2"/>
+  <w15:commentEx w15:done="0" w15:paraId="1E0E1CD8"/>
+  <w15:commentEx w15:done="0" w15:paraId="169093A7"/>
+  <w15:commentEx w15:done="0" w15:paraId="281D543C"/>
+  <w15:commentEx w15:done="0" w15:paraId="5866BBBD"/>
+  <w15:commentEx w15:done="0" w15:paraId="41AF3EBE"/>
+  <w15:commentEx w15:done="0" w15:paraId="4F182ABC"/>
+  <w15:commentEx w15:done="0" w15:paraId="5142FE42"/>
 </w15:commentsEx>
 </file>
 
 <file path=word/commentsExtensible.xml><?xml version="1.0" encoding="utf-8"?>
-<w16cex:commentsExtensible xmlns:wpc="http://schemas.microsoft.com/office/word/2010/wordprocessingCanvas" xmlns:cx="http://schemas.microsoft.com/office/drawing/2014/chartex" xmlns:cx1="http://schemas.microsoft.com/office/drawing/2015/9/8/chartex" xmlns:cx2="http://schemas.microsoft.com/office/drawing/2015/10/21/chartex" xmlns:cx3="http://schemas.microsoft.com/office/drawing/2016/5/9/chartex" xmlns:cx4="http://schemas.microsoft.com/office/drawing/2016/5/10/chartex" xmlns:cx5="http://schemas.microsoft.com/office/drawing/2016/5/11/chartex" xmlns:cx6="http://schemas.microsoft.com/office/drawing/2016/5/12/chartex" xmlns:cx7="http://schemas.microsoft.com/office/drawing/2016/5/13/chartex" xmlns:cx8="http://schemas.microsoft.com/office/drawing/2016/5/14/chartex" xmlns:cr="http://schemas.microsoft.com/office/comments/2020/reactions" xmlns:mc="http://schemas.openxmlformats.org/markup-compatibility/2006" xmlns:aink="http://schemas.microsoft.com/office/drawing/2016/ink" xmlns:am3d="http://schemas.microsoft.com/office/drawing/2017/model3d" xmlns:o="urn:schemas-microsoft-com:office:office" xmlns:oel="http://schemas.microsoft.com/office/2019/extlst" xmlns:r="http://schemas.openxmlformats.org/officeDocument/2006/relationships" xmlns:m="http://schemas.openxmlformats.org/officeDocument/2006/math" xmlns:v="urn:schemas-microsoft-com:vml" xmlns:wp14="http://schemas.microsoft.com/office/word/2010/wordprocessingDrawing" xmlns:wp="http://schemas.openxmlformats.org/drawingml/2006/wordprocessingDrawing" xmlns:w10="urn:schemas-microsoft-com:office:word" xmlns:w="http://schemas.openxmlformats.org/wordprocessingml/2006/main" xmlns:w14="http://schemas.microsoft.com/office/word/2010/wordml" xmlns:w15="http://schemas.microsoft.com/office/word/2012/wordml" xmlns:w16cei="http://schemas.microsoft.com/office/word/2026/wordml/cei" xmlns:w16cex="http://schemas.microsoft.com/office/word/2018/wordml/cex" xmlns:w16cid="http://schemas.microsoft.com/office/word/2016/wordml/cid" xmlns:w16="http://schemas.microsoft.com/office/word/2018/wordml" xmlns:w16du="http://schemas.microsoft.com/office/word/2023/wordml/word16du" xmlns:w16sdtdh="http://schemas.microsoft.com/office/word/2020/wordml/sdtdatahash" xmlns:w16sdtfl="http://schemas.microsoft.com/office/word/2024/wordml/sdtformatlock" xmlns:w16se="http://schemas.microsoft.com/office/word/2015/wordml/symex" xmlns:wpg="http://schemas.microsoft.com/office/word/2010/wordprocessingGroup" xmlns:wpi="http://schemas.microsoft.com/office/word/2010/wordprocessingInk" xmlns:wne="http://schemas.microsoft.com/office/word/2006/wordml" xmlns:wps="http://schemas.microsoft.com/office/word/2010/wordprocessingShape" mc:Ignorable="w14 w15 w16se w16cid w16 w16cex w16sdtdh w16sdtfl cr w16du wp14">
+<w16cex:commentsExtensible xmlns:w16="http://schemas.microsoft.com/office/word/2018/wordml" xmlns:w16cex="http://schemas.microsoft.com/office/word/2018/wordml/cex" xmlns:mc="http://schemas.openxmlformats.org/markup-compatibility/2006" mc:Ignorable="w16 w16cex">
   <w16cex:commentExtensible w16cex:durableId="62D4428D" w16cex:dateUtc="2026-07-20T23:37:00Z"/>
   <w16cex:commentExtensible w16cex:durableId="4BFDE3F7" w16cex:dateUtc="2026-07-20T23:38:00Z"/>
   <w16cex:commentExtensible w16cex:durableId="3D8EEFC9" w16cex:dateUtc="2026-07-20T23:38:00Z"/>
@@ -23318,8 +23273,7 @@
   <w16cex:commentExtensible w16cex:durableId="0A2B88CF" w16cex:dateUtc="2026-07-21T12:36:00Z"/>
   <w16cex:commentExtensible w16cex:durableId="67085A88" w16cex:dateUtc="2026-07-21T12:39:00Z"/>
   <w16cex:commentExtensible w16cex:durableId="0FEE08D1" w16cex:dateUtc="2026-07-21T12:39:00Z"/>
-  <w16cex:commentExtensible w16cex:durableId="03F5F32A" w16cex:dateUtc="2026-05-04T13:19:00Z"/>
-  <w16cex:commentExtensible w16cex:durableId="58F348B4" w16cex:dateUtc="2026-05-04T13:20:00Z"/>
+  <w16cex:commentExtensible w16cex:durableId="3E1DF379" w16cex:dateUtc="2026-08-20T16:24:25.353Z"/>
   <w16cex:commentExtensible w16cex:durableId="6B3017F7" w16cex:dateUtc="2026-07-21T12:35:00Z"/>
   <w16cex:commentExtensible w16cex:durableId="114302A9" w16cex:dateUtc="2026-07-21T12:35:00Z"/>
   <w16cex:commentExtensible w16cex:durableId="31619688" w16cex:dateUtc="2026-07-21T12:40:00Z"/>
@@ -23331,7 +23285,7 @@
 </file>
 
 <file path=word/commentsIds.xml><?xml version="1.0" encoding="utf-8"?>
-<w16cid:commentsIds xmlns:wpc="http://schemas.microsoft.com/office/word/2010/wordprocessingCanvas" xmlns:cx="http://schemas.microsoft.com/office/drawing/2014/chartex" xmlns:cx1="http://schemas.microsoft.com/office/drawing/2015/9/8/chartex" xmlns:cx2="http://schemas.microsoft.com/office/drawing/2015/10/21/chartex" xmlns:cx3="http://schemas.microsoft.com/office/drawing/2016/5/9/chartex" xmlns:cx4="http://schemas.microsoft.com/office/drawing/2016/5/10/chartex" xmlns:cx5="http://schemas.microsoft.com/office/drawing/2016/5/11/chartex" xmlns:cx6="http://schemas.microsoft.com/office/drawing/2016/5/12/chartex" xmlns:cx7="http://schemas.microsoft.com/office/drawing/2016/5/13/chartex" xmlns:cx8="http://schemas.microsoft.com/office/drawing/2016/5/14/chartex" xmlns:mc="http://schemas.openxmlformats.org/markup-compatibility/2006" xmlns:aink="http://schemas.microsoft.com/office/drawing/2016/ink" xmlns:am3d="http://schemas.microsoft.com/office/drawing/2017/model3d" xmlns:o="urn:schemas-microsoft-com:office:office" xmlns:oel="http://schemas.microsoft.com/office/2019/extlst" xmlns:r="http://schemas.openxmlformats.org/officeDocument/2006/relationships" xmlns:m="http://schemas.openxmlformats.org/officeDocument/2006/math" xmlns:v="urn:schemas-microsoft-com:vml" xmlns:wp14="http://schemas.microsoft.com/office/word/2010/wordprocessingDrawing" xmlns:wp="http://schemas.openxmlformats.org/drawingml/2006/wordprocessingDrawing" xmlns:w10="urn:schemas-microsoft-com:office:word" xmlns:w="http://schemas.openxmlformats.org/wordprocessingml/2006/main" xmlns:w14="http://schemas.microsoft.com/office/word/2010/wordml" xmlns:w15="http://schemas.microsoft.com/office/word/2012/wordml" xmlns:w16cei="http://schemas.microsoft.com/office/word/2026/wordml/cei" xmlns:w16cex="http://schemas.microsoft.com/office/word/2018/wordml/cex" xmlns:w16cid="http://schemas.microsoft.com/office/word/2016/wordml/cid" xmlns:w16="http://schemas.microsoft.com/office/word/2018/wordml" xmlns:w16du="http://schemas.microsoft.com/office/word/2023/wordml/word16du" xmlns:w16sdtdh="http://schemas.microsoft.com/office/word/2020/wordml/sdtdatahash" xmlns:w16sdtfl="http://schemas.microsoft.com/office/word/2024/wordml/sdtformatlock" xmlns:w16se="http://schemas.microsoft.com/office/word/2015/wordml/symex" xmlns:wpg="http://schemas.microsoft.com/office/word/2010/wordprocessingGroup" xmlns:wpi="http://schemas.microsoft.com/office/word/2010/wordprocessingInk" xmlns:wne="http://schemas.microsoft.com/office/word/2006/wordml" xmlns:wps="http://schemas.microsoft.com/office/word/2010/wordprocessingShape" mc:Ignorable="w14 w15 w16se w16cid w16 w16cex w16sdtdh w16sdtfl w16du wp14">
+<w16cid:commentsIds xmlns:mc="http://schemas.openxmlformats.org/markup-compatibility/2006" xmlns:w16cid="http://schemas.microsoft.com/office/word/2016/wordml/cid" mc:Ignorable="w16cid">
   <w16cid:commentId w16cid:paraId="551BF6D1" w16cid:durableId="62D4428D"/>
   <w16cid:commentId w16cid:paraId="0C299EDC" w16cid:durableId="4BFDE3F7"/>
   <w16cid:commentId w16cid:paraId="69A4D085" w16cid:durableId="3D8EEFC9"/>
@@ -23350,8 +23304,6 @@
   <w16cid:commentId w16cid:paraId="1B4552C4" w16cid:durableId="0A2B88CF"/>
   <w16cid:commentId w16cid:paraId="3E8D8183" w16cid:durableId="67085A88"/>
   <w16cid:commentId w16cid:paraId="1B510BEB" w16cid:durableId="0FEE08D1"/>
-  <w16cid:commentId w16cid:paraId="03584FB6" w16cid:durableId="03F5F32A"/>
-  <w16cid:commentId w16cid:paraId="26808C78" w16cid:durableId="58F348B4"/>
   <w16cid:commentId w16cid:paraId="1E0E1CD8" w16cid:durableId="6B3017F7"/>
   <w16cid:commentId w16cid:paraId="169093A7" w16cid:durableId="114302A9"/>
   <w16cid:commentId w16cid:paraId="281D543C" w16cid:durableId="31619688"/>
@@ -23359,6 +23311,7 @@
   <w16cid:commentId w16cid:paraId="41AF3EBE" w16cid:durableId="553C9171"/>
   <w16cid:commentId w16cid:paraId="4F182ABC" w16cid:durableId="7A44F2CC"/>
   <w16cid:commentId w16cid:paraId="5142FE42" w16cid:durableId="65A8162B"/>
+  <w16cid:commentId w16cid:paraId="0BDB8FC2" w16cid:durableId="3E1DF379"/>
 </w16cid:commentsIds>
 </file>
 
@@ -23419,7 +23372,7 @@
       <w:ind w:left="-2" w:hanging="2"/>
       <w:jc w:val="right"/>
       <w:rPr>
-        <w:rFonts w:ascii="Times New Roman" w:eastAsia="Times New Roman" w:hAnsi="Times New Roman" w:cs="Times New Roman"/>
+        <w:rFonts w:ascii="Times New Roman" w:hAnsi="Times New Roman" w:eastAsia="Times New Roman" w:cs="Times New Roman"/>
         <w:sz w:val="24"/>
         <w:szCs w:val="24"/>
       </w:rPr>
@@ -23429,7 +23382,7 @@
     <w:pPr>
       <w:spacing w:line="240" w:lineRule="auto"/>
       <w:rPr>
-        <w:rFonts w:ascii="Times New Roman" w:eastAsia="Times New Roman" w:hAnsi="Times New Roman" w:cs="Times New Roman"/>
+        <w:rFonts w:ascii="Times New Roman" w:hAnsi="Times New Roman" w:eastAsia="Times New Roman" w:cs="Times New Roman"/>
         <w:sz w:val="24"/>
         <w:szCs w:val="24"/>
       </w:rPr>
@@ -23512,7 +23465,7 @@
 </file>
 
 <file path=word/header1.xml><?xml version="1.0" encoding="utf-8"?>
-<w:hdr xmlns:wpc="http://schemas.microsoft.com/office/word/2010/wordprocessingCanvas" xmlns:cx="http://schemas.microsoft.com/office/drawing/2014/chartex" xmlns:cx1="http://schemas.microsoft.com/office/drawing/2015/9/8/chartex" xmlns:cx2="http://schemas.microsoft.com/office/drawing/2015/10/21/chartex" xmlns:cx3="http://schemas.microsoft.com/office/drawing/2016/5/9/chartex" xmlns:cx4="http://schemas.microsoft.com/office/drawing/2016/5/10/chartex" xmlns:cx5="http://schemas.microsoft.com/office/drawing/2016/5/11/chartex" xmlns:cx6="http://schemas.microsoft.com/office/drawing/2016/5/12/chartex" xmlns:cx7="http://schemas.microsoft.com/office/drawing/2016/5/13/chartex" xmlns:cx8="http://schemas.microsoft.com/office/drawing/2016/5/14/chartex" xmlns:mc="http://schemas.openxmlformats.org/markup-compatibility/2006" xmlns:aink="http://schemas.microsoft.com/office/drawing/2016/ink" xmlns:am3d="http://schemas.microsoft.com/office/drawing/2017/model3d" xmlns:o="urn:schemas-microsoft-com:office:office" xmlns:oel="http://schemas.microsoft.com/office/2019/extlst" xmlns:r="http://schemas.openxmlformats.org/officeDocument/2006/relationships" xmlns:m="http://schemas.openxmlformats.org/officeDocument/2006/math" xmlns:v="urn:schemas-microsoft-com:vml" xmlns:wp14="http://schemas.microsoft.com/office/word/2010/wordprocessingDrawing" xmlns:wp="http://schemas.openxmlformats.org/drawingml/2006/wordprocessingDrawing" xmlns:w10="urn:schemas-microsoft-com:office:word" xmlns:w="http://schemas.openxmlformats.org/wordprocessingml/2006/main" xmlns:w14="http://schemas.microsoft.com/office/word/2010/wordml" xmlns:w15="http://schemas.microsoft.com/office/word/2012/wordml" xmlns:w16cei="http://schemas.microsoft.com/office/word/2026/wordml/cei" xmlns:w16cex="http://schemas.microsoft.com/office/word/2018/wordml/cex" xmlns:w16cid="http://schemas.microsoft.com/office/word/2016/wordml/cid" xmlns:w16="http://schemas.microsoft.com/office/word/2018/wordml" xmlns:w16du="http://schemas.microsoft.com/office/word/2023/wordml/word16du" xmlns:w16sdtdh="http://schemas.microsoft.com/office/word/2020/wordml/sdtdatahash" xmlns:w16sdtfl="http://schemas.microsoft.com/office/word/2024/wordml/sdtformatlock" xmlns:w16se="http://schemas.microsoft.com/office/word/2015/wordml/symex" xmlns:wpg="http://schemas.microsoft.com/office/word/2010/wordprocessingGroup" xmlns:wpi="http://schemas.microsoft.com/office/word/2010/wordprocessingInk" xmlns:wne="http://schemas.microsoft.com/office/word/2006/wordml" xmlns:wps="http://schemas.microsoft.com/office/word/2010/wordprocessingShape" mc:Ignorable="w14 w15 w16se w16cid w16 w16cex w16sdtdh w16sdtfl w16du wp14">
+<w:hdr xmlns:wpc="http://schemas.microsoft.com/office/word/2010/wordprocessingCanvas" xmlns:cx="http://schemas.microsoft.com/office/drawing/2014/chartex" xmlns:cx1="http://schemas.microsoft.com/office/drawing/2015/9/8/chartex" xmlns:cx2="http://schemas.microsoft.com/office/drawing/2015/10/21/chartex" xmlns:cx3="http://schemas.microsoft.com/office/drawing/2016/5/9/chartex" xmlns:cx4="http://schemas.microsoft.com/office/drawing/2016/5/10/chartex" xmlns:cx5="http://schemas.microsoft.com/office/drawing/2016/5/11/chartex" xmlns:cx6="http://schemas.microsoft.com/office/drawing/2016/5/12/chartex" xmlns:cx7="http://schemas.microsoft.com/office/drawing/2016/5/13/chartex" xmlns:cx8="http://schemas.microsoft.com/office/drawing/2016/5/14/chartex" xmlns:mc="http://schemas.openxmlformats.org/markup-compatibility/2006" xmlns:aink="http://schemas.microsoft.com/office/drawing/2016/ink" xmlns:am3d="http://schemas.microsoft.com/office/drawing/2017/model3d" xmlns:o="urn:schemas-microsoft-com:office:office" xmlns:oel="http://schemas.microsoft.com/office/2019/extlst" xmlns:r="http://schemas.openxmlformats.org/officeDocument/2006/relationships" xmlns:m="http://schemas.openxmlformats.org/officeDocument/2006/math" xmlns:v="urn:schemas-microsoft-com:vml" xmlns:wp14="http://schemas.microsoft.com/office/word/2010/wordprocessingDrawing" xmlns:wp="http://schemas.openxmlformats.org/drawingml/2006/wordprocessingDrawing" xmlns:w10="urn:schemas-microsoft-com:office:word" xmlns:w="http://schemas.openxmlformats.org/wordprocessingml/2006/main" xmlns:w14="http://schemas.microsoft.com/office/word/2010/wordml" xmlns:w15="http://schemas.microsoft.com/office/word/2012/wordml" xmlns:w16cei="http://schemas.microsoft.com/office/word/2026/wordml/cei" xmlns:w16cex="http://schemas.microsoft.com/office/word/2018/wordml/cex" xmlns:w16cid="http://schemas.microsoft.com/office/word/2016/wordml/cid" xmlns:w16="http://schemas.microsoft.com/office/word/2018/wordml" xmlns:w16du="http://schemas.microsoft.com/office/word/2023/wordml/word16du" xmlns:w16sdtdh="http://schemas.microsoft.com/office/word/2020/wordml/sdtdatahash" xmlns:w16sdtfl="http://schemas.microsoft.com/office/word/2024/wordml/sdtformatlock" xmlns:w16se="http://schemas.microsoft.com/office/word/2015/wordml/symex" xmlns:wpg="http://schemas.microsoft.com/office/word/2010/wordprocessingGroup" xmlns:wpi="http://schemas.microsoft.com/office/word/2010/wordprocessingInk" xmlns:wne="http://schemas.microsoft.com/office/word/2006/wordml" xmlns:wps="http://schemas.microsoft.com/office/word/2010/wordprocessingShape" xmlns:a="http://schemas.openxmlformats.org/drawingml/2006/main" xmlns:adec="http://schemas.microsoft.com/office/drawing/2017/decorative" xmlns:pic="http://schemas.openxmlformats.org/drawingml/2006/picture" xmlns:a14="http://schemas.microsoft.com/office/drawing/2010/main" mc:Ignorable="w14 w15 w16se w16cid w16 w16cex w16sdtdh w16sdtfl w16du wp14">
   <w:p>
     <w:pPr>
       <w:pBdr>
@@ -23644,7 +23597,7 @@
         <w:ind w:left="720" w:hanging="360"/>
       </w:pPr>
       <w:rPr>
-        <w:rFonts w:ascii="Symbol" w:hAnsi="Symbol" w:hint="default"/>
+        <w:rFonts w:hint="default" w:ascii="Symbol" w:hAnsi="Symbol"/>
         <w:sz w:val="20"/>
       </w:rPr>
     </w:lvl>
@@ -23660,7 +23613,7 @@
         <w:ind w:left="1440" w:hanging="360"/>
       </w:pPr>
       <w:rPr>
-        <w:rFonts w:ascii="Courier New" w:hAnsi="Courier New" w:hint="default"/>
+        <w:rFonts w:hint="default" w:ascii="Courier New" w:hAnsi="Courier New"/>
         <w:sz w:val="20"/>
       </w:rPr>
     </w:lvl>
@@ -23676,7 +23629,7 @@
         <w:ind w:left="2160" w:hanging="360"/>
       </w:pPr>
       <w:rPr>
-        <w:rFonts w:ascii="Wingdings" w:hAnsi="Wingdings" w:hint="default"/>
+        <w:rFonts w:hint="default" w:ascii="Wingdings" w:hAnsi="Wingdings"/>
         <w:sz w:val="20"/>
       </w:rPr>
     </w:lvl>
@@ -23692,7 +23645,7 @@
         <w:ind w:left="2880" w:hanging="360"/>
       </w:pPr>
       <w:rPr>
-        <w:rFonts w:ascii="Wingdings" w:hAnsi="Wingdings" w:hint="default"/>
+        <w:rFonts w:hint="default" w:ascii="Wingdings" w:hAnsi="Wingdings"/>
         <w:sz w:val="20"/>
       </w:rPr>
     </w:lvl>
@@ -23708,7 +23661,7 @@
         <w:ind w:left="3600" w:hanging="360"/>
       </w:pPr>
       <w:rPr>
-        <w:rFonts w:ascii="Wingdings" w:hAnsi="Wingdings" w:hint="default"/>
+        <w:rFonts w:hint="default" w:ascii="Wingdings" w:hAnsi="Wingdings"/>
         <w:sz w:val="20"/>
       </w:rPr>
     </w:lvl>
@@ -23724,7 +23677,7 @@
         <w:ind w:left="4320" w:hanging="360"/>
       </w:pPr>
       <w:rPr>
-        <w:rFonts w:ascii="Wingdings" w:hAnsi="Wingdings" w:hint="default"/>
+        <w:rFonts w:hint="default" w:ascii="Wingdings" w:hAnsi="Wingdings"/>
         <w:sz w:val="20"/>
       </w:rPr>
     </w:lvl>
@@ -23740,7 +23693,7 @@
         <w:ind w:left="5040" w:hanging="360"/>
       </w:pPr>
       <w:rPr>
-        <w:rFonts w:ascii="Wingdings" w:hAnsi="Wingdings" w:hint="default"/>
+        <w:rFonts w:hint="default" w:ascii="Wingdings" w:hAnsi="Wingdings"/>
         <w:sz w:val="20"/>
       </w:rPr>
     </w:lvl>
@@ -23756,7 +23709,7 @@
         <w:ind w:left="5760" w:hanging="360"/>
       </w:pPr>
       <w:rPr>
-        <w:rFonts w:ascii="Wingdings" w:hAnsi="Wingdings" w:hint="default"/>
+        <w:rFonts w:hint="default" w:ascii="Wingdings" w:hAnsi="Wingdings"/>
         <w:sz w:val="20"/>
       </w:rPr>
     </w:lvl>
@@ -23772,7 +23725,7 @@
         <w:ind w:left="6480" w:hanging="360"/>
       </w:pPr>
       <w:rPr>
-        <w:rFonts w:ascii="Wingdings" w:hAnsi="Wingdings" w:hint="default"/>
+        <w:rFonts w:hint="default" w:ascii="Wingdings" w:hAnsi="Wingdings"/>
         <w:sz w:val="20"/>
       </w:rPr>
     </w:lvl>
@@ -23906,7 +23859,7 @@
         <w:ind w:left="720" w:hanging="360"/>
       </w:pPr>
       <w:rPr>
-        <w:rFonts w:ascii="Symbol" w:hAnsi="Symbol" w:hint="default"/>
+        <w:rFonts w:hint="default" w:ascii="Symbol" w:hAnsi="Symbol"/>
         <w:sz w:val="20"/>
       </w:rPr>
     </w:lvl>
@@ -23922,7 +23875,7 @@
         <w:ind w:left="1440" w:hanging="360"/>
       </w:pPr>
       <w:rPr>
-        <w:rFonts w:ascii="Courier New" w:hAnsi="Courier New" w:hint="default"/>
+        <w:rFonts w:hint="default" w:ascii="Courier New" w:hAnsi="Courier New"/>
         <w:sz w:val="20"/>
       </w:rPr>
     </w:lvl>
@@ -23938,7 +23891,7 @@
         <w:ind w:left="2160" w:hanging="360"/>
       </w:pPr>
       <w:rPr>
-        <w:rFonts w:ascii="Wingdings" w:hAnsi="Wingdings" w:hint="default"/>
+        <w:rFonts w:hint="default" w:ascii="Wingdings" w:hAnsi="Wingdings"/>
         <w:sz w:val="20"/>
       </w:rPr>
     </w:lvl>
@@ -23954,7 +23907,7 @@
         <w:ind w:left="2880" w:hanging="360"/>
       </w:pPr>
       <w:rPr>
-        <w:rFonts w:ascii="Wingdings" w:hAnsi="Wingdings" w:hint="default"/>
+        <w:rFonts w:hint="default" w:ascii="Wingdings" w:hAnsi="Wingdings"/>
         <w:sz w:val="20"/>
       </w:rPr>
     </w:lvl>
@@ -23970,7 +23923,7 @@
         <w:ind w:left="3600" w:hanging="360"/>
       </w:pPr>
       <w:rPr>
-        <w:rFonts w:ascii="Wingdings" w:hAnsi="Wingdings" w:hint="default"/>
+        <w:rFonts w:hint="default" w:ascii="Wingdings" w:hAnsi="Wingdings"/>
         <w:sz w:val="20"/>
       </w:rPr>
     </w:lvl>
@@ -23986,7 +23939,7 @@
         <w:ind w:left="4320" w:hanging="360"/>
       </w:pPr>
       <w:rPr>
-        <w:rFonts w:ascii="Wingdings" w:hAnsi="Wingdings" w:hint="default"/>
+        <w:rFonts w:hint="default" w:ascii="Wingdings" w:hAnsi="Wingdings"/>
         <w:sz w:val="20"/>
       </w:rPr>
     </w:lvl>
@@ -24002,7 +23955,7 @@
         <w:ind w:left="5040" w:hanging="360"/>
       </w:pPr>
       <w:rPr>
-        <w:rFonts w:ascii="Wingdings" w:hAnsi="Wingdings" w:hint="default"/>
+        <w:rFonts w:hint="default" w:ascii="Wingdings" w:hAnsi="Wingdings"/>
         <w:sz w:val="20"/>
       </w:rPr>
     </w:lvl>
@@ -24018,7 +23971,7 @@
         <w:ind w:left="5760" w:hanging="360"/>
       </w:pPr>
       <w:rPr>
-        <w:rFonts w:ascii="Wingdings" w:hAnsi="Wingdings" w:hint="default"/>
+        <w:rFonts w:hint="default" w:ascii="Wingdings" w:hAnsi="Wingdings"/>
         <w:sz w:val="20"/>
       </w:rPr>
     </w:lvl>
@@ -24034,7 +23987,7 @@
         <w:ind w:left="6480" w:hanging="360"/>
       </w:pPr>
       <w:rPr>
-        <w:rFonts w:ascii="Wingdings" w:hAnsi="Wingdings" w:hint="default"/>
+        <w:rFonts w:hint="default" w:ascii="Wingdings" w:hAnsi="Wingdings"/>
         <w:sz w:val="20"/>
       </w:rPr>
     </w:lvl>
@@ -24055,7 +24008,7 @@
         <w:ind w:left="720" w:hanging="360"/>
       </w:pPr>
       <w:rPr>
-        <w:rFonts w:ascii="Symbol" w:hAnsi="Symbol" w:hint="default"/>
+        <w:rFonts w:hint="default" w:ascii="Symbol" w:hAnsi="Symbol"/>
         <w:sz w:val="20"/>
       </w:rPr>
     </w:lvl>
@@ -24071,7 +24024,7 @@
         <w:ind w:left="1440" w:hanging="360"/>
       </w:pPr>
       <w:rPr>
-        <w:rFonts w:ascii="Courier New" w:hAnsi="Courier New" w:hint="default"/>
+        <w:rFonts w:hint="default" w:ascii="Courier New" w:hAnsi="Courier New"/>
         <w:sz w:val="20"/>
       </w:rPr>
     </w:lvl>
@@ -24087,7 +24040,7 @@
         <w:ind w:left="2160" w:hanging="360"/>
       </w:pPr>
       <w:rPr>
-        <w:rFonts w:ascii="Wingdings" w:hAnsi="Wingdings" w:hint="default"/>
+        <w:rFonts w:hint="default" w:ascii="Wingdings" w:hAnsi="Wingdings"/>
         <w:sz w:val="20"/>
       </w:rPr>
     </w:lvl>
@@ -24103,7 +24056,7 @@
         <w:ind w:left="2880" w:hanging="360"/>
       </w:pPr>
       <w:rPr>
-        <w:rFonts w:ascii="Wingdings" w:hAnsi="Wingdings" w:hint="default"/>
+        <w:rFonts w:hint="default" w:ascii="Wingdings" w:hAnsi="Wingdings"/>
         <w:sz w:val="20"/>
       </w:rPr>
     </w:lvl>
@@ -24119,7 +24072,7 @@
         <w:ind w:left="3600" w:hanging="360"/>
       </w:pPr>
       <w:rPr>
-        <w:rFonts w:ascii="Wingdings" w:hAnsi="Wingdings" w:hint="default"/>
+        <w:rFonts w:hint="default" w:ascii="Wingdings" w:hAnsi="Wingdings"/>
         <w:sz w:val="20"/>
       </w:rPr>
     </w:lvl>
@@ -24135,7 +24088,7 @@
         <w:ind w:left="4320" w:hanging="360"/>
       </w:pPr>
       <w:rPr>
-        <w:rFonts w:ascii="Wingdings" w:hAnsi="Wingdings" w:hint="default"/>
+        <w:rFonts w:hint="default" w:ascii="Wingdings" w:hAnsi="Wingdings"/>
         <w:sz w:val="20"/>
       </w:rPr>
     </w:lvl>
@@ -24151,7 +24104,7 @@
         <w:ind w:left="5040" w:hanging="360"/>
       </w:pPr>
       <w:rPr>
-        <w:rFonts w:ascii="Wingdings" w:hAnsi="Wingdings" w:hint="default"/>
+        <w:rFonts w:hint="default" w:ascii="Wingdings" w:hAnsi="Wingdings"/>
         <w:sz w:val="20"/>
       </w:rPr>
     </w:lvl>
@@ -24167,7 +24120,7 @@
         <w:ind w:left="5760" w:hanging="360"/>
       </w:pPr>
       <w:rPr>
-        <w:rFonts w:ascii="Wingdings" w:hAnsi="Wingdings" w:hint="default"/>
+        <w:rFonts w:hint="default" w:ascii="Wingdings" w:hAnsi="Wingdings"/>
         <w:sz w:val="20"/>
       </w:rPr>
     </w:lvl>
@@ -24183,7 +24136,7 @@
         <w:ind w:left="6480" w:hanging="360"/>
       </w:pPr>
       <w:rPr>
-        <w:rFonts w:ascii="Wingdings" w:hAnsi="Wingdings" w:hint="default"/>
+        <w:rFonts w:hint="default" w:ascii="Wingdings" w:hAnsi="Wingdings"/>
         <w:sz w:val="20"/>
       </w:rPr>
     </w:lvl>
@@ -24204,7 +24157,7 @@
         <w:ind w:left="720" w:hanging="360"/>
       </w:pPr>
       <w:rPr>
-        <w:rFonts w:ascii="Symbol" w:hAnsi="Symbol" w:hint="default"/>
+        <w:rFonts w:hint="default" w:ascii="Symbol" w:hAnsi="Symbol"/>
         <w:sz w:val="20"/>
       </w:rPr>
     </w:lvl>
@@ -24220,7 +24173,7 @@
         <w:ind w:left="1440" w:hanging="360"/>
       </w:pPr>
       <w:rPr>
-        <w:rFonts w:ascii="Courier New" w:hAnsi="Courier New" w:hint="default"/>
+        <w:rFonts w:hint="default" w:ascii="Courier New" w:hAnsi="Courier New"/>
         <w:sz w:val="20"/>
       </w:rPr>
     </w:lvl>
@@ -24236,7 +24189,7 @@
         <w:ind w:left="2160" w:hanging="360"/>
       </w:pPr>
       <w:rPr>
-        <w:rFonts w:ascii="Wingdings" w:hAnsi="Wingdings" w:hint="default"/>
+        <w:rFonts w:hint="default" w:ascii="Wingdings" w:hAnsi="Wingdings"/>
         <w:sz w:val="20"/>
       </w:rPr>
     </w:lvl>
@@ -24252,7 +24205,7 @@
         <w:ind w:left="2880" w:hanging="360"/>
       </w:pPr>
       <w:rPr>
-        <w:rFonts w:ascii="Wingdings" w:hAnsi="Wingdings" w:hint="default"/>
+        <w:rFonts w:hint="default" w:ascii="Wingdings" w:hAnsi="Wingdings"/>
         <w:sz w:val="20"/>
       </w:rPr>
     </w:lvl>
@@ -24268,7 +24221,7 @@
         <w:ind w:left="3600" w:hanging="360"/>
       </w:pPr>
       <w:rPr>
-        <w:rFonts w:ascii="Wingdings" w:hAnsi="Wingdings" w:hint="default"/>
+        <w:rFonts w:hint="default" w:ascii="Wingdings" w:hAnsi="Wingdings"/>
         <w:sz w:val="20"/>
       </w:rPr>
     </w:lvl>
@@ -24284,7 +24237,7 @@
         <w:ind w:left="4320" w:hanging="360"/>
       </w:pPr>
       <w:rPr>
-        <w:rFonts w:ascii="Wingdings" w:hAnsi="Wingdings" w:hint="default"/>
+        <w:rFonts w:hint="default" w:ascii="Wingdings" w:hAnsi="Wingdings"/>
         <w:sz w:val="20"/>
       </w:rPr>
     </w:lvl>
@@ -24300,7 +24253,7 @@
         <w:ind w:left="5040" w:hanging="360"/>
       </w:pPr>
       <w:rPr>
-        <w:rFonts w:ascii="Wingdings" w:hAnsi="Wingdings" w:hint="default"/>
+        <w:rFonts w:hint="default" w:ascii="Wingdings" w:hAnsi="Wingdings"/>
         <w:sz w:val="20"/>
       </w:rPr>
     </w:lvl>
@@ -24316,7 +24269,7 @@
         <w:ind w:left="5760" w:hanging="360"/>
       </w:pPr>
       <w:rPr>
-        <w:rFonts w:ascii="Wingdings" w:hAnsi="Wingdings" w:hint="default"/>
+        <w:rFonts w:hint="default" w:ascii="Wingdings" w:hAnsi="Wingdings"/>
         <w:sz w:val="20"/>
       </w:rPr>
     </w:lvl>
@@ -24332,7 +24285,7 @@
         <w:ind w:left="6480" w:hanging="360"/>
       </w:pPr>
       <w:rPr>
-        <w:rFonts w:ascii="Wingdings" w:hAnsi="Wingdings" w:hint="default"/>
+        <w:rFonts w:hint="default" w:ascii="Wingdings" w:hAnsi="Wingdings"/>
         <w:sz w:val="20"/>
       </w:rPr>
     </w:lvl>
@@ -24353,7 +24306,7 @@
         <w:ind w:left="720" w:hanging="360"/>
       </w:pPr>
       <w:rPr>
-        <w:rFonts w:ascii="Symbol" w:hAnsi="Symbol" w:hint="default"/>
+        <w:rFonts w:hint="default" w:ascii="Symbol" w:hAnsi="Symbol"/>
         <w:sz w:val="20"/>
       </w:rPr>
     </w:lvl>
@@ -24369,7 +24322,7 @@
         <w:ind w:left="1440" w:hanging="360"/>
       </w:pPr>
       <w:rPr>
-        <w:rFonts w:ascii="Courier New" w:hAnsi="Courier New" w:hint="default"/>
+        <w:rFonts w:hint="default" w:ascii="Courier New" w:hAnsi="Courier New"/>
         <w:sz w:val="20"/>
       </w:rPr>
     </w:lvl>
@@ -24385,7 +24338,7 @@
         <w:ind w:left="2160" w:hanging="360"/>
       </w:pPr>
       <w:rPr>
-        <w:rFonts w:ascii="Wingdings" w:hAnsi="Wingdings" w:hint="default"/>
+        <w:rFonts w:hint="default" w:ascii="Wingdings" w:hAnsi="Wingdings"/>
         <w:sz w:val="20"/>
       </w:rPr>
     </w:lvl>
@@ -24401,7 +24354,7 @@
         <w:ind w:left="2880" w:hanging="360"/>
       </w:pPr>
       <w:rPr>
-        <w:rFonts w:ascii="Wingdings" w:hAnsi="Wingdings" w:hint="default"/>
+        <w:rFonts w:hint="default" w:ascii="Wingdings" w:hAnsi="Wingdings"/>
         <w:sz w:val="20"/>
       </w:rPr>
     </w:lvl>
@@ -24417,7 +24370,7 @@
         <w:ind w:left="3600" w:hanging="360"/>
       </w:pPr>
       <w:rPr>
-        <w:rFonts w:ascii="Wingdings" w:hAnsi="Wingdings" w:hint="default"/>
+        <w:rFonts w:hint="default" w:ascii="Wingdings" w:hAnsi="Wingdings"/>
         <w:sz w:val="20"/>
       </w:rPr>
     </w:lvl>
@@ -24433,7 +24386,7 @@
         <w:ind w:left="4320" w:hanging="360"/>
       </w:pPr>
       <w:rPr>
-        <w:rFonts w:ascii="Wingdings" w:hAnsi="Wingdings" w:hint="default"/>
+        <w:rFonts w:hint="default" w:ascii="Wingdings" w:hAnsi="Wingdings"/>
         <w:sz w:val="20"/>
       </w:rPr>
     </w:lvl>
@@ -24449,7 +24402,7 @@
         <w:ind w:left="5040" w:hanging="360"/>
       </w:pPr>
       <w:rPr>
-        <w:rFonts w:ascii="Wingdings" w:hAnsi="Wingdings" w:hint="default"/>
+        <w:rFonts w:hint="default" w:ascii="Wingdings" w:hAnsi="Wingdings"/>
         <w:sz w:val="20"/>
       </w:rPr>
     </w:lvl>
@@ -24465,7 +24418,7 @@
         <w:ind w:left="5760" w:hanging="360"/>
       </w:pPr>
       <w:rPr>
-        <w:rFonts w:ascii="Wingdings" w:hAnsi="Wingdings" w:hint="default"/>
+        <w:rFonts w:hint="default" w:ascii="Wingdings" w:hAnsi="Wingdings"/>
         <w:sz w:val="20"/>
       </w:rPr>
     </w:lvl>
@@ -24481,7 +24434,7 @@
         <w:ind w:left="6480" w:hanging="360"/>
       </w:pPr>
       <w:rPr>
-        <w:rFonts w:ascii="Wingdings" w:hAnsi="Wingdings" w:hint="default"/>
+        <w:rFonts w:hint="default" w:ascii="Wingdings" w:hAnsi="Wingdings"/>
         <w:sz w:val="20"/>
       </w:rPr>
     </w:lvl>
@@ -24502,7 +24455,7 @@
         <w:ind w:left="720" w:hanging="360"/>
       </w:pPr>
       <w:rPr>
-        <w:rFonts w:ascii="Symbol" w:hAnsi="Symbol" w:hint="default"/>
+        <w:rFonts w:hint="default" w:ascii="Symbol" w:hAnsi="Symbol"/>
         <w:sz w:val="20"/>
       </w:rPr>
     </w:lvl>
@@ -24518,7 +24471,7 @@
         <w:ind w:left="1440" w:hanging="360"/>
       </w:pPr>
       <w:rPr>
-        <w:rFonts w:ascii="Courier New" w:hAnsi="Courier New" w:hint="default"/>
+        <w:rFonts w:hint="default" w:ascii="Courier New" w:hAnsi="Courier New"/>
         <w:sz w:val="20"/>
       </w:rPr>
     </w:lvl>
@@ -24534,7 +24487,7 @@
         <w:ind w:left="2160" w:hanging="360"/>
       </w:pPr>
       <w:rPr>
-        <w:rFonts w:ascii="Wingdings" w:hAnsi="Wingdings" w:hint="default"/>
+        <w:rFonts w:hint="default" w:ascii="Wingdings" w:hAnsi="Wingdings"/>
         <w:sz w:val="20"/>
       </w:rPr>
     </w:lvl>
@@ -24550,7 +24503,7 @@
         <w:ind w:left="2880" w:hanging="360"/>
       </w:pPr>
       <w:rPr>
-        <w:rFonts w:ascii="Wingdings" w:hAnsi="Wingdings" w:hint="default"/>
+        <w:rFonts w:hint="default" w:ascii="Wingdings" w:hAnsi="Wingdings"/>
         <w:sz w:val="20"/>
       </w:rPr>
     </w:lvl>
@@ -24566,7 +24519,7 @@
         <w:ind w:left="3600" w:hanging="360"/>
       </w:pPr>
       <w:rPr>
-        <w:rFonts w:ascii="Wingdings" w:hAnsi="Wingdings" w:hint="default"/>
+        <w:rFonts w:hint="default" w:ascii="Wingdings" w:hAnsi="Wingdings"/>
         <w:sz w:val="20"/>
       </w:rPr>
     </w:lvl>
@@ -24582,7 +24535,7 @@
         <w:ind w:left="4320" w:hanging="360"/>
       </w:pPr>
       <w:rPr>
-        <w:rFonts w:ascii="Wingdings" w:hAnsi="Wingdings" w:hint="default"/>
+        <w:rFonts w:hint="default" w:ascii="Wingdings" w:hAnsi="Wingdings"/>
         <w:sz w:val="20"/>
       </w:rPr>
     </w:lvl>
@@ -24598,7 +24551,7 @@
         <w:ind w:left="5040" w:hanging="360"/>
       </w:pPr>
       <w:rPr>
-        <w:rFonts w:ascii="Wingdings" w:hAnsi="Wingdings" w:hint="default"/>
+        <w:rFonts w:hint="default" w:ascii="Wingdings" w:hAnsi="Wingdings"/>
         <w:sz w:val="20"/>
       </w:rPr>
     </w:lvl>
@@ -24614,7 +24567,7 @@
         <w:ind w:left="5760" w:hanging="360"/>
       </w:pPr>
       <w:rPr>
-        <w:rFonts w:ascii="Wingdings" w:hAnsi="Wingdings" w:hint="default"/>
+        <w:rFonts w:hint="default" w:ascii="Wingdings" w:hAnsi="Wingdings"/>
         <w:sz w:val="20"/>
       </w:rPr>
     </w:lvl>
@@ -24630,7 +24583,7 @@
         <w:ind w:left="6480" w:hanging="360"/>
       </w:pPr>
       <w:rPr>
-        <w:rFonts w:ascii="Wingdings" w:hAnsi="Wingdings" w:hint="default"/>
+        <w:rFonts w:hint="default" w:ascii="Wingdings" w:hAnsi="Wingdings"/>
         <w:sz w:val="20"/>
       </w:rPr>
     </w:lvl>
@@ -24764,7 +24717,7 @@
         <w:ind w:left="720" w:hanging="360"/>
       </w:pPr>
       <w:rPr>
-        <w:rFonts w:ascii="Symbol" w:hAnsi="Symbol" w:hint="default"/>
+        <w:rFonts w:hint="default" w:ascii="Symbol" w:hAnsi="Symbol"/>
         <w:sz w:val="20"/>
       </w:rPr>
     </w:lvl>
@@ -24780,7 +24733,7 @@
         <w:ind w:left="1440" w:hanging="360"/>
       </w:pPr>
       <w:rPr>
-        <w:rFonts w:ascii="Courier New" w:hAnsi="Courier New" w:hint="default"/>
+        <w:rFonts w:hint="default" w:ascii="Courier New" w:hAnsi="Courier New"/>
         <w:sz w:val="20"/>
       </w:rPr>
     </w:lvl>
@@ -24796,7 +24749,7 @@
         <w:ind w:left="2160" w:hanging="360"/>
       </w:pPr>
       <w:rPr>
-        <w:rFonts w:ascii="Wingdings" w:hAnsi="Wingdings" w:hint="default"/>
+        <w:rFonts w:hint="default" w:ascii="Wingdings" w:hAnsi="Wingdings"/>
         <w:sz w:val="20"/>
       </w:rPr>
     </w:lvl>
@@ -24812,7 +24765,7 @@
         <w:ind w:left="2880" w:hanging="360"/>
       </w:pPr>
       <w:rPr>
-        <w:rFonts w:ascii="Wingdings" w:hAnsi="Wingdings" w:hint="default"/>
+        <w:rFonts w:hint="default" w:ascii="Wingdings" w:hAnsi="Wingdings"/>
         <w:sz w:val="20"/>
       </w:rPr>
     </w:lvl>
@@ -24828,7 +24781,7 @@
         <w:ind w:left="3600" w:hanging="360"/>
       </w:pPr>
       <w:rPr>
-        <w:rFonts w:ascii="Wingdings" w:hAnsi="Wingdings" w:hint="default"/>
+        <w:rFonts w:hint="default" w:ascii="Wingdings" w:hAnsi="Wingdings"/>
         <w:sz w:val="20"/>
       </w:rPr>
     </w:lvl>
@@ -24844,7 +24797,7 @@
         <w:ind w:left="4320" w:hanging="360"/>
       </w:pPr>
       <w:rPr>
-        <w:rFonts w:ascii="Wingdings" w:hAnsi="Wingdings" w:hint="default"/>
+        <w:rFonts w:hint="default" w:ascii="Wingdings" w:hAnsi="Wingdings"/>
         <w:sz w:val="20"/>
       </w:rPr>
     </w:lvl>
@@ -24860,7 +24813,7 @@
         <w:ind w:left="5040" w:hanging="360"/>
       </w:pPr>
       <w:rPr>
-        <w:rFonts w:ascii="Wingdings" w:hAnsi="Wingdings" w:hint="default"/>
+        <w:rFonts w:hint="default" w:ascii="Wingdings" w:hAnsi="Wingdings"/>
         <w:sz w:val="20"/>
       </w:rPr>
     </w:lvl>
@@ -24876,7 +24829,7 @@
         <w:ind w:left="5760" w:hanging="360"/>
       </w:pPr>
       <w:rPr>
-        <w:rFonts w:ascii="Wingdings" w:hAnsi="Wingdings" w:hint="default"/>
+        <w:rFonts w:hint="default" w:ascii="Wingdings" w:hAnsi="Wingdings"/>
         <w:sz w:val="20"/>
       </w:rPr>
     </w:lvl>
@@ -24892,7 +24845,7 @@
         <w:ind w:left="6480" w:hanging="360"/>
       </w:pPr>
       <w:rPr>
-        <w:rFonts w:ascii="Wingdings" w:hAnsi="Wingdings" w:hint="default"/>
+        <w:rFonts w:hint="default" w:ascii="Wingdings" w:hAnsi="Wingdings"/>
         <w:sz w:val="20"/>
       </w:rPr>
     </w:lvl>
@@ -24913,7 +24866,7 @@
         <w:ind w:left="720" w:hanging="360"/>
       </w:pPr>
       <w:rPr>
-        <w:rFonts w:ascii="Symbol" w:hAnsi="Symbol" w:hint="default"/>
+        <w:rFonts w:hint="default" w:ascii="Symbol" w:hAnsi="Symbol"/>
         <w:sz w:val="20"/>
       </w:rPr>
     </w:lvl>
@@ -24929,7 +24882,7 @@
         <w:ind w:left="1440" w:hanging="360"/>
       </w:pPr>
       <w:rPr>
-        <w:rFonts w:ascii="Courier New" w:hAnsi="Courier New" w:hint="default"/>
+        <w:rFonts w:hint="default" w:ascii="Courier New" w:hAnsi="Courier New"/>
         <w:sz w:val="20"/>
       </w:rPr>
     </w:lvl>
@@ -24945,7 +24898,7 @@
         <w:ind w:left="2160" w:hanging="360"/>
       </w:pPr>
       <w:rPr>
-        <w:rFonts w:ascii="Wingdings" w:hAnsi="Wingdings" w:hint="default"/>
+        <w:rFonts w:hint="default" w:ascii="Wingdings" w:hAnsi="Wingdings"/>
         <w:sz w:val="20"/>
       </w:rPr>
     </w:lvl>
@@ -24961,7 +24914,7 @@
         <w:ind w:left="2880" w:hanging="360"/>
       </w:pPr>
       <w:rPr>
-        <w:rFonts w:ascii="Wingdings" w:hAnsi="Wingdings" w:hint="default"/>
+        <w:rFonts w:hint="default" w:ascii="Wingdings" w:hAnsi="Wingdings"/>
         <w:sz w:val="20"/>
       </w:rPr>
     </w:lvl>
@@ -24977,7 +24930,7 @@
         <w:ind w:left="3600" w:hanging="360"/>
       </w:pPr>
       <w:rPr>
-        <w:rFonts w:ascii="Wingdings" w:hAnsi="Wingdings" w:hint="default"/>
+        <w:rFonts w:hint="default" w:ascii="Wingdings" w:hAnsi="Wingdings"/>
         <w:sz w:val="20"/>
       </w:rPr>
     </w:lvl>
@@ -24993,7 +24946,7 @@
         <w:ind w:left="4320" w:hanging="360"/>
       </w:pPr>
       <w:rPr>
-        <w:rFonts w:ascii="Wingdings" w:hAnsi="Wingdings" w:hint="default"/>
+        <w:rFonts w:hint="default" w:ascii="Wingdings" w:hAnsi="Wingdings"/>
         <w:sz w:val="20"/>
       </w:rPr>
     </w:lvl>
@@ -25009,7 +24962,7 @@
         <w:ind w:left="5040" w:hanging="360"/>
       </w:pPr>
       <w:rPr>
-        <w:rFonts w:ascii="Wingdings" w:hAnsi="Wingdings" w:hint="default"/>
+        <w:rFonts w:hint="default" w:ascii="Wingdings" w:hAnsi="Wingdings"/>
         <w:sz w:val="20"/>
       </w:rPr>
     </w:lvl>
@@ -25025,7 +24978,7 @@
         <w:ind w:left="5760" w:hanging="360"/>
       </w:pPr>
       <w:rPr>
-        <w:rFonts w:ascii="Wingdings" w:hAnsi="Wingdings" w:hint="default"/>
+        <w:rFonts w:hint="default" w:ascii="Wingdings" w:hAnsi="Wingdings"/>
         <w:sz w:val="20"/>
       </w:rPr>
     </w:lvl>
@@ -25041,7 +24994,7 @@
         <w:ind w:left="6480" w:hanging="360"/>
       </w:pPr>
       <w:rPr>
-        <w:rFonts w:ascii="Wingdings" w:hAnsi="Wingdings" w:hint="default"/>
+        <w:rFonts w:hint="default" w:ascii="Wingdings" w:hAnsi="Wingdings"/>
         <w:sz w:val="20"/>
       </w:rPr>
     </w:lvl>
@@ -25062,7 +25015,7 @@
         <w:ind w:left="720" w:hanging="360"/>
       </w:pPr>
       <w:rPr>
-        <w:rFonts w:ascii="Symbol" w:hAnsi="Symbol" w:hint="default"/>
+        <w:rFonts w:hint="default" w:ascii="Symbol" w:hAnsi="Symbol"/>
         <w:sz w:val="20"/>
       </w:rPr>
     </w:lvl>
@@ -25078,7 +25031,7 @@
         <w:ind w:left="1440" w:hanging="360"/>
       </w:pPr>
       <w:rPr>
-        <w:rFonts w:ascii="Courier New" w:hAnsi="Courier New" w:hint="default"/>
+        <w:rFonts w:hint="default" w:ascii="Courier New" w:hAnsi="Courier New"/>
         <w:sz w:val="20"/>
       </w:rPr>
     </w:lvl>
@@ -25094,7 +25047,7 @@
         <w:ind w:left="2160" w:hanging="360"/>
       </w:pPr>
       <w:rPr>
-        <w:rFonts w:ascii="Wingdings" w:hAnsi="Wingdings" w:hint="default"/>
+        <w:rFonts w:hint="default" w:ascii="Wingdings" w:hAnsi="Wingdings"/>
         <w:sz w:val="20"/>
       </w:rPr>
     </w:lvl>
@@ -25110,7 +25063,7 @@
         <w:ind w:left="2880" w:hanging="360"/>
       </w:pPr>
       <w:rPr>
-        <w:rFonts w:ascii="Wingdings" w:hAnsi="Wingdings" w:hint="default"/>
+        <w:rFonts w:hint="default" w:ascii="Wingdings" w:hAnsi="Wingdings"/>
         <w:sz w:val="20"/>
       </w:rPr>
     </w:lvl>
@@ -25126,7 +25079,7 @@
         <w:ind w:left="3600" w:hanging="360"/>
       </w:pPr>
       <w:rPr>
-        <w:rFonts w:ascii="Wingdings" w:hAnsi="Wingdings" w:hint="default"/>
+        <w:rFonts w:hint="default" w:ascii="Wingdings" w:hAnsi="Wingdings"/>
         <w:sz w:val="20"/>
       </w:rPr>
     </w:lvl>
@@ -25142,7 +25095,7 @@
         <w:ind w:left="4320" w:hanging="360"/>
       </w:pPr>
       <w:rPr>
-        <w:rFonts w:ascii="Wingdings" w:hAnsi="Wingdings" w:hint="default"/>
+        <w:rFonts w:hint="default" w:ascii="Wingdings" w:hAnsi="Wingdings"/>
         <w:sz w:val="20"/>
       </w:rPr>
     </w:lvl>
@@ -25158,7 +25111,7 @@
         <w:ind w:left="5040" w:hanging="360"/>
       </w:pPr>
       <w:rPr>
-        <w:rFonts w:ascii="Wingdings" w:hAnsi="Wingdings" w:hint="default"/>
+        <w:rFonts w:hint="default" w:ascii="Wingdings" w:hAnsi="Wingdings"/>
         <w:sz w:val="20"/>
       </w:rPr>
     </w:lvl>
@@ -25174,7 +25127,7 @@
         <w:ind w:left="5760" w:hanging="360"/>
       </w:pPr>
       <w:rPr>
-        <w:rFonts w:ascii="Wingdings" w:hAnsi="Wingdings" w:hint="default"/>
+        <w:rFonts w:hint="default" w:ascii="Wingdings" w:hAnsi="Wingdings"/>
         <w:sz w:val="20"/>
       </w:rPr>
     </w:lvl>
@@ -25190,7 +25143,7 @@
         <w:ind w:left="6480" w:hanging="360"/>
       </w:pPr>
       <w:rPr>
-        <w:rFonts w:ascii="Wingdings" w:hAnsi="Wingdings" w:hint="default"/>
+        <w:rFonts w:hint="default" w:ascii="Wingdings" w:hAnsi="Wingdings"/>
         <w:sz w:val="20"/>
       </w:rPr>
     </w:lvl>
@@ -25211,7 +25164,7 @@
         <w:ind w:left="720" w:hanging="360"/>
       </w:pPr>
       <w:rPr>
-        <w:rFonts w:ascii="Symbol" w:hAnsi="Symbol" w:hint="default"/>
+        <w:rFonts w:hint="default" w:ascii="Symbol" w:hAnsi="Symbol"/>
         <w:sz w:val="20"/>
       </w:rPr>
     </w:lvl>
@@ -25227,7 +25180,7 @@
         <w:ind w:left="1440" w:hanging="360"/>
       </w:pPr>
       <w:rPr>
-        <w:rFonts w:ascii="Courier New" w:hAnsi="Courier New" w:hint="default"/>
+        <w:rFonts w:hint="default" w:ascii="Courier New" w:hAnsi="Courier New"/>
         <w:sz w:val="20"/>
       </w:rPr>
     </w:lvl>
@@ -25243,7 +25196,7 @@
         <w:ind w:left="2160" w:hanging="360"/>
       </w:pPr>
       <w:rPr>
-        <w:rFonts w:ascii="Wingdings" w:hAnsi="Wingdings" w:hint="default"/>
+        <w:rFonts w:hint="default" w:ascii="Wingdings" w:hAnsi="Wingdings"/>
         <w:sz w:val="20"/>
       </w:rPr>
     </w:lvl>
@@ -25259,7 +25212,7 @@
         <w:ind w:left="2880" w:hanging="360"/>
       </w:pPr>
       <w:rPr>
-        <w:rFonts w:ascii="Wingdings" w:hAnsi="Wingdings" w:hint="default"/>
+        <w:rFonts w:hint="default" w:ascii="Wingdings" w:hAnsi="Wingdings"/>
         <w:sz w:val="20"/>
       </w:rPr>
     </w:lvl>
@@ -25275,7 +25228,7 @@
         <w:ind w:left="3600" w:hanging="360"/>
       </w:pPr>
       <w:rPr>
-        <w:rFonts w:ascii="Wingdings" w:hAnsi="Wingdings" w:hint="default"/>
+        <w:rFonts w:hint="default" w:ascii="Wingdings" w:hAnsi="Wingdings"/>
         <w:sz w:val="20"/>
       </w:rPr>
     </w:lvl>
@@ -25291,7 +25244,7 @@
         <w:ind w:left="4320" w:hanging="360"/>
       </w:pPr>
       <w:rPr>
-        <w:rFonts w:ascii="Wingdings" w:hAnsi="Wingdings" w:hint="default"/>
+        <w:rFonts w:hint="default" w:ascii="Wingdings" w:hAnsi="Wingdings"/>
         <w:sz w:val="20"/>
       </w:rPr>
     </w:lvl>
@@ -25307,7 +25260,7 @@
         <w:ind w:left="5040" w:hanging="360"/>
       </w:pPr>
       <w:rPr>
-        <w:rFonts w:ascii="Wingdings" w:hAnsi="Wingdings" w:hint="default"/>
+        <w:rFonts w:hint="default" w:ascii="Wingdings" w:hAnsi="Wingdings"/>
         <w:sz w:val="20"/>
       </w:rPr>
     </w:lvl>
@@ -25323,7 +25276,7 @@
         <w:ind w:left="5760" w:hanging="360"/>
       </w:pPr>
       <w:rPr>
-        <w:rFonts w:ascii="Wingdings" w:hAnsi="Wingdings" w:hint="default"/>
+        <w:rFonts w:hint="default" w:ascii="Wingdings" w:hAnsi="Wingdings"/>
         <w:sz w:val="20"/>
       </w:rPr>
     </w:lvl>
@@ -25339,7 +25292,7 @@
         <w:ind w:left="6480" w:hanging="360"/>
       </w:pPr>
       <w:rPr>
-        <w:rFonts w:ascii="Wingdings" w:hAnsi="Wingdings" w:hint="default"/>
+        <w:rFonts w:hint="default" w:ascii="Wingdings" w:hAnsi="Wingdings"/>
         <w:sz w:val="20"/>
       </w:rPr>
     </w:lvl>
@@ -25473,7 +25426,7 @@
         <w:ind w:left="720" w:hanging="360"/>
       </w:pPr>
       <w:rPr>
-        <w:rFonts w:ascii="Symbol" w:hAnsi="Symbol" w:hint="default"/>
+        <w:rFonts w:hint="default" w:ascii="Symbol" w:hAnsi="Symbol"/>
         <w:sz w:val="20"/>
       </w:rPr>
     </w:lvl>
@@ -25489,7 +25442,7 @@
         <w:ind w:left="1440" w:hanging="360"/>
       </w:pPr>
       <w:rPr>
-        <w:rFonts w:ascii="Courier New" w:hAnsi="Courier New" w:hint="default"/>
+        <w:rFonts w:hint="default" w:ascii="Courier New" w:hAnsi="Courier New"/>
         <w:sz w:val="20"/>
       </w:rPr>
     </w:lvl>
@@ -25505,7 +25458,7 @@
         <w:ind w:left="2160" w:hanging="360"/>
       </w:pPr>
       <w:rPr>
-        <w:rFonts w:ascii="Wingdings" w:hAnsi="Wingdings" w:hint="default"/>
+        <w:rFonts w:hint="default" w:ascii="Wingdings" w:hAnsi="Wingdings"/>
         <w:sz w:val="20"/>
       </w:rPr>
     </w:lvl>
@@ -25521,7 +25474,7 @@
         <w:ind w:left="2880" w:hanging="360"/>
       </w:pPr>
       <w:rPr>
-        <w:rFonts w:ascii="Wingdings" w:hAnsi="Wingdings" w:hint="default"/>
+        <w:rFonts w:hint="default" w:ascii="Wingdings" w:hAnsi="Wingdings"/>
         <w:sz w:val="20"/>
       </w:rPr>
     </w:lvl>
@@ -25537,7 +25490,7 @@
         <w:ind w:left="3600" w:hanging="360"/>
       </w:pPr>
       <w:rPr>
-        <w:rFonts w:ascii="Wingdings" w:hAnsi="Wingdings" w:hint="default"/>
+        <w:rFonts w:hint="default" w:ascii="Wingdings" w:hAnsi="Wingdings"/>
         <w:sz w:val="20"/>
       </w:rPr>
     </w:lvl>
@@ -25553,7 +25506,7 @@
         <w:ind w:left="4320" w:hanging="360"/>
       </w:pPr>
       <w:rPr>
-        <w:rFonts w:ascii="Wingdings" w:hAnsi="Wingdings" w:hint="default"/>
+        <w:rFonts w:hint="default" w:ascii="Wingdings" w:hAnsi="Wingdings"/>
         <w:sz w:val="20"/>
       </w:rPr>
     </w:lvl>
@@ -25569,7 +25522,7 @@
         <w:ind w:left="5040" w:hanging="360"/>
       </w:pPr>
       <w:rPr>
-        <w:rFonts w:ascii="Wingdings" w:hAnsi="Wingdings" w:hint="default"/>
+        <w:rFonts w:hint="default" w:ascii="Wingdings" w:hAnsi="Wingdings"/>
         <w:sz w:val="20"/>
       </w:rPr>
     </w:lvl>
@@ -25585,7 +25538,7 @@
         <w:ind w:left="5760" w:hanging="360"/>
       </w:pPr>
       <w:rPr>
-        <w:rFonts w:ascii="Wingdings" w:hAnsi="Wingdings" w:hint="default"/>
+        <w:rFonts w:hint="default" w:ascii="Wingdings" w:hAnsi="Wingdings"/>
         <w:sz w:val="20"/>
       </w:rPr>
     </w:lvl>
@@ -25601,7 +25554,7 @@
         <w:ind w:left="6480" w:hanging="360"/>
       </w:pPr>
       <w:rPr>
-        <w:rFonts w:ascii="Wingdings" w:hAnsi="Wingdings" w:hint="default"/>
+        <w:rFonts w:hint="default" w:ascii="Wingdings" w:hAnsi="Wingdings"/>
         <w:sz w:val="20"/>
       </w:rPr>
     </w:lvl>
@@ -25622,7 +25575,7 @@
         <w:ind w:left="720" w:hanging="360"/>
       </w:pPr>
       <w:rPr>
-        <w:rFonts w:ascii="Symbol" w:hAnsi="Symbol" w:hint="default"/>
+        <w:rFonts w:hint="default" w:ascii="Symbol" w:hAnsi="Symbol"/>
         <w:sz w:val="20"/>
       </w:rPr>
     </w:lvl>
@@ -25638,7 +25591,7 @@
         <w:ind w:left="1440" w:hanging="360"/>
       </w:pPr>
       <w:rPr>
-        <w:rFonts w:ascii="Courier New" w:hAnsi="Courier New" w:hint="default"/>
+        <w:rFonts w:hint="default" w:ascii="Courier New" w:hAnsi="Courier New"/>
         <w:sz w:val="20"/>
       </w:rPr>
     </w:lvl>
@@ -25654,7 +25607,7 @@
         <w:ind w:left="2160" w:hanging="360"/>
       </w:pPr>
       <w:rPr>
-        <w:rFonts w:ascii="Wingdings" w:hAnsi="Wingdings" w:hint="default"/>
+        <w:rFonts w:hint="default" w:ascii="Wingdings" w:hAnsi="Wingdings"/>
         <w:sz w:val="20"/>
       </w:rPr>
     </w:lvl>
@@ -25670,7 +25623,7 @@
         <w:ind w:left="2880" w:hanging="360"/>
       </w:pPr>
       <w:rPr>
-        <w:rFonts w:ascii="Wingdings" w:hAnsi="Wingdings" w:hint="default"/>
+        <w:rFonts w:hint="default" w:ascii="Wingdings" w:hAnsi="Wingdings"/>
         <w:sz w:val="20"/>
       </w:rPr>
     </w:lvl>
@@ -25686,7 +25639,7 @@
         <w:ind w:left="3600" w:hanging="360"/>
       </w:pPr>
       <w:rPr>
-        <w:rFonts w:ascii="Wingdings" w:hAnsi="Wingdings" w:hint="default"/>
+        <w:rFonts w:hint="default" w:ascii="Wingdings" w:hAnsi="Wingdings"/>
         <w:sz w:val="20"/>
       </w:rPr>
     </w:lvl>
@@ -25702,7 +25655,7 @@
         <w:ind w:left="4320" w:hanging="360"/>
       </w:pPr>
       <w:rPr>
-        <w:rFonts w:ascii="Wingdings" w:hAnsi="Wingdings" w:hint="default"/>
+        <w:rFonts w:hint="default" w:ascii="Wingdings" w:hAnsi="Wingdings"/>
         <w:sz w:val="20"/>
       </w:rPr>
     </w:lvl>
@@ -25718,7 +25671,7 @@
         <w:ind w:left="5040" w:hanging="360"/>
       </w:pPr>
       <w:rPr>
-        <w:rFonts w:ascii="Wingdings" w:hAnsi="Wingdings" w:hint="default"/>
+        <w:rFonts w:hint="default" w:ascii="Wingdings" w:hAnsi="Wingdings"/>
         <w:sz w:val="20"/>
       </w:rPr>
     </w:lvl>
@@ -25734,7 +25687,7 @@
         <w:ind w:left="5760" w:hanging="360"/>
       </w:pPr>
       <w:rPr>
-        <w:rFonts w:ascii="Wingdings" w:hAnsi="Wingdings" w:hint="default"/>
+        <w:rFonts w:hint="default" w:ascii="Wingdings" w:hAnsi="Wingdings"/>
         <w:sz w:val="20"/>
       </w:rPr>
     </w:lvl>
@@ -25750,7 +25703,7 @@
         <w:ind w:left="6480" w:hanging="360"/>
       </w:pPr>
       <w:rPr>
-        <w:rFonts w:ascii="Wingdings" w:hAnsi="Wingdings" w:hint="default"/>
+        <w:rFonts w:hint="default" w:ascii="Wingdings" w:hAnsi="Wingdings"/>
         <w:sz w:val="20"/>
       </w:rPr>
     </w:lvl>
@@ -25884,7 +25837,7 @@
         <w:ind w:left="720" w:hanging="360"/>
       </w:pPr>
       <w:rPr>
-        <w:rFonts w:ascii="Symbol" w:hAnsi="Symbol" w:hint="default"/>
+        <w:rFonts w:hint="default" w:ascii="Symbol" w:hAnsi="Symbol"/>
         <w:sz w:val="20"/>
       </w:rPr>
     </w:lvl>
@@ -25900,7 +25853,7 @@
         <w:ind w:left="1440" w:hanging="360"/>
       </w:pPr>
       <w:rPr>
-        <w:rFonts w:ascii="Courier New" w:hAnsi="Courier New" w:hint="default"/>
+        <w:rFonts w:hint="default" w:ascii="Courier New" w:hAnsi="Courier New"/>
         <w:sz w:val="20"/>
       </w:rPr>
     </w:lvl>
@@ -25916,7 +25869,7 @@
         <w:ind w:left="2160" w:hanging="360"/>
       </w:pPr>
       <w:rPr>
-        <w:rFonts w:ascii="Wingdings" w:hAnsi="Wingdings" w:hint="default"/>
+        <w:rFonts w:hint="default" w:ascii="Wingdings" w:hAnsi="Wingdings"/>
         <w:sz w:val="20"/>
       </w:rPr>
     </w:lvl>
@@ -25932,7 +25885,7 @@
         <w:ind w:left="2880" w:hanging="360"/>
       </w:pPr>
       <w:rPr>
-        <w:rFonts w:ascii="Wingdings" w:hAnsi="Wingdings" w:hint="default"/>
+        <w:rFonts w:hint="default" w:ascii="Wingdings" w:hAnsi="Wingdings"/>
         <w:sz w:val="20"/>
       </w:rPr>
     </w:lvl>
@@ -25948,7 +25901,7 @@
         <w:ind w:left="3600" w:hanging="360"/>
       </w:pPr>
       <w:rPr>
-        <w:rFonts w:ascii="Wingdings" w:hAnsi="Wingdings" w:hint="default"/>
+        <w:rFonts w:hint="default" w:ascii="Wingdings" w:hAnsi="Wingdings"/>
         <w:sz w:val="20"/>
       </w:rPr>
     </w:lvl>
@@ -25964,7 +25917,7 @@
         <w:ind w:left="4320" w:hanging="360"/>
       </w:pPr>
       <w:rPr>
-        <w:rFonts w:ascii="Wingdings" w:hAnsi="Wingdings" w:hint="default"/>
+        <w:rFonts w:hint="default" w:ascii="Wingdings" w:hAnsi="Wingdings"/>
         <w:sz w:val="20"/>
       </w:rPr>
     </w:lvl>
@@ -25980,7 +25933,7 @@
         <w:ind w:left="5040" w:hanging="360"/>
       </w:pPr>
       <w:rPr>
-        <w:rFonts w:ascii="Wingdings" w:hAnsi="Wingdings" w:hint="default"/>
+        <w:rFonts w:hint="default" w:ascii="Wingdings" w:hAnsi="Wingdings"/>
         <w:sz w:val="20"/>
       </w:rPr>
     </w:lvl>
@@ -25996,7 +25949,7 @@
         <w:ind w:left="5760" w:hanging="360"/>
       </w:pPr>
       <w:rPr>
-        <w:rFonts w:ascii="Wingdings" w:hAnsi="Wingdings" w:hint="default"/>
+        <w:rFonts w:hint="default" w:ascii="Wingdings" w:hAnsi="Wingdings"/>
         <w:sz w:val="20"/>
       </w:rPr>
     </w:lvl>
@@ -26012,7 +25965,7 @@
         <w:ind w:left="6480" w:hanging="360"/>
       </w:pPr>
       <w:rPr>
-        <w:rFonts w:ascii="Wingdings" w:hAnsi="Wingdings" w:hint="default"/>
+        <w:rFonts w:hint="default" w:ascii="Wingdings" w:hAnsi="Wingdings"/>
         <w:sz w:val="20"/>
       </w:rPr>
     </w:lvl>
@@ -26033,7 +25986,7 @@
         <w:ind w:left="720" w:hanging="360"/>
       </w:pPr>
       <w:rPr>
-        <w:rFonts w:ascii="Symbol" w:hAnsi="Symbol" w:hint="default"/>
+        <w:rFonts w:hint="default" w:ascii="Symbol" w:hAnsi="Symbol"/>
         <w:sz w:val="20"/>
       </w:rPr>
     </w:lvl>
@@ -26049,7 +26002,7 @@
         <w:ind w:left="1440" w:hanging="360"/>
       </w:pPr>
       <w:rPr>
-        <w:rFonts w:ascii="Courier New" w:hAnsi="Courier New" w:hint="default"/>
+        <w:rFonts w:hint="default" w:ascii="Courier New" w:hAnsi="Courier New"/>
         <w:sz w:val="20"/>
       </w:rPr>
     </w:lvl>
@@ -26065,7 +26018,7 @@
         <w:ind w:left="2160" w:hanging="360"/>
       </w:pPr>
       <w:rPr>
-        <w:rFonts w:ascii="Wingdings" w:hAnsi="Wingdings" w:hint="default"/>
+        <w:rFonts w:hint="default" w:ascii="Wingdings" w:hAnsi="Wingdings"/>
         <w:sz w:val="20"/>
       </w:rPr>
     </w:lvl>
@@ -26081,7 +26034,7 @@
         <w:ind w:left="2880" w:hanging="360"/>
       </w:pPr>
       <w:rPr>
-        <w:rFonts w:ascii="Wingdings" w:hAnsi="Wingdings" w:hint="default"/>
+        <w:rFonts w:hint="default" w:ascii="Wingdings" w:hAnsi="Wingdings"/>
         <w:sz w:val="20"/>
       </w:rPr>
     </w:lvl>
@@ -26097,7 +26050,7 @@
         <w:ind w:left="3600" w:hanging="360"/>
       </w:pPr>
       <w:rPr>
-        <w:rFonts w:ascii="Wingdings" w:hAnsi="Wingdings" w:hint="default"/>
+        <w:rFonts w:hint="default" w:ascii="Wingdings" w:hAnsi="Wingdings"/>
         <w:sz w:val="20"/>
       </w:rPr>
     </w:lvl>
@@ -26113,7 +26066,7 @@
         <w:ind w:left="4320" w:hanging="360"/>
       </w:pPr>
       <w:rPr>
-        <w:rFonts w:ascii="Wingdings" w:hAnsi="Wingdings" w:hint="default"/>
+        <w:rFonts w:hint="default" w:ascii="Wingdings" w:hAnsi="Wingdings"/>
         <w:sz w:val="20"/>
       </w:rPr>
     </w:lvl>
@@ -26129,7 +26082,7 @@
         <w:ind w:left="5040" w:hanging="360"/>
       </w:pPr>
       <w:rPr>
-        <w:rFonts w:ascii="Wingdings" w:hAnsi="Wingdings" w:hint="default"/>
+        <w:rFonts w:hint="default" w:ascii="Wingdings" w:hAnsi="Wingdings"/>
         <w:sz w:val="20"/>
       </w:rPr>
     </w:lvl>
@@ -26145,7 +26098,7 @@
         <w:ind w:left="5760" w:hanging="360"/>
       </w:pPr>
       <w:rPr>
-        <w:rFonts w:ascii="Wingdings" w:hAnsi="Wingdings" w:hint="default"/>
+        <w:rFonts w:hint="default" w:ascii="Wingdings" w:hAnsi="Wingdings"/>
         <w:sz w:val="20"/>
       </w:rPr>
     </w:lvl>
@@ -26161,7 +26114,7 @@
         <w:ind w:left="6480" w:hanging="360"/>
       </w:pPr>
       <w:rPr>
-        <w:rFonts w:ascii="Wingdings" w:hAnsi="Wingdings" w:hint="default"/>
+        <w:rFonts w:hint="default" w:ascii="Wingdings" w:hAnsi="Wingdings"/>
         <w:sz w:val="20"/>
       </w:rPr>
     </w:lvl>
@@ -26272,7 +26225,7 @@
         <w:ind w:left="720" w:hanging="360"/>
       </w:pPr>
       <w:rPr>
-        <w:rFonts w:ascii="Symbol" w:hAnsi="Symbol" w:hint="default"/>
+        <w:rFonts w:hint="default" w:ascii="Symbol" w:hAnsi="Symbol"/>
         <w:sz w:val="20"/>
       </w:rPr>
     </w:lvl>
@@ -26288,7 +26241,7 @@
         <w:ind w:left="1440" w:hanging="360"/>
       </w:pPr>
       <w:rPr>
-        <w:rFonts w:ascii="Courier New" w:hAnsi="Courier New" w:hint="default"/>
+        <w:rFonts w:hint="default" w:ascii="Courier New" w:hAnsi="Courier New"/>
         <w:sz w:val="20"/>
       </w:rPr>
     </w:lvl>
@@ -26304,7 +26257,7 @@
         <w:ind w:left="2160" w:hanging="360"/>
       </w:pPr>
       <w:rPr>
-        <w:rFonts w:ascii="Wingdings" w:hAnsi="Wingdings" w:hint="default"/>
+        <w:rFonts w:hint="default" w:ascii="Wingdings" w:hAnsi="Wingdings"/>
         <w:sz w:val="20"/>
       </w:rPr>
     </w:lvl>
@@ -26320,7 +26273,7 @@
         <w:ind w:left="2880" w:hanging="360"/>
       </w:pPr>
       <w:rPr>
-        <w:rFonts w:ascii="Wingdings" w:hAnsi="Wingdings" w:hint="default"/>
+        <w:rFonts w:hint="default" w:ascii="Wingdings" w:hAnsi="Wingdings"/>
         <w:sz w:val="20"/>
       </w:rPr>
     </w:lvl>
@@ -26336,7 +26289,7 @@
         <w:ind w:left="3600" w:hanging="360"/>
       </w:pPr>
       <w:rPr>
-        <w:rFonts w:ascii="Wingdings" w:hAnsi="Wingdings" w:hint="default"/>
+        <w:rFonts w:hint="default" w:ascii="Wingdings" w:hAnsi="Wingdings"/>
         <w:sz w:val="20"/>
       </w:rPr>
     </w:lvl>
@@ -26352,7 +26305,7 @@
         <w:ind w:left="4320" w:hanging="360"/>
       </w:pPr>
       <w:rPr>
-        <w:rFonts w:ascii="Wingdings" w:hAnsi="Wingdings" w:hint="default"/>
+        <w:rFonts w:hint="default" w:ascii="Wingdings" w:hAnsi="Wingdings"/>
         <w:sz w:val="20"/>
       </w:rPr>
     </w:lvl>
@@ -26368,7 +26321,7 @@
         <w:ind w:left="5040" w:hanging="360"/>
       </w:pPr>
       <w:rPr>
-        <w:rFonts w:ascii="Wingdings" w:hAnsi="Wingdings" w:hint="default"/>
+        <w:rFonts w:hint="default" w:ascii="Wingdings" w:hAnsi="Wingdings"/>
         <w:sz w:val="20"/>
       </w:rPr>
     </w:lvl>
@@ -26384,7 +26337,7 @@
         <w:ind w:left="5760" w:hanging="360"/>
       </w:pPr>
       <w:rPr>
-        <w:rFonts w:ascii="Wingdings" w:hAnsi="Wingdings" w:hint="default"/>
+        <w:rFonts w:hint="default" w:ascii="Wingdings" w:hAnsi="Wingdings"/>
         <w:sz w:val="20"/>
       </w:rPr>
     </w:lvl>
@@ -26400,7 +26353,7 @@
         <w:ind w:left="6480" w:hanging="360"/>
       </w:pPr>
       <w:rPr>
-        <w:rFonts w:ascii="Wingdings" w:hAnsi="Wingdings" w:hint="default"/>
+        <w:rFonts w:hint="default" w:ascii="Wingdings" w:hAnsi="Wingdings"/>
         <w:sz w:val="20"/>
       </w:rPr>
     </w:lvl>
@@ -26421,7 +26374,7 @@
         <w:ind w:left="720" w:hanging="360"/>
       </w:pPr>
       <w:rPr>
-        <w:rFonts w:ascii="Symbol" w:hAnsi="Symbol" w:hint="default"/>
+        <w:rFonts w:hint="default" w:ascii="Symbol" w:hAnsi="Symbol"/>
         <w:sz w:val="20"/>
       </w:rPr>
     </w:lvl>
@@ -26437,7 +26390,7 @@
         <w:ind w:left="1440" w:hanging="360"/>
       </w:pPr>
       <w:rPr>
-        <w:rFonts w:ascii="Courier New" w:hAnsi="Courier New" w:hint="default"/>
+        <w:rFonts w:hint="default" w:ascii="Courier New" w:hAnsi="Courier New"/>
         <w:sz w:val="20"/>
       </w:rPr>
     </w:lvl>
@@ -26453,7 +26406,7 @@
         <w:ind w:left="2160" w:hanging="360"/>
       </w:pPr>
       <w:rPr>
-        <w:rFonts w:ascii="Wingdings" w:hAnsi="Wingdings" w:hint="default"/>
+        <w:rFonts w:hint="default" w:ascii="Wingdings" w:hAnsi="Wingdings"/>
         <w:sz w:val="20"/>
       </w:rPr>
     </w:lvl>
@@ -26469,7 +26422,7 @@
         <w:ind w:left="2880" w:hanging="360"/>
       </w:pPr>
       <w:rPr>
-        <w:rFonts w:ascii="Wingdings" w:hAnsi="Wingdings" w:hint="default"/>
+        <w:rFonts w:hint="default" w:ascii="Wingdings" w:hAnsi="Wingdings"/>
         <w:sz w:val="20"/>
       </w:rPr>
     </w:lvl>
@@ -26485,7 +26438,7 @@
         <w:ind w:left="3600" w:hanging="360"/>
       </w:pPr>
       <w:rPr>
-        <w:rFonts w:ascii="Wingdings" w:hAnsi="Wingdings" w:hint="default"/>
+        <w:rFonts w:hint="default" w:ascii="Wingdings" w:hAnsi="Wingdings"/>
         <w:sz w:val="20"/>
       </w:rPr>
     </w:lvl>
@@ -26501,7 +26454,7 @@
         <w:ind w:left="4320" w:hanging="360"/>
       </w:pPr>
       <w:rPr>
-        <w:rFonts w:ascii="Wingdings" w:hAnsi="Wingdings" w:hint="default"/>
+        <w:rFonts w:hint="default" w:ascii="Wingdings" w:hAnsi="Wingdings"/>
         <w:sz w:val="20"/>
       </w:rPr>
     </w:lvl>
@@ -26517,7 +26470,7 @@
         <w:ind w:left="5040" w:hanging="360"/>
       </w:pPr>
       <w:rPr>
-        <w:rFonts w:ascii="Wingdings" w:hAnsi="Wingdings" w:hint="default"/>
+        <w:rFonts w:hint="default" w:ascii="Wingdings" w:hAnsi="Wingdings"/>
         <w:sz w:val="20"/>
       </w:rPr>
     </w:lvl>
@@ -26533,7 +26486,7 @@
         <w:ind w:left="5760" w:hanging="360"/>
       </w:pPr>
       <w:rPr>
-        <w:rFonts w:ascii="Wingdings" w:hAnsi="Wingdings" w:hint="default"/>
+        <w:rFonts w:hint="default" w:ascii="Wingdings" w:hAnsi="Wingdings"/>
         <w:sz w:val="20"/>
       </w:rPr>
     </w:lvl>
@@ -26549,7 +26502,7 @@
         <w:ind w:left="6480" w:hanging="360"/>
       </w:pPr>
       <w:rPr>
-        <w:rFonts w:ascii="Wingdings" w:hAnsi="Wingdings" w:hint="default"/>
+        <w:rFonts w:hint="default" w:ascii="Wingdings" w:hAnsi="Wingdings"/>
         <w:sz w:val="20"/>
       </w:rPr>
     </w:lvl>
@@ -26570,7 +26523,7 @@
         <w:ind w:left="720" w:hanging="360"/>
       </w:pPr>
       <w:rPr>
-        <w:rFonts w:ascii="Symbol" w:hAnsi="Symbol" w:hint="default"/>
+        <w:rFonts w:hint="default" w:ascii="Symbol" w:hAnsi="Symbol"/>
         <w:sz w:val="20"/>
       </w:rPr>
     </w:lvl>
@@ -26586,7 +26539,7 @@
         <w:ind w:left="1440" w:hanging="360"/>
       </w:pPr>
       <w:rPr>
-        <w:rFonts w:ascii="Courier New" w:hAnsi="Courier New" w:hint="default"/>
+        <w:rFonts w:hint="default" w:ascii="Courier New" w:hAnsi="Courier New"/>
         <w:sz w:val="20"/>
       </w:rPr>
     </w:lvl>
@@ -26602,7 +26555,7 @@
         <w:ind w:left="2160" w:hanging="360"/>
       </w:pPr>
       <w:rPr>
-        <w:rFonts w:ascii="Wingdings" w:hAnsi="Wingdings" w:hint="default"/>
+        <w:rFonts w:hint="default" w:ascii="Wingdings" w:hAnsi="Wingdings"/>
         <w:sz w:val="20"/>
       </w:rPr>
     </w:lvl>
@@ -26618,7 +26571,7 @@
         <w:ind w:left="2880" w:hanging="360"/>
       </w:pPr>
       <w:rPr>
-        <w:rFonts w:ascii="Wingdings" w:hAnsi="Wingdings" w:hint="default"/>
+        <w:rFonts w:hint="default" w:ascii="Wingdings" w:hAnsi="Wingdings"/>
         <w:sz w:val="20"/>
       </w:rPr>
     </w:lvl>
@@ -26634,7 +26587,7 @@
         <w:ind w:left="3600" w:hanging="360"/>
       </w:pPr>
       <w:rPr>
-        <w:rFonts w:ascii="Wingdings" w:hAnsi="Wingdings" w:hint="default"/>
+        <w:rFonts w:hint="default" w:ascii="Wingdings" w:hAnsi="Wingdings"/>
         <w:sz w:val="20"/>
       </w:rPr>
     </w:lvl>
@@ -26650,7 +26603,7 @@
         <w:ind w:left="4320" w:hanging="360"/>
       </w:pPr>
       <w:rPr>
-        <w:rFonts w:ascii="Wingdings" w:hAnsi="Wingdings" w:hint="default"/>
+        <w:rFonts w:hint="default" w:ascii="Wingdings" w:hAnsi="Wingdings"/>
         <w:sz w:val="20"/>
       </w:rPr>
     </w:lvl>
@@ -26666,7 +26619,7 @@
         <w:ind w:left="5040" w:hanging="360"/>
       </w:pPr>
       <w:rPr>
-        <w:rFonts w:ascii="Wingdings" w:hAnsi="Wingdings" w:hint="default"/>
+        <w:rFonts w:hint="default" w:ascii="Wingdings" w:hAnsi="Wingdings"/>
         <w:sz w:val="20"/>
       </w:rPr>
     </w:lvl>
@@ -26682,7 +26635,7 @@
         <w:ind w:left="5760" w:hanging="360"/>
       </w:pPr>
       <w:rPr>
-        <w:rFonts w:ascii="Wingdings" w:hAnsi="Wingdings" w:hint="default"/>
+        <w:rFonts w:hint="default" w:ascii="Wingdings" w:hAnsi="Wingdings"/>
         <w:sz w:val="20"/>
       </w:rPr>
     </w:lvl>
@@ -26698,7 +26651,7 @@
         <w:ind w:left="6480" w:hanging="360"/>
       </w:pPr>
       <w:rPr>
-        <w:rFonts w:ascii="Wingdings" w:hAnsi="Wingdings" w:hint="default"/>
+        <w:rFonts w:hint="default" w:ascii="Wingdings" w:hAnsi="Wingdings"/>
         <w:sz w:val="20"/>
       </w:rPr>
     </w:lvl>
@@ -26719,7 +26672,7 @@
         <w:ind w:left="720" w:hanging="360"/>
       </w:pPr>
       <w:rPr>
-        <w:rFonts w:ascii="Symbol" w:hAnsi="Symbol" w:hint="default"/>
+        <w:rFonts w:hint="default" w:ascii="Symbol" w:hAnsi="Symbol"/>
         <w:sz w:val="20"/>
       </w:rPr>
     </w:lvl>
@@ -26735,7 +26688,7 @@
         <w:ind w:left="1440" w:hanging="360"/>
       </w:pPr>
       <w:rPr>
-        <w:rFonts w:ascii="Courier New" w:hAnsi="Courier New" w:hint="default"/>
+        <w:rFonts w:hint="default" w:ascii="Courier New" w:hAnsi="Courier New"/>
         <w:sz w:val="20"/>
       </w:rPr>
     </w:lvl>
@@ -26751,7 +26704,7 @@
         <w:ind w:left="2160" w:hanging="360"/>
       </w:pPr>
       <w:rPr>
-        <w:rFonts w:ascii="Wingdings" w:hAnsi="Wingdings" w:hint="default"/>
+        <w:rFonts w:hint="default" w:ascii="Wingdings" w:hAnsi="Wingdings"/>
         <w:sz w:val="20"/>
       </w:rPr>
     </w:lvl>
@@ -26767,7 +26720,7 @@
         <w:ind w:left="2880" w:hanging="360"/>
       </w:pPr>
       <w:rPr>
-        <w:rFonts w:ascii="Wingdings" w:hAnsi="Wingdings" w:hint="default"/>
+        <w:rFonts w:hint="default" w:ascii="Wingdings" w:hAnsi="Wingdings"/>
         <w:sz w:val="20"/>
       </w:rPr>
     </w:lvl>
@@ -26783,7 +26736,7 @@
         <w:ind w:left="3600" w:hanging="360"/>
       </w:pPr>
       <w:rPr>
-        <w:rFonts w:ascii="Wingdings" w:hAnsi="Wingdings" w:hint="default"/>
+        <w:rFonts w:hint="default" w:ascii="Wingdings" w:hAnsi="Wingdings"/>
         <w:sz w:val="20"/>
       </w:rPr>
     </w:lvl>
@@ -26799,7 +26752,7 @@
         <w:ind w:left="4320" w:hanging="360"/>
       </w:pPr>
       <w:rPr>
-        <w:rFonts w:ascii="Wingdings" w:hAnsi="Wingdings" w:hint="default"/>
+        <w:rFonts w:hint="default" w:ascii="Wingdings" w:hAnsi="Wingdings"/>
         <w:sz w:val="20"/>
       </w:rPr>
     </w:lvl>
@@ -26815,7 +26768,7 @@
         <w:ind w:left="5040" w:hanging="360"/>
       </w:pPr>
       <w:rPr>
-        <w:rFonts w:ascii="Wingdings" w:hAnsi="Wingdings" w:hint="default"/>
+        <w:rFonts w:hint="default" w:ascii="Wingdings" w:hAnsi="Wingdings"/>
         <w:sz w:val="20"/>
       </w:rPr>
     </w:lvl>
@@ -26831,7 +26784,7 @@
         <w:ind w:left="5760" w:hanging="360"/>
       </w:pPr>
       <w:rPr>
-        <w:rFonts w:ascii="Wingdings" w:hAnsi="Wingdings" w:hint="default"/>
+        <w:rFonts w:hint="default" w:ascii="Wingdings" w:hAnsi="Wingdings"/>
         <w:sz w:val="20"/>
       </w:rPr>
     </w:lvl>
@@ -26847,7 +26800,7 @@
         <w:ind w:left="6480" w:hanging="360"/>
       </w:pPr>
       <w:rPr>
-        <w:rFonts w:ascii="Wingdings" w:hAnsi="Wingdings" w:hint="default"/>
+        <w:rFonts w:hint="default" w:ascii="Wingdings" w:hAnsi="Wingdings"/>
         <w:sz w:val="20"/>
       </w:rPr>
     </w:lvl>
@@ -26958,7 +26911,7 @@
         <w:ind w:left="720" w:hanging="360"/>
       </w:pPr>
       <w:rPr>
-        <w:rFonts w:ascii="Symbol" w:hAnsi="Symbol" w:hint="default"/>
+        <w:rFonts w:hint="default" w:ascii="Symbol" w:hAnsi="Symbol"/>
         <w:sz w:val="20"/>
       </w:rPr>
     </w:lvl>
@@ -26974,7 +26927,7 @@
         <w:ind w:left="1440" w:hanging="360"/>
       </w:pPr>
       <w:rPr>
-        <w:rFonts w:ascii="Courier New" w:hAnsi="Courier New" w:hint="default"/>
+        <w:rFonts w:hint="default" w:ascii="Courier New" w:hAnsi="Courier New"/>
         <w:sz w:val="20"/>
       </w:rPr>
     </w:lvl>
@@ -26990,7 +26943,7 @@
         <w:ind w:left="2160" w:hanging="360"/>
       </w:pPr>
       <w:rPr>
-        <w:rFonts w:ascii="Wingdings" w:hAnsi="Wingdings" w:hint="default"/>
+        <w:rFonts w:hint="default" w:ascii="Wingdings" w:hAnsi="Wingdings"/>
         <w:sz w:val="20"/>
       </w:rPr>
     </w:lvl>
@@ -27006,7 +26959,7 @@
         <w:ind w:left="2880" w:hanging="360"/>
       </w:pPr>
       <w:rPr>
-        <w:rFonts w:ascii="Wingdings" w:hAnsi="Wingdings" w:hint="default"/>
+        <w:rFonts w:hint="default" w:ascii="Wingdings" w:hAnsi="Wingdings"/>
         <w:sz w:val="20"/>
       </w:rPr>
     </w:lvl>
@@ -27022,7 +26975,7 @@
         <w:ind w:left="3600" w:hanging="360"/>
       </w:pPr>
       <w:rPr>
-        <w:rFonts w:ascii="Wingdings" w:hAnsi="Wingdings" w:hint="default"/>
+        <w:rFonts w:hint="default" w:ascii="Wingdings" w:hAnsi="Wingdings"/>
         <w:sz w:val="20"/>
       </w:rPr>
     </w:lvl>
@@ -27038,7 +26991,7 @@
         <w:ind w:left="4320" w:hanging="360"/>
       </w:pPr>
       <w:rPr>
-        <w:rFonts w:ascii="Wingdings" w:hAnsi="Wingdings" w:hint="default"/>
+        <w:rFonts w:hint="default" w:ascii="Wingdings" w:hAnsi="Wingdings"/>
         <w:sz w:val="20"/>
       </w:rPr>
     </w:lvl>
@@ -27054,7 +27007,7 @@
         <w:ind w:left="5040" w:hanging="360"/>
       </w:pPr>
       <w:rPr>
-        <w:rFonts w:ascii="Wingdings" w:hAnsi="Wingdings" w:hint="default"/>
+        <w:rFonts w:hint="default" w:ascii="Wingdings" w:hAnsi="Wingdings"/>
         <w:sz w:val="20"/>
       </w:rPr>
     </w:lvl>
@@ -27070,7 +27023,7 @@
         <w:ind w:left="5760" w:hanging="360"/>
       </w:pPr>
       <w:rPr>
-        <w:rFonts w:ascii="Wingdings" w:hAnsi="Wingdings" w:hint="default"/>
+        <w:rFonts w:hint="default" w:ascii="Wingdings" w:hAnsi="Wingdings"/>
         <w:sz w:val="20"/>
       </w:rPr>
     </w:lvl>
@@ -27086,7 +27039,7 @@
         <w:ind w:left="6480" w:hanging="360"/>
       </w:pPr>
       <w:rPr>
-        <w:rFonts w:ascii="Wingdings" w:hAnsi="Wingdings" w:hint="default"/>
+        <w:rFonts w:hint="default" w:ascii="Wingdings" w:hAnsi="Wingdings"/>
         <w:sz w:val="20"/>
       </w:rPr>
     </w:lvl>
@@ -27171,12 +27124,15 @@
 </file>
 
 <file path=word/people.xml><?xml version="1.0" encoding="utf-8"?>
-<w15:people xmlns:wpc="http://schemas.microsoft.com/office/word/2010/wordprocessingCanvas" xmlns:cx="http://schemas.microsoft.com/office/drawing/2014/chartex" xmlns:cx1="http://schemas.microsoft.com/office/drawing/2015/9/8/chartex" xmlns:cx2="http://schemas.microsoft.com/office/drawing/2015/10/21/chartex" xmlns:cx3="http://schemas.microsoft.com/office/drawing/2016/5/9/chartex" xmlns:cx4="http://schemas.microsoft.com/office/drawing/2016/5/10/chartex" xmlns:cx5="http://schemas.microsoft.com/office/drawing/2016/5/11/chartex" xmlns:cx6="http://schemas.microsoft.com/office/drawing/2016/5/12/chartex" xmlns:cx7="http://schemas.microsoft.com/office/drawing/2016/5/13/chartex" xmlns:cx8="http://schemas.microsoft.com/office/drawing/2016/5/14/chartex" xmlns:mc="http://schemas.openxmlformats.org/markup-compatibility/2006" xmlns:aink="http://schemas.microsoft.com/office/drawing/2016/ink" xmlns:am3d="http://schemas.microsoft.com/office/drawing/2017/model3d" xmlns:o="urn:schemas-microsoft-com:office:office" xmlns:oel="http://schemas.microsoft.com/office/2019/extlst" xmlns:r="http://schemas.openxmlformats.org/officeDocument/2006/relationships" xmlns:m="http://schemas.openxmlformats.org/officeDocument/2006/math" xmlns:v="urn:schemas-microsoft-com:vml" xmlns:wp14="http://schemas.microsoft.com/office/word/2010/wordprocessingDrawing" xmlns:wp="http://schemas.openxmlformats.org/drawingml/2006/wordprocessingDrawing" xmlns:w10="urn:schemas-microsoft-com:office:word" xmlns:w="http://schemas.openxmlformats.org/wordprocessingml/2006/main" xmlns:w14="http://schemas.microsoft.com/office/word/2010/wordml" xmlns:w15="http://schemas.microsoft.com/office/word/2012/wordml" xmlns:w16cei="http://schemas.microsoft.com/office/word/2026/wordml/cei" xmlns:w16cex="http://schemas.microsoft.com/office/word/2018/wordml/cex" xmlns:w16cid="http://schemas.microsoft.com/office/word/2016/wordml/cid" xmlns:w16="http://schemas.microsoft.com/office/word/2018/wordml" xmlns:w16du="http://schemas.microsoft.com/office/word/2023/wordml/word16du" xmlns:w16sdtdh="http://schemas.microsoft.com/office/word/2020/wordml/sdtdatahash" xmlns:w16sdtfl="http://schemas.microsoft.com/office/word/2024/wordml/sdtformatlock" xmlns:w16se="http://schemas.microsoft.com/office/word/2015/wordml/symex" xmlns:wpg="http://schemas.microsoft.com/office/word/2010/wordprocessingGroup" xmlns:wpi="http://schemas.microsoft.com/office/word/2010/wordprocessingInk" xmlns:wne="http://schemas.microsoft.com/office/word/2006/wordml" xmlns:wps="http://schemas.microsoft.com/office/word/2010/wordprocessingShape" mc:Ignorable="w14 w15 w16se w16cid w16 w16cex w16sdtdh w16sdtfl w16du wp14">
+<w15:people xmlns:mc="http://schemas.openxmlformats.org/markup-compatibility/2006" xmlns:w15="http://schemas.microsoft.com/office/word/2012/wordml" mc:Ignorable="w15">
   <w15:person w15:author="Carolina Coca Salazar">
     <w15:presenceInfo w15:providerId="AD" w15:userId="S::carolina.coca@ucc.edu.co::91b8b876-de71-4dbf-a3d1-d366410f442c"/>
   </w15:person>
   <w15:person w15:author="Nicolás Cruz Ríos">
     <w15:presenceInfo w15:providerId="AD" w15:userId="S::ncruz@sena.edu.co::00b96340-7aeb-4b8f-afda-2e60cef567bf"/>
+  </w15:person>
+  <w15:person w15:author="Carolina Coca Salazar">
+    <w15:presenceInfo w15:providerId="AD" w15:userId="S::ccoca@sena.edu.co::b704b616-89ed-4d50-9fe8-28ba2fff9d75"/>
   </w15:person>
 </w15:people>
 </file>
@@ -27186,7 +27142,7 @@
   <w:docDefaults>
     <w:rPrDefault>
       <w:rPr>
-        <w:rFonts w:ascii="Arial" w:eastAsia="Arial" w:hAnsi="Arial" w:cs="Arial"/>
+        <w:rFonts w:ascii="Arial" w:hAnsi="Arial" w:eastAsia="Arial" w:cs="Arial"/>
         <w:sz w:val="22"/>
         <w:szCs w:val="22"/>
         <w:lang w:val="es-CO" w:eastAsia="es-CO" w:bidi="ar-SA"/>
@@ -27201,14 +27157,14 @@
   <w:latentStyles w:defLockedState="0" w:defUIPriority="99" w:defSemiHidden="0" w:defUnhideWhenUsed="0" w:defQFormat="0" w:count="376">
     <w:lsdException w:name="Normal" w:uiPriority="0" w:qFormat="1"/>
     <w:lsdException w:name="heading 1" w:uiPriority="9" w:qFormat="1"/>
-    <w:lsdException w:name="heading 2" w:semiHidden="1" w:uiPriority="9" w:unhideWhenUsed="1" w:qFormat="1"/>
-    <w:lsdException w:name="heading 3" w:semiHidden="1" w:uiPriority="9" w:unhideWhenUsed="1" w:qFormat="1"/>
-    <w:lsdException w:name="heading 4" w:semiHidden="1" w:uiPriority="9" w:unhideWhenUsed="1" w:qFormat="1"/>
-    <w:lsdException w:name="heading 5" w:semiHidden="1" w:uiPriority="9" w:unhideWhenUsed="1" w:qFormat="1"/>
-    <w:lsdException w:name="heading 6" w:semiHidden="1" w:uiPriority="9" w:unhideWhenUsed="1" w:qFormat="1"/>
-    <w:lsdException w:name="heading 7" w:semiHidden="1" w:uiPriority="9" w:unhideWhenUsed="1" w:qFormat="1"/>
-    <w:lsdException w:name="heading 8" w:semiHidden="1" w:uiPriority="9" w:unhideWhenUsed="1" w:qFormat="1"/>
-    <w:lsdException w:name="heading 9" w:semiHidden="1" w:uiPriority="9" w:unhideWhenUsed="1" w:qFormat="1"/>
+    <w:lsdException w:name="heading 2" w:uiPriority="9" w:semiHidden="1" w:unhideWhenUsed="1" w:qFormat="1"/>
+    <w:lsdException w:name="heading 3" w:uiPriority="9" w:semiHidden="1" w:unhideWhenUsed="1" w:qFormat="1"/>
+    <w:lsdException w:name="heading 4" w:uiPriority="9" w:semiHidden="1" w:unhideWhenUsed="1" w:qFormat="1"/>
+    <w:lsdException w:name="heading 5" w:uiPriority="9" w:semiHidden="1" w:unhideWhenUsed="1" w:qFormat="1"/>
+    <w:lsdException w:name="heading 6" w:uiPriority="9" w:semiHidden="1" w:unhideWhenUsed="1" w:qFormat="1"/>
+    <w:lsdException w:name="heading 7" w:uiPriority="9" w:semiHidden="1" w:unhideWhenUsed="1" w:qFormat="1"/>
+    <w:lsdException w:name="heading 8" w:uiPriority="9" w:semiHidden="1" w:unhideWhenUsed="1" w:qFormat="1"/>
+    <w:lsdException w:name="heading 9" w:uiPriority="9" w:semiHidden="1" w:unhideWhenUsed="1" w:qFormat="1"/>
     <w:lsdException w:name="index 1" w:semiHidden="1" w:unhideWhenUsed="1"/>
     <w:lsdException w:name="index 2" w:semiHidden="1" w:unhideWhenUsed="1"/>
     <w:lsdException w:name="index 3" w:semiHidden="1" w:unhideWhenUsed="1"/>
@@ -27218,22 +27174,22 @@
     <w:lsdException w:name="index 7" w:semiHidden="1" w:unhideWhenUsed="1"/>
     <w:lsdException w:name="index 8" w:semiHidden="1" w:unhideWhenUsed="1"/>
     <w:lsdException w:name="index 9" w:semiHidden="1" w:unhideWhenUsed="1"/>
-    <w:lsdException w:name="toc 1" w:semiHidden="1" w:uiPriority="39" w:unhideWhenUsed="1"/>
-    <w:lsdException w:name="toc 2" w:semiHidden="1" w:uiPriority="39" w:unhideWhenUsed="1"/>
-    <w:lsdException w:name="toc 3" w:semiHidden="1" w:uiPriority="39" w:unhideWhenUsed="1"/>
-    <w:lsdException w:name="toc 4" w:semiHidden="1" w:uiPriority="39" w:unhideWhenUsed="1"/>
-    <w:lsdException w:name="toc 5" w:semiHidden="1" w:uiPriority="39" w:unhideWhenUsed="1"/>
-    <w:lsdException w:name="toc 6" w:semiHidden="1" w:uiPriority="39" w:unhideWhenUsed="1"/>
-    <w:lsdException w:name="toc 7" w:semiHidden="1" w:uiPriority="39" w:unhideWhenUsed="1"/>
-    <w:lsdException w:name="toc 8" w:semiHidden="1" w:uiPriority="39" w:unhideWhenUsed="1"/>
-    <w:lsdException w:name="toc 9" w:semiHidden="1" w:uiPriority="39" w:unhideWhenUsed="1"/>
+    <w:lsdException w:name="toc 1" w:uiPriority="39" w:semiHidden="1" w:unhideWhenUsed="1"/>
+    <w:lsdException w:name="toc 2" w:uiPriority="39" w:semiHidden="1" w:unhideWhenUsed="1"/>
+    <w:lsdException w:name="toc 3" w:uiPriority="39" w:semiHidden="1" w:unhideWhenUsed="1"/>
+    <w:lsdException w:name="toc 4" w:uiPriority="39" w:semiHidden="1" w:unhideWhenUsed="1"/>
+    <w:lsdException w:name="toc 5" w:uiPriority="39" w:semiHidden="1" w:unhideWhenUsed="1"/>
+    <w:lsdException w:name="toc 6" w:uiPriority="39" w:semiHidden="1" w:unhideWhenUsed="1"/>
+    <w:lsdException w:name="toc 7" w:uiPriority="39" w:semiHidden="1" w:unhideWhenUsed="1"/>
+    <w:lsdException w:name="toc 8" w:uiPriority="39" w:semiHidden="1" w:unhideWhenUsed="1"/>
+    <w:lsdException w:name="toc 9" w:uiPriority="39" w:semiHidden="1" w:unhideWhenUsed="1"/>
     <w:lsdException w:name="Normal Indent" w:semiHidden="1" w:unhideWhenUsed="1"/>
     <w:lsdException w:name="footnote text" w:semiHidden="1" w:unhideWhenUsed="1"/>
     <w:lsdException w:name="annotation text" w:semiHidden="1" w:unhideWhenUsed="1"/>
     <w:lsdException w:name="header" w:semiHidden="1" w:unhideWhenUsed="1"/>
     <w:lsdException w:name="footer" w:semiHidden="1" w:unhideWhenUsed="1"/>
     <w:lsdException w:name="index heading" w:semiHidden="1" w:unhideWhenUsed="1"/>
-    <w:lsdException w:name="caption" w:semiHidden="1" w:uiPriority="35" w:unhideWhenUsed="1" w:qFormat="1"/>
+    <w:lsdException w:name="caption" w:uiPriority="35" w:semiHidden="1" w:unhideWhenUsed="1" w:qFormat="1"/>
     <w:lsdException w:name="table of figures" w:semiHidden="1" w:unhideWhenUsed="1"/>
     <w:lsdException w:name="envelope address" w:semiHidden="1" w:unhideWhenUsed="1"/>
     <w:lsdException w:name="envelope return" w:semiHidden="1" w:unhideWhenUsed="1"/>
@@ -27264,7 +27220,7 @@
     <w:lsdException w:name="Title" w:uiPriority="10" w:qFormat="1"/>
     <w:lsdException w:name="Closing" w:semiHidden="1" w:unhideWhenUsed="1"/>
     <w:lsdException w:name="Signature" w:semiHidden="1" w:unhideWhenUsed="1"/>
-    <w:lsdException w:name="Default Paragraph Font" w:semiHidden="1" w:uiPriority="1" w:unhideWhenUsed="1"/>
+    <w:lsdException w:name="Default Paragraph Font" w:uiPriority="1" w:semiHidden="1" w:unhideWhenUsed="1"/>
     <w:lsdException w:name="Body Text" w:semiHidden="1" w:unhideWhenUsed="1"/>
     <w:lsdException w:name="Body Text Indent" w:semiHidden="1" w:unhideWhenUsed="1"/>
     <w:lsdException w:name="List Continue" w:semiHidden="1" w:unhideWhenUsed="1"/>
@@ -27464,8 +27420,8 @@
     <w:lsdException w:name="Subtle Reference" w:uiPriority="31" w:qFormat="1"/>
     <w:lsdException w:name="Intense Reference" w:uiPriority="32" w:qFormat="1"/>
     <w:lsdException w:name="Book Title" w:uiPriority="33" w:qFormat="1"/>
-    <w:lsdException w:name="Bibliography" w:semiHidden="1" w:uiPriority="37" w:unhideWhenUsed="1"/>
-    <w:lsdException w:name="TOC Heading" w:semiHidden="1" w:uiPriority="39" w:unhideWhenUsed="1" w:qFormat="1"/>
+    <w:lsdException w:name="Bibliography" w:uiPriority="37" w:semiHidden="1" w:unhideWhenUsed="1"/>
+    <w:lsdException w:name="TOC Heading" w:uiPriority="39" w:semiHidden="1" w:unhideWhenUsed="1" w:qFormat="1"/>
     <w:lsdException w:name="Plain Table 1" w:uiPriority="41"/>
     <w:lsdException w:name="Plain Table 2" w:uiPriority="42"/>
     <w:lsdException w:name="Plain Table 3" w:uiPriority="43"/>
@@ -27576,7 +27532,7 @@
     <w:lsdException w:name="Unresolved Mention" w:semiHidden="1" w:unhideWhenUsed="1"/>
     <w:lsdException w:name="Smart Link" w:semiHidden="1" w:unhideWhenUsed="1"/>
   </w:latentStyles>
-  <w:style w:type="paragraph" w:default="1" w:styleId="Normal">
+  <w:style w:type="paragraph" w:styleId="Normal" w:default="1">
     <w:name w:val="Normal"/>
     <w:qFormat/>
     <w:rsid w:val="00280F84"/>
@@ -27694,13 +27650,13 @@
       <w:color w:val="666666"/>
     </w:rPr>
   </w:style>
-  <w:style w:type="character" w:default="1" w:styleId="Fuentedeprrafopredeter">
+  <w:style w:type="character" w:styleId="Fuentedeprrafopredeter" w:default="1">
     <w:name w:val="Default Paragraph Font"/>
     <w:uiPriority w:val="1"/>
     <w:semiHidden/>
     <w:unhideWhenUsed/>
   </w:style>
-  <w:style w:type="table" w:default="1" w:styleId="Tablanormal">
+  <w:style w:type="table" w:styleId="Tablanormal" w:default="1">
     <w:name w:val="Normal Table"/>
     <w:uiPriority w:val="99"/>
     <w:semiHidden/>
@@ -27715,13 +27671,13 @@
       </w:tblCellMar>
     </w:tblPr>
   </w:style>
-  <w:style w:type="numbering" w:default="1" w:styleId="Sinlista">
+  <w:style w:type="numbering" w:styleId="Sinlista" w:default="1">
     <w:name w:val="No List"/>
     <w:uiPriority w:val="99"/>
     <w:semiHidden/>
     <w:unhideWhenUsed/>
   </w:style>
-  <w:style w:type="table" w:customStyle="1" w:styleId="TableNormal1">
+  <w:style w:type="table" w:styleId="TableNormal1" w:customStyle="1">
     <w:name w:val="Table Normal1"/>
     <w:tblPr>
       <w:tblCellMar>
@@ -27748,7 +27704,7 @@
       <w:szCs w:val="52"/>
     </w:rPr>
   </w:style>
-  <w:style w:type="table" w:customStyle="1" w:styleId="TableNormal2">
+  <w:style w:type="table" w:styleId="TableNormal2" w:customStyle="1">
     <w:name w:val="Table Normal2"/>
     <w:tblPr>
       <w:tblCellMar>
@@ -27777,7 +27733,7 @@
       <w:szCs w:val="30"/>
     </w:rPr>
   </w:style>
-  <w:style w:type="table" w:customStyle="1" w:styleId="a">
+  <w:style w:type="table" w:styleId="a" w:customStyle="1">
     <w:basedOn w:val="Tablanormal"/>
     <w:tblPr>
       <w:tblStyleRowBandSize w:val="1"/>
@@ -27790,7 +27746,7 @@
       </w:tblCellMar>
     </w:tblPr>
   </w:style>
-  <w:style w:type="table" w:customStyle="1" w:styleId="a0">
+  <w:style w:type="table" w:styleId="a0" w:customStyle="1">
     <w:basedOn w:val="Tablanormal"/>
     <w:tblPr>
       <w:tblStyleRowBandSize w:val="1"/>
@@ -27803,7 +27759,7 @@
       </w:tblCellMar>
     </w:tblPr>
   </w:style>
-  <w:style w:type="table" w:customStyle="1" w:styleId="a1">
+  <w:style w:type="table" w:styleId="a1" w:customStyle="1">
     <w:basedOn w:val="Tablanormal"/>
     <w:tblPr>
       <w:tblStyleRowBandSize w:val="1"/>
@@ -27826,12 +27782,12 @@
     </w:pPr>
     <w:tblPr>
       <w:tblBorders>
-        <w:top w:val="single" w:sz="4" w:space="0" w:color="auto"/>
-        <w:left w:val="single" w:sz="4" w:space="0" w:color="auto"/>
-        <w:bottom w:val="single" w:sz="4" w:space="0" w:color="auto"/>
-        <w:right w:val="single" w:sz="4" w:space="0" w:color="auto"/>
-        <w:insideH w:val="single" w:sz="4" w:space="0" w:color="auto"/>
-        <w:insideV w:val="single" w:sz="4" w:space="0" w:color="auto"/>
+        <w:top w:val="single" w:color="auto" w:sz="4" w:space="0"/>
+        <w:left w:val="single" w:color="auto" w:sz="4" w:space="0"/>
+        <w:bottom w:val="single" w:color="auto" w:sz="4" w:space="0"/>
+        <w:right w:val="single" w:color="auto" w:sz="4" w:space="0"/>
+        <w:insideH w:val="single" w:color="auto" w:sz="4" w:space="0"/>
+        <w:insideV w:val="single" w:color="auto" w:sz="4" w:space="0"/>
       </w:tblBorders>
     </w:tblPr>
   </w:style>
@@ -27850,7 +27806,7 @@
       <w:spacing w:line="240" w:lineRule="auto"/>
     </w:pPr>
   </w:style>
-  <w:style w:type="character" w:customStyle="1" w:styleId="EncabezadoCar">
+  <w:style w:type="character" w:styleId="EncabezadoCar" w:customStyle="1">
     <w:name w:val="Encabezado Car"/>
     <w:basedOn w:val="Fuentedeprrafopredeter"/>
     <w:link w:val="Encabezado"/>
@@ -27872,7 +27828,7 @@
       <w:spacing w:line="240" w:lineRule="auto"/>
     </w:pPr>
   </w:style>
-  <w:style w:type="character" w:customStyle="1" w:styleId="PiedepginaCar">
+  <w:style w:type="character" w:styleId="PiedepginaCar" w:customStyle="1">
     <w:name w:val="Pie de página Car"/>
     <w:basedOn w:val="Fuentedeprrafopredeter"/>
     <w:link w:val="Piedepgina"/>
@@ -27889,12 +27845,12 @@
       <w:spacing w:before="100" w:beforeAutospacing="1" w:after="100" w:afterAutospacing="1" w:line="240" w:lineRule="auto"/>
     </w:pPr>
     <w:rPr>
-      <w:rFonts w:ascii="Times New Roman" w:eastAsia="Times New Roman" w:hAnsi="Times New Roman" w:cs="Times New Roman"/>
+      <w:rFonts w:ascii="Times New Roman" w:hAnsi="Times New Roman" w:eastAsia="Times New Roman" w:cs="Times New Roman"/>
       <w:sz w:val="24"/>
       <w:szCs w:val="24"/>
     </w:rPr>
   </w:style>
-  <w:style w:type="character" w:customStyle="1" w:styleId="Listavistosa-nfasis1Car">
+  <w:style w:type="character" w:styleId="Listavistosa-nfasis1Car" w:customStyle="1">
     <w:name w:val="Lista vistosa - Énfasis 1 Car"/>
     <w:link w:val="Listavistosa-nfasis1"/>
     <w:uiPriority w:val="34"/>
@@ -27935,7 +27891,7 @@
       <w:tblPr/>
       <w:tcPr>
         <w:tcBorders>
-          <w:bottom w:val="single" w:sz="12" w:space="0" w:color="FFFFFF" w:themeColor="background1"/>
+          <w:bottom w:val="single" w:color="FFFFFF" w:themeColor="background1" w:sz="12" w:space="0"/>
         </w:tcBorders>
         <w:shd w:val="clear" w:color="auto" w:fill="9E3A38" w:themeFill="accent2" w:themeFillShade="CC"/>
       </w:tcPr>
@@ -27944,7 +27900,7 @@
       <w:tblPr/>
       <w:tcPr>
         <w:tcBorders>
-          <w:top w:val="single" w:sz="12" w:space="0" w:color="000000" w:themeColor="text1"/>
+          <w:top w:val="single" w:color="000000" w:themeColor="text1" w:sz="12" w:space="0"/>
         </w:tcBorders>
         <w:shd w:val="clear" w:color="auto" w:fill="FFFFFF" w:themeFill="background1"/>
       </w:tcPr>
@@ -27992,7 +27948,7 @@
       <w:u w:val="single"/>
     </w:rPr>
   </w:style>
-  <w:style w:type="character" w:customStyle="1" w:styleId="Mencinsinresolver1">
+  <w:style w:type="character" w:styleId="Mencinsinresolver1" w:customStyle="1">
     <w:name w:val="Mención sin resolver1"/>
     <w:basedOn w:val="Fuentedeprrafopredeter"/>
     <w:uiPriority w:val="99"/>
@@ -28033,7 +27989,7 @@
       <w:szCs w:val="18"/>
     </w:rPr>
   </w:style>
-  <w:style w:type="character" w:customStyle="1" w:styleId="TextodegloboCar">
+  <w:style w:type="character" w:styleId="TextodegloboCar" w:customStyle="1">
     <w:name w:val="Texto de globo Car"/>
     <w:basedOn w:val="Fuentedeprrafopredeter"/>
     <w:link w:val="Textodeglobo"/>
@@ -28073,7 +28029,7 @@
       <w:szCs w:val="20"/>
     </w:rPr>
   </w:style>
-  <w:style w:type="character" w:customStyle="1" w:styleId="TextocomentarioCar">
+  <w:style w:type="character" w:styleId="TextocomentarioCar" w:customStyle="1">
     <w:name w:val="Texto comentario Car"/>
     <w:basedOn w:val="Fuentedeprrafopredeter"/>
     <w:link w:val="Textocomentario"/>
@@ -28098,7 +28054,7 @@
       <w:bCs/>
     </w:rPr>
   </w:style>
-  <w:style w:type="character" w:customStyle="1" w:styleId="AsuntodelcomentarioCar">
+  <w:style w:type="character" w:styleId="AsuntodelcomentarioCar" w:customStyle="1">
     <w:name w:val="Asunto del comentario Car"/>
     <w:basedOn w:val="TextocomentarioCar"/>
     <w:link w:val="Asuntodelcomentario"/>
@@ -28112,7 +28068,7 @@
       <w:szCs w:val="20"/>
     </w:rPr>
   </w:style>
-  <w:style w:type="table" w:customStyle="1" w:styleId="a2">
+  <w:style w:type="table" w:styleId="a2" w:customStyle="1">
     <w:basedOn w:val="TableNormal2"/>
     <w:pPr>
       <w:spacing w:line="240" w:lineRule="auto"/>
@@ -28134,7 +28090,7 @@
       <w:shd w:val="clear" w:color="auto" w:fill="EDF2F8"/>
     </w:tcPr>
   </w:style>
-  <w:style w:type="table" w:customStyle="1" w:styleId="a3">
+  <w:style w:type="table" w:styleId="a3" w:customStyle="1">
     <w:basedOn w:val="TableNormal2"/>
     <w:pPr>
       <w:spacing w:line="240" w:lineRule="auto"/>
@@ -28156,7 +28112,7 @@
       <w:shd w:val="clear" w:color="auto" w:fill="EDF2F8"/>
     </w:tcPr>
   </w:style>
-  <w:style w:type="table" w:customStyle="1" w:styleId="a4">
+  <w:style w:type="table" w:styleId="a4" w:customStyle="1">
     <w:basedOn w:val="TableNormal2"/>
     <w:pPr>
       <w:spacing w:line="240" w:lineRule="auto"/>
@@ -28178,7 +28134,7 @@
       <w:shd w:val="clear" w:color="auto" w:fill="EDF2F8"/>
     </w:tcPr>
   </w:style>
-  <w:style w:type="table" w:customStyle="1" w:styleId="a5">
+  <w:style w:type="table" w:styleId="a5" w:customStyle="1">
     <w:basedOn w:val="TableNormal2"/>
     <w:pPr>
       <w:spacing w:line="240" w:lineRule="auto"/>
@@ -28200,7 +28156,7 @@
       <w:shd w:val="clear" w:color="auto" w:fill="EDF2F8"/>
     </w:tcPr>
   </w:style>
-  <w:style w:type="table" w:customStyle="1" w:styleId="a6">
+  <w:style w:type="table" w:styleId="a6" w:customStyle="1">
     <w:basedOn w:val="TableNormal2"/>
     <w:tblPr>
       <w:tblStyleRowBandSize w:val="1"/>
@@ -28211,7 +28167,7 @@
       </w:tblCellMar>
     </w:tblPr>
   </w:style>
-  <w:style w:type="table" w:customStyle="1" w:styleId="a7">
+  <w:style w:type="table" w:styleId="a7" w:customStyle="1">
     <w:basedOn w:val="TableNormal2"/>
     <w:tblPr>
       <w:tblStyleRowBandSize w:val="1"/>
@@ -28224,7 +28180,7 @@
       </w:tblCellMar>
     </w:tblPr>
   </w:style>
-  <w:style w:type="table" w:customStyle="1" w:styleId="a8">
+  <w:style w:type="table" w:styleId="a8" w:customStyle="1">
     <w:basedOn w:val="TableNormal2"/>
     <w:tblPr>
       <w:tblStyleRowBandSize w:val="1"/>
@@ -28237,7 +28193,7 @@
       </w:tblCellMar>
     </w:tblPr>
   </w:style>
-  <w:style w:type="table" w:customStyle="1" w:styleId="a9">
+  <w:style w:type="table" w:styleId="a9" w:customStyle="1">
     <w:basedOn w:val="TableNormal2"/>
     <w:tblPr>
       <w:tblStyleRowBandSize w:val="1"/>
@@ -28248,7 +28204,7 @@
       </w:tblCellMar>
     </w:tblPr>
   </w:style>
-  <w:style w:type="table" w:customStyle="1" w:styleId="aa">
+  <w:style w:type="table" w:styleId="aa" w:customStyle="1">
     <w:basedOn w:val="TableNormal2"/>
     <w:tblPr>
       <w:tblStyleRowBandSize w:val="1"/>
@@ -28259,7 +28215,7 @@
       </w:tblCellMar>
     </w:tblPr>
   </w:style>
-  <w:style w:type="table" w:customStyle="1" w:styleId="ab">
+  <w:style w:type="table" w:styleId="ab" w:customStyle="1">
     <w:basedOn w:val="TableNormal2"/>
     <w:pPr>
       <w:spacing w:line="240" w:lineRule="auto"/>
@@ -28281,7 +28237,7 @@
       <w:shd w:val="clear" w:color="auto" w:fill="EDF2F8"/>
     </w:tcPr>
   </w:style>
-  <w:style w:type="table" w:customStyle="1" w:styleId="ac">
+  <w:style w:type="table" w:styleId="ac" w:customStyle="1">
     <w:basedOn w:val="TableNormal2"/>
     <w:pPr>
       <w:spacing w:line="240" w:lineRule="auto"/>
@@ -28303,7 +28259,7 @@
       <w:shd w:val="clear" w:color="auto" w:fill="EDF2F8"/>
     </w:tcPr>
   </w:style>
-  <w:style w:type="table" w:customStyle="1" w:styleId="ad">
+  <w:style w:type="table" w:styleId="ad" w:customStyle="1">
     <w:basedOn w:val="TableNormal2"/>
     <w:pPr>
       <w:spacing w:line="240" w:lineRule="auto"/>
@@ -28325,7 +28281,7 @@
       <w:shd w:val="clear" w:color="auto" w:fill="EDF2F8"/>
     </w:tcPr>
   </w:style>
-  <w:style w:type="table" w:customStyle="1" w:styleId="ae">
+  <w:style w:type="table" w:styleId="ae" w:customStyle="1">
     <w:basedOn w:val="TableNormal2"/>
     <w:pPr>
       <w:spacing w:line="240" w:lineRule="auto"/>
@@ -28347,7 +28303,7 @@
       <w:shd w:val="clear" w:color="auto" w:fill="EDF2F8"/>
     </w:tcPr>
   </w:style>
-  <w:style w:type="table" w:customStyle="1" w:styleId="af">
+  <w:style w:type="table" w:styleId="af" w:customStyle="1">
     <w:basedOn w:val="TableNormal2"/>
     <w:pPr>
       <w:spacing w:line="240" w:lineRule="auto"/>
@@ -28369,7 +28325,7 @@
       <w:shd w:val="clear" w:color="auto" w:fill="EDF2F8"/>
     </w:tcPr>
   </w:style>
-  <w:style w:type="table" w:customStyle="1" w:styleId="af0">
+  <w:style w:type="table" w:styleId="af0" w:customStyle="1">
     <w:basedOn w:val="TableNormal2"/>
     <w:pPr>
       <w:spacing w:line="240" w:lineRule="auto"/>
@@ -28391,7 +28347,7 @@
       <w:shd w:val="clear" w:color="auto" w:fill="EDF2F8"/>
     </w:tcPr>
   </w:style>
-  <w:style w:type="table" w:customStyle="1" w:styleId="af1">
+  <w:style w:type="table" w:styleId="af1" w:customStyle="1">
     <w:basedOn w:val="TableNormal2"/>
     <w:pPr>
       <w:spacing w:line="240" w:lineRule="auto"/>
@@ -28413,7 +28369,7 @@
       <w:shd w:val="clear" w:color="auto" w:fill="EDF2F8"/>
     </w:tcPr>
   </w:style>
-  <w:style w:type="table" w:customStyle="1" w:styleId="af2">
+  <w:style w:type="table" w:styleId="af2" w:customStyle="1">
     <w:basedOn w:val="TableNormal2"/>
     <w:pPr>
       <w:spacing w:line="240" w:lineRule="auto"/>
@@ -28435,7 +28391,7 @@
       <w:shd w:val="clear" w:color="auto" w:fill="EDF2F8"/>
     </w:tcPr>
   </w:style>
-  <w:style w:type="table" w:customStyle="1" w:styleId="af3">
+  <w:style w:type="table" w:styleId="af3" w:customStyle="1">
     <w:basedOn w:val="TableNormal2"/>
     <w:pPr>
       <w:spacing w:line="240" w:lineRule="auto"/>
@@ -28469,7 +28425,7 @@
       <w:shd w:val="clear" w:color="auto" w:fill="E1DFDD"/>
     </w:rPr>
   </w:style>
-  <w:style w:type="paragraph" w:customStyle="1" w:styleId="Normal0">
+  <w:style w:type="paragraph" w:styleId="Normal0" w:customStyle="1">
     <w:name w:val="Normal0"/>
     <w:qFormat/>
     <w:rsid w:val="00EF6422"/>
@@ -28521,7 +28477,7 @@
       <w:tblPr/>
       <w:tcPr>
         <w:tcBorders>
-          <w:bottom w:val="single" w:sz="4" w:space="0" w:color="7F7F7F" w:themeColor="text1" w:themeTint="80"/>
+          <w:bottom w:val="single" w:color="7F7F7F" w:themeColor="text1" w:themeTint="80" w:sz="4" w:space="0"/>
         </w:tcBorders>
       </w:tcPr>
     </w:tblStylePr>
@@ -28547,7 +28503,7 @@
       <w:tblPr/>
       <w:tcPr>
         <w:tcBorders>
-          <w:right w:val="single" w:sz="4" w:space="0" w:color="7F7F7F" w:themeColor="text1" w:themeTint="80"/>
+          <w:right w:val="single" w:color="7F7F7F" w:themeColor="text1" w:themeTint="80" w:sz="4" w:space="0"/>
         </w:tcBorders>
       </w:tcPr>
     </w:tblStylePr>
@@ -28607,7 +28563,7 @@
     </w:tblPr>
     <w:tblStylePr w:type="firstRow">
       <w:rPr>
-        <w:rFonts w:asciiTheme="majorHAnsi" w:eastAsiaTheme="majorEastAsia" w:hAnsiTheme="majorHAnsi" w:cstheme="majorBidi"/>
+        <w:rFonts w:asciiTheme="majorHAnsi" w:hAnsiTheme="majorHAnsi" w:eastAsiaTheme="majorEastAsia" w:cstheme="majorBidi"/>
         <w:i/>
         <w:iCs/>
         <w:sz w:val="26"/>
@@ -28615,14 +28571,14 @@
       <w:tblPr/>
       <w:tcPr>
         <w:tcBorders>
-          <w:bottom w:val="single" w:sz="4" w:space="0" w:color="7F7F7F" w:themeColor="text1" w:themeTint="80"/>
+          <w:bottom w:val="single" w:color="7F7F7F" w:themeColor="text1" w:themeTint="80" w:sz="4" w:space="0"/>
         </w:tcBorders>
         <w:shd w:val="clear" w:color="auto" w:fill="FFFFFF" w:themeFill="background1"/>
       </w:tcPr>
     </w:tblStylePr>
     <w:tblStylePr w:type="lastRow">
       <w:rPr>
-        <w:rFonts w:asciiTheme="majorHAnsi" w:eastAsiaTheme="majorEastAsia" w:hAnsiTheme="majorHAnsi" w:cstheme="majorBidi"/>
+        <w:rFonts w:asciiTheme="majorHAnsi" w:hAnsiTheme="majorHAnsi" w:eastAsiaTheme="majorEastAsia" w:cstheme="majorBidi"/>
         <w:i/>
         <w:iCs/>
         <w:sz w:val="26"/>
@@ -28630,7 +28586,7 @@
       <w:tblPr/>
       <w:tcPr>
         <w:tcBorders>
-          <w:top w:val="single" w:sz="4" w:space="0" w:color="7F7F7F" w:themeColor="text1" w:themeTint="80"/>
+          <w:top w:val="single" w:color="7F7F7F" w:themeColor="text1" w:themeTint="80" w:sz="4" w:space="0"/>
         </w:tcBorders>
         <w:shd w:val="clear" w:color="auto" w:fill="FFFFFF" w:themeFill="background1"/>
       </w:tcPr>
@@ -28640,7 +28596,7 @@
         <w:jc w:val="right"/>
       </w:pPr>
       <w:rPr>
-        <w:rFonts w:asciiTheme="majorHAnsi" w:eastAsiaTheme="majorEastAsia" w:hAnsiTheme="majorHAnsi" w:cstheme="majorBidi"/>
+        <w:rFonts w:asciiTheme="majorHAnsi" w:hAnsiTheme="majorHAnsi" w:eastAsiaTheme="majorEastAsia" w:cstheme="majorBidi"/>
         <w:i/>
         <w:iCs/>
         <w:sz w:val="26"/>
@@ -28648,14 +28604,14 @@
       <w:tblPr/>
       <w:tcPr>
         <w:tcBorders>
-          <w:right w:val="single" w:sz="4" w:space="0" w:color="7F7F7F" w:themeColor="text1" w:themeTint="80"/>
+          <w:right w:val="single" w:color="7F7F7F" w:themeColor="text1" w:themeTint="80" w:sz="4" w:space="0"/>
         </w:tcBorders>
         <w:shd w:val="clear" w:color="auto" w:fill="FFFFFF" w:themeFill="background1"/>
       </w:tcPr>
     </w:tblStylePr>
     <w:tblStylePr w:type="lastCol">
       <w:rPr>
-        <w:rFonts w:asciiTheme="majorHAnsi" w:eastAsiaTheme="majorEastAsia" w:hAnsiTheme="majorHAnsi" w:cstheme="majorBidi"/>
+        <w:rFonts w:asciiTheme="majorHAnsi" w:hAnsiTheme="majorHAnsi" w:eastAsiaTheme="majorEastAsia" w:cstheme="majorBidi"/>
         <w:i/>
         <w:iCs/>
         <w:sz w:val="26"/>
@@ -28663,7 +28619,7 @@
       <w:tblPr/>
       <w:tcPr>
         <w:tcBorders>
-          <w:left w:val="single" w:sz="4" w:space="0" w:color="7F7F7F" w:themeColor="text1" w:themeTint="80"/>
+          <w:left w:val="single" w:color="7F7F7F" w:themeColor="text1" w:themeTint="80" w:sz="4" w:space="0"/>
         </w:tcBorders>
         <w:shd w:val="clear" w:color="auto" w:fill="FFFFFF" w:themeFill="background1"/>
       </w:tcPr>
@@ -28728,10 +28684,10 @@
       <w:tblStyleRowBandSize w:val="1"/>
       <w:tblStyleColBandSize w:val="1"/>
       <w:tblBorders>
-        <w:top w:val="single" w:sz="24" w:space="0" w:color="C0504D" w:themeColor="accent2"/>
-        <w:left w:val="single" w:sz="24" w:space="0" w:color="C0504D" w:themeColor="accent2"/>
-        <w:bottom w:val="single" w:sz="24" w:space="0" w:color="C0504D" w:themeColor="accent2"/>
-        <w:right w:val="single" w:sz="24" w:space="0" w:color="C0504D" w:themeColor="accent2"/>
+        <w:top w:val="single" w:color="C0504D" w:themeColor="accent2" w:sz="24" w:space="0"/>
+        <w:left w:val="single" w:color="C0504D" w:themeColor="accent2" w:sz="24" w:space="0"/>
+        <w:bottom w:val="single" w:color="C0504D" w:themeColor="accent2" w:sz="24" w:space="0"/>
+        <w:right w:val="single" w:color="C0504D" w:themeColor="accent2" w:sz="24" w:space="0"/>
       </w:tblBorders>
     </w:tblPr>
     <w:tcPr>
@@ -28745,7 +28701,7 @@
       <w:tblPr/>
       <w:tcPr>
         <w:tcBorders>
-          <w:bottom w:val="single" w:sz="18" w:space="0" w:color="FFFFFF" w:themeColor="background1"/>
+          <w:bottom w:val="single" w:color="FFFFFF" w:themeColor="background1" w:sz="18" w:space="0"/>
         </w:tcBorders>
       </w:tcPr>
     </w:tblStylePr>
@@ -28757,7 +28713,7 @@
       <w:tblPr/>
       <w:tcPr>
         <w:tcBorders>
-          <w:top w:val="single" w:sz="4" w:space="0" w:color="FFFFFF" w:themeColor="background1"/>
+          <w:top w:val="single" w:color="FFFFFF" w:themeColor="background1" w:sz="4" w:space="0"/>
         </w:tcBorders>
       </w:tcPr>
     </w:tblStylePr>
@@ -28769,7 +28725,7 @@
       <w:tblPr/>
       <w:tcPr>
         <w:tcBorders>
-          <w:right w:val="single" w:sz="4" w:space="0" w:color="FFFFFF" w:themeColor="background1"/>
+          <w:right w:val="single" w:color="FFFFFF" w:themeColor="background1" w:sz="4" w:space="0"/>
         </w:tcBorders>
       </w:tcPr>
     </w:tblStylePr>
@@ -28781,7 +28737,7 @@
       <w:tblPr/>
       <w:tcPr>
         <w:tcBorders>
-          <w:left w:val="single" w:sz="4" w:space="0" w:color="FFFFFF" w:themeColor="background1"/>
+          <w:left w:val="single" w:color="FFFFFF" w:themeColor="background1" w:sz="4" w:space="0"/>
         </w:tcBorders>
       </w:tcPr>
     </w:tblStylePr>
@@ -28789,8 +28745,8 @@
       <w:tblPr/>
       <w:tcPr>
         <w:tcBorders>
-          <w:left w:val="single" w:sz="4" w:space="0" w:color="FFFFFF" w:themeColor="background1"/>
-          <w:right w:val="single" w:sz="4" w:space="0" w:color="FFFFFF" w:themeColor="background1"/>
+          <w:left w:val="single" w:color="FFFFFF" w:themeColor="background1" w:sz="4" w:space="0"/>
+          <w:right w:val="single" w:color="FFFFFF" w:themeColor="background1" w:sz="4" w:space="0"/>
         </w:tcBorders>
       </w:tcPr>
     </w:tblStylePr>
@@ -28798,8 +28754,8 @@
       <w:tblPr/>
       <w:tcPr>
         <w:tcBorders>
-          <w:left w:val="single" w:sz="4" w:space="0" w:color="FFFFFF" w:themeColor="background1"/>
-          <w:right w:val="single" w:sz="4" w:space="0" w:color="FFFFFF" w:themeColor="background1"/>
+          <w:left w:val="single" w:color="FFFFFF" w:themeColor="background1" w:sz="4" w:space="0"/>
+          <w:right w:val="single" w:color="FFFFFF" w:themeColor="background1" w:sz="4" w:space="0"/>
         </w:tcBorders>
       </w:tcPr>
     </w:tblStylePr>
@@ -28807,8 +28763,8 @@
       <w:tblPr/>
       <w:tcPr>
         <w:tcBorders>
-          <w:top w:val="single" w:sz="4" w:space="0" w:color="FFFFFF" w:themeColor="background1"/>
-          <w:bottom w:val="single" w:sz="4" w:space="0" w:color="FFFFFF" w:themeColor="background1"/>
+          <w:top w:val="single" w:color="FFFFFF" w:themeColor="background1" w:sz="4" w:space="0"/>
+          <w:bottom w:val="single" w:color="FFFFFF" w:themeColor="background1" w:sz="4" w:space="0"/>
         </w:tcBorders>
       </w:tcPr>
     </w:tblStylePr>
@@ -28862,8 +28818,8 @@
       <w:tblStyleRowBandSize w:val="1"/>
       <w:tblStyleColBandSize w:val="1"/>
       <w:tblBorders>
-        <w:top w:val="single" w:sz="4" w:space="0" w:color="000000" w:themeColor="text1"/>
-        <w:bottom w:val="single" w:sz="4" w:space="0" w:color="000000" w:themeColor="text1"/>
+        <w:top w:val="single" w:color="000000" w:themeColor="text1" w:sz="4" w:space="0"/>
+        <w:bottom w:val="single" w:color="000000" w:themeColor="text1" w:sz="4" w:space="0"/>
       </w:tblBorders>
     </w:tblPr>
     <w:tblStylePr w:type="firstRow">
@@ -28874,7 +28830,7 @@
       <w:tblPr/>
       <w:tcPr>
         <w:tcBorders>
-          <w:bottom w:val="single" w:sz="4" w:space="0" w:color="000000" w:themeColor="text1"/>
+          <w:bottom w:val="single" w:color="000000" w:themeColor="text1" w:sz="4" w:space="0"/>
         </w:tcBorders>
       </w:tcPr>
     </w:tblStylePr>
@@ -28886,7 +28842,7 @@
       <w:tblPr/>
       <w:tcPr>
         <w:tcBorders>
-          <w:top w:val="double" w:sz="4" w:space="0" w:color="000000" w:themeColor="text1"/>
+          <w:top w:val="double" w:color="000000" w:themeColor="text1" w:sz="4" w:space="0"/>
         </w:tcBorders>
       </w:tcPr>
     </w:tblStylePr>
@@ -28930,10 +28886,10 @@
       <w:tblStyleRowBandSize w:val="1"/>
       <w:tblStyleColBandSize w:val="1"/>
       <w:tblBorders>
-        <w:top w:val="single" w:sz="24" w:space="0" w:color="4BACC6" w:themeColor="accent5"/>
-        <w:left w:val="single" w:sz="24" w:space="0" w:color="4BACC6" w:themeColor="accent5"/>
-        <w:bottom w:val="single" w:sz="24" w:space="0" w:color="4BACC6" w:themeColor="accent5"/>
-        <w:right w:val="single" w:sz="24" w:space="0" w:color="4BACC6" w:themeColor="accent5"/>
+        <w:top w:val="single" w:color="4BACC6" w:themeColor="accent5" w:sz="24" w:space="0"/>
+        <w:left w:val="single" w:color="4BACC6" w:themeColor="accent5" w:sz="24" w:space="0"/>
+        <w:bottom w:val="single" w:color="4BACC6" w:themeColor="accent5" w:sz="24" w:space="0"/>
+        <w:right w:val="single" w:color="4BACC6" w:themeColor="accent5" w:sz="24" w:space="0"/>
       </w:tblBorders>
     </w:tblPr>
     <w:tcPr>
@@ -28947,7 +28903,7 @@
       <w:tblPr/>
       <w:tcPr>
         <w:tcBorders>
-          <w:bottom w:val="single" w:sz="18" w:space="0" w:color="FFFFFF" w:themeColor="background1"/>
+          <w:bottom w:val="single" w:color="FFFFFF" w:themeColor="background1" w:sz="18" w:space="0"/>
         </w:tcBorders>
       </w:tcPr>
     </w:tblStylePr>
@@ -28959,7 +28915,7 @@
       <w:tblPr/>
       <w:tcPr>
         <w:tcBorders>
-          <w:top w:val="single" w:sz="4" w:space="0" w:color="FFFFFF" w:themeColor="background1"/>
+          <w:top w:val="single" w:color="FFFFFF" w:themeColor="background1" w:sz="4" w:space="0"/>
         </w:tcBorders>
       </w:tcPr>
     </w:tblStylePr>
@@ -28971,7 +28927,7 @@
       <w:tblPr/>
       <w:tcPr>
         <w:tcBorders>
-          <w:right w:val="single" w:sz="4" w:space="0" w:color="FFFFFF" w:themeColor="background1"/>
+          <w:right w:val="single" w:color="FFFFFF" w:themeColor="background1" w:sz="4" w:space="0"/>
         </w:tcBorders>
       </w:tcPr>
     </w:tblStylePr>
@@ -28983,7 +28939,7 @@
       <w:tblPr/>
       <w:tcPr>
         <w:tcBorders>
-          <w:left w:val="single" w:sz="4" w:space="0" w:color="FFFFFF" w:themeColor="background1"/>
+          <w:left w:val="single" w:color="FFFFFF" w:themeColor="background1" w:sz="4" w:space="0"/>
         </w:tcBorders>
       </w:tcPr>
     </w:tblStylePr>
@@ -28991,8 +28947,8 @@
       <w:tblPr/>
       <w:tcPr>
         <w:tcBorders>
-          <w:left w:val="single" w:sz="4" w:space="0" w:color="FFFFFF" w:themeColor="background1"/>
-          <w:right w:val="single" w:sz="4" w:space="0" w:color="FFFFFF" w:themeColor="background1"/>
+          <w:left w:val="single" w:color="FFFFFF" w:themeColor="background1" w:sz="4" w:space="0"/>
+          <w:right w:val="single" w:color="FFFFFF" w:themeColor="background1" w:sz="4" w:space="0"/>
         </w:tcBorders>
       </w:tcPr>
     </w:tblStylePr>
@@ -29000,8 +28956,8 @@
       <w:tblPr/>
       <w:tcPr>
         <w:tcBorders>
-          <w:left w:val="single" w:sz="4" w:space="0" w:color="FFFFFF" w:themeColor="background1"/>
-          <w:right w:val="single" w:sz="4" w:space="0" w:color="FFFFFF" w:themeColor="background1"/>
+          <w:left w:val="single" w:color="FFFFFF" w:themeColor="background1" w:sz="4" w:space="0"/>
+          <w:right w:val="single" w:color="FFFFFF" w:themeColor="background1" w:sz="4" w:space="0"/>
         </w:tcBorders>
       </w:tcPr>
     </w:tblStylePr>
@@ -29009,8 +28965,8 @@
       <w:tblPr/>
       <w:tcPr>
         <w:tcBorders>
-          <w:top w:val="single" w:sz="4" w:space="0" w:color="FFFFFF" w:themeColor="background1"/>
-          <w:bottom w:val="single" w:sz="4" w:space="0" w:color="FFFFFF" w:themeColor="background1"/>
+          <w:top w:val="single" w:color="FFFFFF" w:themeColor="background1" w:sz="4" w:space="0"/>
+          <w:bottom w:val="single" w:color="FFFFFF" w:themeColor="background1" w:sz="4" w:space="0"/>
         </w:tcBorders>
       </w:tcPr>
     </w:tblStylePr>
@@ -29061,12 +29017,12 @@
       <w:tblStyleRowBandSize w:val="1"/>
       <w:tblStyleColBandSize w:val="1"/>
       <w:tblBorders>
-        <w:top w:val="single" w:sz="4" w:space="0" w:color="FFFFFF" w:themeColor="background1"/>
-        <w:left w:val="single" w:sz="4" w:space="0" w:color="FFFFFF" w:themeColor="background1"/>
-        <w:bottom w:val="single" w:sz="4" w:space="0" w:color="FFFFFF" w:themeColor="background1"/>
-        <w:right w:val="single" w:sz="4" w:space="0" w:color="FFFFFF" w:themeColor="background1"/>
-        <w:insideH w:val="single" w:sz="4" w:space="0" w:color="FFFFFF" w:themeColor="background1"/>
-        <w:insideV w:val="single" w:sz="4" w:space="0" w:color="FFFFFF" w:themeColor="background1"/>
+        <w:top w:val="single" w:color="FFFFFF" w:themeColor="background1" w:sz="4" w:space="0"/>
+        <w:left w:val="single" w:color="FFFFFF" w:themeColor="background1" w:sz="4" w:space="0"/>
+        <w:bottom w:val="single" w:color="FFFFFF" w:themeColor="background1" w:sz="4" w:space="0"/>
+        <w:right w:val="single" w:color="FFFFFF" w:themeColor="background1" w:sz="4" w:space="0"/>
+        <w:insideH w:val="single" w:color="FFFFFF" w:themeColor="background1" w:sz="4" w:space="0"/>
+        <w:insideV w:val="single" w:color="FFFFFF" w:themeColor="background1" w:sz="4" w:space="0"/>
       </w:tblBorders>
     </w:tblPr>
     <w:tcPr>
@@ -29081,9 +29037,9 @@
       <w:tblPr/>
       <w:tcPr>
         <w:tcBorders>
-          <w:top w:val="single" w:sz="4" w:space="0" w:color="FFFFFF" w:themeColor="background1"/>
-          <w:left w:val="single" w:sz="4" w:space="0" w:color="FFFFFF" w:themeColor="background1"/>
-          <w:right w:val="single" w:sz="4" w:space="0" w:color="FFFFFF" w:themeColor="background1"/>
+          <w:top w:val="single" w:color="FFFFFF" w:themeColor="background1" w:sz="4" w:space="0"/>
+          <w:left w:val="single" w:color="FFFFFF" w:themeColor="background1" w:sz="4" w:space="0"/>
+          <w:right w:val="single" w:color="FFFFFF" w:themeColor="background1" w:sz="4" w:space="0"/>
           <w:insideH w:val="nil"/>
           <w:insideV w:val="nil"/>
         </w:tcBorders>
@@ -29099,9 +29055,9 @@
       <w:tblPr/>
       <w:tcPr>
         <w:tcBorders>
-          <w:left w:val="single" w:sz="4" w:space="0" w:color="FFFFFF" w:themeColor="background1"/>
-          <w:bottom w:val="single" w:sz="4" w:space="0" w:color="FFFFFF" w:themeColor="background1"/>
-          <w:right w:val="single" w:sz="4" w:space="0" w:color="FFFFFF" w:themeColor="background1"/>
+          <w:left w:val="single" w:color="FFFFFF" w:themeColor="background1" w:sz="4" w:space="0"/>
+          <w:bottom w:val="single" w:color="FFFFFF" w:themeColor="background1" w:sz="4" w:space="0"/>
+          <w:right w:val="single" w:color="FFFFFF" w:themeColor="background1" w:sz="4" w:space="0"/>
           <w:insideH w:val="nil"/>
           <w:insideV w:val="nil"/>
         </w:tcBorders>
@@ -29117,9 +29073,9 @@
       <w:tblPr/>
       <w:tcPr>
         <w:tcBorders>
-          <w:top w:val="single" w:sz="4" w:space="0" w:color="FFFFFF" w:themeColor="background1"/>
-          <w:left w:val="single" w:sz="4" w:space="0" w:color="FFFFFF" w:themeColor="background1"/>
-          <w:bottom w:val="single" w:sz="4" w:space="0" w:color="FFFFFF" w:themeColor="background1"/>
+          <w:top w:val="single" w:color="FFFFFF" w:themeColor="background1" w:sz="4" w:space="0"/>
+          <w:left w:val="single" w:color="FFFFFF" w:themeColor="background1" w:sz="4" w:space="0"/>
+          <w:bottom w:val="single" w:color="FFFFFF" w:themeColor="background1" w:sz="4" w:space="0"/>
           <w:insideV w:val="nil"/>
         </w:tcBorders>
         <w:shd w:val="clear" w:color="auto" w:fill="000000" w:themeFill="text1"/>
@@ -29134,9 +29090,9 @@
       <w:tblPr/>
       <w:tcPr>
         <w:tcBorders>
-          <w:top w:val="single" w:sz="4" w:space="0" w:color="FFFFFF" w:themeColor="background1"/>
-          <w:bottom w:val="single" w:sz="4" w:space="0" w:color="FFFFFF" w:themeColor="background1"/>
-          <w:right w:val="single" w:sz="4" w:space="0" w:color="FFFFFF" w:themeColor="background1"/>
+          <w:top w:val="single" w:color="FFFFFF" w:themeColor="background1" w:sz="4" w:space="0"/>
+          <w:bottom w:val="single" w:color="FFFFFF" w:themeColor="background1" w:sz="4" w:space="0"/>
+          <w:right w:val="single" w:color="FFFFFF" w:themeColor="background1" w:sz="4" w:space="0"/>
           <w:insideV w:val="nil"/>
         </w:tcBorders>
         <w:shd w:val="clear" w:color="auto" w:fill="000000" w:themeFill="text1"/>
@@ -29167,12 +29123,12 @@
       <w:tblStyleRowBandSize w:val="1"/>
       <w:tblStyleColBandSize w:val="1"/>
       <w:tblBorders>
-        <w:top w:val="single" w:sz="4" w:space="0" w:color="FFFFFF" w:themeColor="background1"/>
-        <w:left w:val="single" w:sz="4" w:space="0" w:color="FFFFFF" w:themeColor="background1"/>
-        <w:bottom w:val="single" w:sz="4" w:space="0" w:color="FFFFFF" w:themeColor="background1"/>
-        <w:right w:val="single" w:sz="4" w:space="0" w:color="FFFFFF" w:themeColor="background1"/>
-        <w:insideH w:val="single" w:sz="4" w:space="0" w:color="FFFFFF" w:themeColor="background1"/>
-        <w:insideV w:val="single" w:sz="4" w:space="0" w:color="FFFFFF" w:themeColor="background1"/>
+        <w:top w:val="single" w:color="FFFFFF" w:themeColor="background1" w:sz="4" w:space="0"/>
+        <w:left w:val="single" w:color="FFFFFF" w:themeColor="background1" w:sz="4" w:space="0"/>
+        <w:bottom w:val="single" w:color="FFFFFF" w:themeColor="background1" w:sz="4" w:space="0"/>
+        <w:right w:val="single" w:color="FFFFFF" w:themeColor="background1" w:sz="4" w:space="0"/>
+        <w:insideH w:val="single" w:color="FFFFFF" w:themeColor="background1" w:sz="4" w:space="0"/>
+        <w:insideV w:val="single" w:color="FFFFFF" w:themeColor="background1" w:sz="4" w:space="0"/>
       </w:tblBorders>
     </w:tblPr>
     <w:tcPr>
@@ -29187,9 +29143,9 @@
       <w:tblPr/>
       <w:tcPr>
         <w:tcBorders>
-          <w:top w:val="single" w:sz="4" w:space="0" w:color="FFFFFF" w:themeColor="background1"/>
-          <w:left w:val="single" w:sz="4" w:space="0" w:color="FFFFFF" w:themeColor="background1"/>
-          <w:right w:val="single" w:sz="4" w:space="0" w:color="FFFFFF" w:themeColor="background1"/>
+          <w:top w:val="single" w:color="FFFFFF" w:themeColor="background1" w:sz="4" w:space="0"/>
+          <w:left w:val="single" w:color="FFFFFF" w:themeColor="background1" w:sz="4" w:space="0"/>
+          <w:right w:val="single" w:color="FFFFFF" w:themeColor="background1" w:sz="4" w:space="0"/>
           <w:insideH w:val="nil"/>
           <w:insideV w:val="nil"/>
         </w:tcBorders>
@@ -29205,9 +29161,9 @@
       <w:tblPr/>
       <w:tcPr>
         <w:tcBorders>
-          <w:left w:val="single" w:sz="4" w:space="0" w:color="FFFFFF" w:themeColor="background1"/>
-          <w:bottom w:val="single" w:sz="4" w:space="0" w:color="FFFFFF" w:themeColor="background1"/>
-          <w:right w:val="single" w:sz="4" w:space="0" w:color="FFFFFF" w:themeColor="background1"/>
+          <w:left w:val="single" w:color="FFFFFF" w:themeColor="background1" w:sz="4" w:space="0"/>
+          <w:bottom w:val="single" w:color="FFFFFF" w:themeColor="background1" w:sz="4" w:space="0"/>
+          <w:right w:val="single" w:color="FFFFFF" w:themeColor="background1" w:sz="4" w:space="0"/>
           <w:insideH w:val="nil"/>
           <w:insideV w:val="nil"/>
         </w:tcBorders>
@@ -29223,9 +29179,9 @@
       <w:tblPr/>
       <w:tcPr>
         <w:tcBorders>
-          <w:top w:val="single" w:sz="4" w:space="0" w:color="FFFFFF" w:themeColor="background1"/>
-          <w:left w:val="single" w:sz="4" w:space="0" w:color="FFFFFF" w:themeColor="background1"/>
-          <w:bottom w:val="single" w:sz="4" w:space="0" w:color="FFFFFF" w:themeColor="background1"/>
+          <w:top w:val="single" w:color="FFFFFF" w:themeColor="background1" w:sz="4" w:space="0"/>
+          <w:left w:val="single" w:color="FFFFFF" w:themeColor="background1" w:sz="4" w:space="0"/>
+          <w:bottom w:val="single" w:color="FFFFFF" w:themeColor="background1" w:sz="4" w:space="0"/>
           <w:insideV w:val="nil"/>
         </w:tcBorders>
         <w:shd w:val="clear" w:color="auto" w:fill="4F81BD" w:themeFill="accent1"/>
@@ -29240,9 +29196,9 @@
       <w:tblPr/>
       <w:tcPr>
         <w:tcBorders>
-          <w:top w:val="single" w:sz="4" w:space="0" w:color="FFFFFF" w:themeColor="background1"/>
-          <w:bottom w:val="single" w:sz="4" w:space="0" w:color="FFFFFF" w:themeColor="background1"/>
-          <w:right w:val="single" w:sz="4" w:space="0" w:color="FFFFFF" w:themeColor="background1"/>
+          <w:top w:val="single" w:color="FFFFFF" w:themeColor="background1" w:sz="4" w:space="0"/>
+          <w:bottom w:val="single" w:color="FFFFFF" w:themeColor="background1" w:sz="4" w:space="0"/>
+          <w:right w:val="single" w:color="FFFFFF" w:themeColor="background1" w:sz="4" w:space="0"/>
           <w:insideV w:val="nil"/>
         </w:tcBorders>
         <w:shd w:val="clear" w:color="auto" w:fill="4F81BD" w:themeFill="accent1"/>
@@ -29273,9 +29229,9 @@
       <w:tblStyleRowBandSize w:val="1"/>
       <w:tblStyleColBandSize w:val="1"/>
       <w:tblBorders>
-        <w:top w:val="single" w:sz="4" w:space="0" w:color="B2A1C7" w:themeColor="accent4" w:themeTint="99"/>
-        <w:bottom w:val="single" w:sz="4" w:space="0" w:color="B2A1C7" w:themeColor="accent4" w:themeTint="99"/>
-        <w:insideH w:val="single" w:sz="4" w:space="0" w:color="B2A1C7" w:themeColor="accent4" w:themeTint="99"/>
+        <w:top w:val="single" w:color="B2A1C7" w:themeColor="accent4" w:themeTint="99" w:sz="4" w:space="0"/>
+        <w:bottom w:val="single" w:color="B2A1C7" w:themeColor="accent4" w:themeTint="99" w:sz="4" w:space="0"/>
+        <w:insideH w:val="single" w:color="B2A1C7" w:themeColor="accent4" w:themeTint="99" w:sz="4" w:space="0"/>
       </w:tblBorders>
     </w:tblPr>
     <w:tblStylePr w:type="firstRow">
@@ -29324,7 +29280,7 @@
       <w:spacing w:line="240" w:lineRule="auto"/>
     </w:pPr>
     <w:rPr>
-      <w:rFonts w:asciiTheme="minorHAnsi" w:eastAsiaTheme="minorHAnsi" w:hAnsiTheme="minorHAnsi" w:cstheme="minorBidi"/>
+      <w:rFonts w:asciiTheme="minorHAnsi" w:hAnsiTheme="minorHAnsi" w:eastAsiaTheme="minorHAnsi" w:cstheme="minorBidi"/>
       <w:kern w:val="2"/>
       <w:sz w:val="24"/>
       <w:szCs w:val="24"/>
@@ -29335,12 +29291,12 @@
       <w:tblStyleRowBandSize w:val="1"/>
       <w:tblStyleColBandSize w:val="1"/>
       <w:tblBorders>
-        <w:top w:val="single" w:sz="4" w:space="0" w:color="95B3D7" w:themeColor="accent1" w:themeTint="99"/>
-        <w:left w:val="single" w:sz="4" w:space="0" w:color="95B3D7" w:themeColor="accent1" w:themeTint="99"/>
-        <w:bottom w:val="single" w:sz="4" w:space="0" w:color="95B3D7" w:themeColor="accent1" w:themeTint="99"/>
-        <w:right w:val="single" w:sz="4" w:space="0" w:color="95B3D7" w:themeColor="accent1" w:themeTint="99"/>
-        <w:insideH w:val="single" w:sz="4" w:space="0" w:color="95B3D7" w:themeColor="accent1" w:themeTint="99"/>
-        <w:insideV w:val="single" w:sz="4" w:space="0" w:color="95B3D7" w:themeColor="accent1" w:themeTint="99"/>
+        <w:top w:val="single" w:color="95B3D7" w:themeColor="accent1" w:themeTint="99" w:sz="4" w:space="0"/>
+        <w:left w:val="single" w:color="95B3D7" w:themeColor="accent1" w:themeTint="99" w:sz="4" w:space="0"/>
+        <w:bottom w:val="single" w:color="95B3D7" w:themeColor="accent1" w:themeTint="99" w:sz="4" w:space="0"/>
+        <w:right w:val="single" w:color="95B3D7" w:themeColor="accent1" w:themeTint="99" w:sz="4" w:space="0"/>
+        <w:insideH w:val="single" w:color="95B3D7" w:themeColor="accent1" w:themeTint="99" w:sz="4" w:space="0"/>
+        <w:insideV w:val="single" w:color="95B3D7" w:themeColor="accent1" w:themeTint="99" w:sz="4" w:space="0"/>
       </w:tblBorders>
     </w:tblPr>
     <w:tblStylePr w:type="firstRow">
@@ -29352,10 +29308,10 @@
       <w:tblPr/>
       <w:tcPr>
         <w:tcBorders>
-          <w:top w:val="single" w:sz="4" w:space="0" w:color="4F81BD" w:themeColor="accent1"/>
-          <w:left w:val="single" w:sz="4" w:space="0" w:color="4F81BD" w:themeColor="accent1"/>
-          <w:bottom w:val="single" w:sz="4" w:space="0" w:color="4F81BD" w:themeColor="accent1"/>
-          <w:right w:val="single" w:sz="4" w:space="0" w:color="4F81BD" w:themeColor="accent1"/>
+          <w:top w:val="single" w:color="4F81BD" w:themeColor="accent1" w:sz="4" w:space="0"/>
+          <w:left w:val="single" w:color="4F81BD" w:themeColor="accent1" w:sz="4" w:space="0"/>
+          <w:bottom w:val="single" w:color="4F81BD" w:themeColor="accent1" w:sz="4" w:space="0"/>
+          <w:right w:val="single" w:color="4F81BD" w:themeColor="accent1" w:sz="4" w:space="0"/>
           <w:insideH w:val="nil"/>
           <w:insideV w:val="nil"/>
         </w:tcBorders>
@@ -29370,7 +29326,7 @@
       <w:tblPr/>
       <w:tcPr>
         <w:tcBorders>
-          <w:top w:val="double" w:sz="4" w:space="0" w:color="4F81BD" w:themeColor="accent1"/>
+          <w:top w:val="double" w:color="4F81BD" w:themeColor="accent1" w:sz="4" w:space="0"/>
         </w:tcBorders>
       </w:tcPr>
     </w:tblStylePr>
@@ -29411,12 +29367,12 @@
       <w:tblStyleRowBandSize w:val="1"/>
       <w:tblStyleColBandSize w:val="1"/>
       <w:tblBorders>
-        <w:top w:val="single" w:sz="4" w:space="0" w:color="92CDDC" w:themeColor="accent5" w:themeTint="99"/>
-        <w:left w:val="single" w:sz="4" w:space="0" w:color="92CDDC" w:themeColor="accent5" w:themeTint="99"/>
-        <w:bottom w:val="single" w:sz="4" w:space="0" w:color="92CDDC" w:themeColor="accent5" w:themeTint="99"/>
-        <w:right w:val="single" w:sz="4" w:space="0" w:color="92CDDC" w:themeColor="accent5" w:themeTint="99"/>
-        <w:insideH w:val="single" w:sz="4" w:space="0" w:color="92CDDC" w:themeColor="accent5" w:themeTint="99"/>
-        <w:insideV w:val="single" w:sz="4" w:space="0" w:color="92CDDC" w:themeColor="accent5" w:themeTint="99"/>
+        <w:top w:val="single" w:color="92CDDC" w:themeColor="accent5" w:themeTint="99" w:sz="4" w:space="0"/>
+        <w:left w:val="single" w:color="92CDDC" w:themeColor="accent5" w:themeTint="99" w:sz="4" w:space="0"/>
+        <w:bottom w:val="single" w:color="92CDDC" w:themeColor="accent5" w:themeTint="99" w:sz="4" w:space="0"/>
+        <w:right w:val="single" w:color="92CDDC" w:themeColor="accent5" w:themeTint="99" w:sz="4" w:space="0"/>
+        <w:insideH w:val="single" w:color="92CDDC" w:themeColor="accent5" w:themeTint="99" w:sz="4" w:space="0"/>
+        <w:insideV w:val="single" w:color="92CDDC" w:themeColor="accent5" w:themeTint="99" w:sz="4" w:space="0"/>
       </w:tblBorders>
     </w:tblPr>
     <w:tblStylePr w:type="firstRow">
@@ -29428,10 +29384,10 @@
       <w:tblPr/>
       <w:tcPr>
         <w:tcBorders>
-          <w:top w:val="single" w:sz="4" w:space="0" w:color="4BACC6" w:themeColor="accent5"/>
-          <w:left w:val="single" w:sz="4" w:space="0" w:color="4BACC6" w:themeColor="accent5"/>
-          <w:bottom w:val="single" w:sz="4" w:space="0" w:color="4BACC6" w:themeColor="accent5"/>
-          <w:right w:val="single" w:sz="4" w:space="0" w:color="4BACC6" w:themeColor="accent5"/>
+          <w:top w:val="single" w:color="4BACC6" w:themeColor="accent5" w:sz="4" w:space="0"/>
+          <w:left w:val="single" w:color="4BACC6" w:themeColor="accent5" w:sz="4" w:space="0"/>
+          <w:bottom w:val="single" w:color="4BACC6" w:themeColor="accent5" w:sz="4" w:space="0"/>
+          <w:right w:val="single" w:color="4BACC6" w:themeColor="accent5" w:sz="4" w:space="0"/>
           <w:insideH w:val="nil"/>
           <w:insideV w:val="nil"/>
         </w:tcBorders>
@@ -29446,7 +29402,7 @@
       <w:tblPr/>
       <w:tcPr>
         <w:tcBorders>
-          <w:top w:val="double" w:sz="4" w:space="0" w:color="4BACC6" w:themeColor="accent5"/>
+          <w:top w:val="double" w:color="4BACC6" w:themeColor="accent5" w:sz="4" w:space="0"/>
         </w:tcBorders>
       </w:tcPr>
     </w:tblStylePr>
@@ -29498,10 +29454,10 @@
       <w:tblStyleRowBandSize w:val="1"/>
       <w:tblStyleColBandSize w:val="1"/>
       <w:tblBorders>
-        <w:top w:val="single" w:sz="2" w:space="0" w:color="92CDDC" w:themeColor="accent5" w:themeTint="99"/>
-        <w:bottom w:val="single" w:sz="2" w:space="0" w:color="92CDDC" w:themeColor="accent5" w:themeTint="99"/>
-        <w:insideH w:val="single" w:sz="2" w:space="0" w:color="92CDDC" w:themeColor="accent5" w:themeTint="99"/>
-        <w:insideV w:val="single" w:sz="2" w:space="0" w:color="92CDDC" w:themeColor="accent5" w:themeTint="99"/>
+        <w:top w:val="single" w:color="92CDDC" w:themeColor="accent5" w:themeTint="99" w:sz="2" w:space="0"/>
+        <w:bottom w:val="single" w:color="92CDDC" w:themeColor="accent5" w:themeTint="99" w:sz="2" w:space="0"/>
+        <w:insideH w:val="single" w:color="92CDDC" w:themeColor="accent5" w:themeTint="99" w:sz="2" w:space="0"/>
+        <w:insideV w:val="single" w:color="92CDDC" w:themeColor="accent5" w:themeTint="99" w:sz="2" w:space="0"/>
       </w:tblBorders>
     </w:tblPr>
     <w:tblStylePr w:type="firstRow">
@@ -29513,7 +29469,7 @@
       <w:tcPr>
         <w:tcBorders>
           <w:top w:val="nil"/>
-          <w:bottom w:val="single" w:sz="12" w:space="0" w:color="92CDDC" w:themeColor="accent5" w:themeTint="99"/>
+          <w:bottom w:val="single" w:color="92CDDC" w:themeColor="accent5" w:themeTint="99" w:sz="12" w:space="0"/>
           <w:insideH w:val="nil"/>
           <w:insideV w:val="nil"/>
         </w:tcBorders>
@@ -29528,7 +29484,7 @@
       <w:tblPr/>
       <w:tcPr>
         <w:tcBorders>
-          <w:top w:val="double" w:sz="2" w:space="0" w:color="92CDDC" w:themeColor="accent5" w:themeTint="99"/>
+          <w:top w:val="double" w:color="92CDDC" w:themeColor="accent5" w:themeTint="99" w:sz="2" w:space="0"/>
           <w:bottom w:val="nil"/>
           <w:insideH w:val="nil"/>
           <w:insideV w:val="nil"/>
@@ -29573,12 +29529,12 @@
       <w:tblStyleRowBandSize w:val="1"/>
       <w:tblStyleColBandSize w:val="1"/>
       <w:tblBorders>
-        <w:top w:val="single" w:sz="4" w:space="0" w:color="FFFFFF" w:themeColor="background1"/>
-        <w:left w:val="single" w:sz="4" w:space="0" w:color="FFFFFF" w:themeColor="background1"/>
-        <w:bottom w:val="single" w:sz="4" w:space="0" w:color="FFFFFF" w:themeColor="background1"/>
-        <w:right w:val="single" w:sz="4" w:space="0" w:color="FFFFFF" w:themeColor="background1"/>
-        <w:insideH w:val="single" w:sz="4" w:space="0" w:color="FFFFFF" w:themeColor="background1"/>
-        <w:insideV w:val="single" w:sz="4" w:space="0" w:color="FFFFFF" w:themeColor="background1"/>
+        <w:top w:val="single" w:color="FFFFFF" w:themeColor="background1" w:sz="4" w:space="0"/>
+        <w:left w:val="single" w:color="FFFFFF" w:themeColor="background1" w:sz="4" w:space="0"/>
+        <w:bottom w:val="single" w:color="FFFFFF" w:themeColor="background1" w:sz="4" w:space="0"/>
+        <w:right w:val="single" w:color="FFFFFF" w:themeColor="background1" w:sz="4" w:space="0"/>
+        <w:insideH w:val="single" w:color="FFFFFF" w:themeColor="background1" w:sz="4" w:space="0"/>
+        <w:insideV w:val="single" w:color="FFFFFF" w:themeColor="background1" w:sz="4" w:space="0"/>
       </w:tblBorders>
     </w:tblPr>
     <w:tcPr>
@@ -29593,9 +29549,9 @@
       <w:tblPr/>
       <w:tcPr>
         <w:tcBorders>
-          <w:top w:val="single" w:sz="4" w:space="0" w:color="FFFFFF" w:themeColor="background1"/>
-          <w:left w:val="single" w:sz="4" w:space="0" w:color="FFFFFF" w:themeColor="background1"/>
-          <w:right w:val="single" w:sz="4" w:space="0" w:color="FFFFFF" w:themeColor="background1"/>
+          <w:top w:val="single" w:color="FFFFFF" w:themeColor="background1" w:sz="4" w:space="0"/>
+          <w:left w:val="single" w:color="FFFFFF" w:themeColor="background1" w:sz="4" w:space="0"/>
+          <w:right w:val="single" w:color="FFFFFF" w:themeColor="background1" w:sz="4" w:space="0"/>
           <w:insideH w:val="nil"/>
           <w:insideV w:val="nil"/>
         </w:tcBorders>
@@ -29611,9 +29567,9 @@
       <w:tblPr/>
       <w:tcPr>
         <w:tcBorders>
-          <w:left w:val="single" w:sz="4" w:space="0" w:color="FFFFFF" w:themeColor="background1"/>
-          <w:bottom w:val="single" w:sz="4" w:space="0" w:color="FFFFFF" w:themeColor="background1"/>
-          <w:right w:val="single" w:sz="4" w:space="0" w:color="FFFFFF" w:themeColor="background1"/>
+          <w:left w:val="single" w:color="FFFFFF" w:themeColor="background1" w:sz="4" w:space="0"/>
+          <w:bottom w:val="single" w:color="FFFFFF" w:themeColor="background1" w:sz="4" w:space="0"/>
+          <w:right w:val="single" w:color="FFFFFF" w:themeColor="background1" w:sz="4" w:space="0"/>
           <w:insideH w:val="nil"/>
           <w:insideV w:val="nil"/>
         </w:tcBorders>
@@ -29629,9 +29585,9 @@
       <w:tblPr/>
       <w:tcPr>
         <w:tcBorders>
-          <w:top w:val="single" w:sz="4" w:space="0" w:color="FFFFFF" w:themeColor="background1"/>
-          <w:left w:val="single" w:sz="4" w:space="0" w:color="FFFFFF" w:themeColor="background1"/>
-          <w:bottom w:val="single" w:sz="4" w:space="0" w:color="FFFFFF" w:themeColor="background1"/>
+          <w:top w:val="single" w:color="FFFFFF" w:themeColor="background1" w:sz="4" w:space="0"/>
+          <w:left w:val="single" w:color="FFFFFF" w:themeColor="background1" w:sz="4" w:space="0"/>
+          <w:bottom w:val="single" w:color="FFFFFF" w:themeColor="background1" w:sz="4" w:space="0"/>
           <w:insideV w:val="nil"/>
         </w:tcBorders>
         <w:shd w:val="clear" w:color="auto" w:fill="4BACC6" w:themeFill="accent5"/>
@@ -29646,9 +29602,9 @@
       <w:tblPr/>
       <w:tcPr>
         <w:tcBorders>
-          <w:top w:val="single" w:sz="4" w:space="0" w:color="FFFFFF" w:themeColor="background1"/>
-          <w:bottom w:val="single" w:sz="4" w:space="0" w:color="FFFFFF" w:themeColor="background1"/>
-          <w:right w:val="single" w:sz="4" w:space="0" w:color="FFFFFF" w:themeColor="background1"/>
+          <w:top w:val="single" w:color="FFFFFF" w:themeColor="background1" w:sz="4" w:space="0"/>
+          <w:bottom w:val="single" w:color="FFFFFF" w:themeColor="background1" w:sz="4" w:space="0"/>
+          <w:right w:val="single" w:color="FFFFFF" w:themeColor="background1" w:sz="4" w:space="0"/>
           <w:insideV w:val="nil"/>
         </w:tcBorders>
         <w:shd w:val="clear" w:color="auto" w:fill="4BACC6" w:themeFill="accent5"/>
@@ -29679,12 +29635,12 @@
       <w:tblStyleRowBandSize w:val="1"/>
       <w:tblStyleColBandSize w:val="1"/>
       <w:tblBorders>
-        <w:top w:val="single" w:sz="4" w:space="0" w:color="B6DDE8" w:themeColor="accent5" w:themeTint="66"/>
-        <w:left w:val="single" w:sz="4" w:space="0" w:color="B6DDE8" w:themeColor="accent5" w:themeTint="66"/>
-        <w:bottom w:val="single" w:sz="4" w:space="0" w:color="B6DDE8" w:themeColor="accent5" w:themeTint="66"/>
-        <w:right w:val="single" w:sz="4" w:space="0" w:color="B6DDE8" w:themeColor="accent5" w:themeTint="66"/>
-        <w:insideH w:val="single" w:sz="4" w:space="0" w:color="B6DDE8" w:themeColor="accent5" w:themeTint="66"/>
-        <w:insideV w:val="single" w:sz="4" w:space="0" w:color="B6DDE8" w:themeColor="accent5" w:themeTint="66"/>
+        <w:top w:val="single" w:color="B6DDE8" w:themeColor="accent5" w:themeTint="66" w:sz="4" w:space="0"/>
+        <w:left w:val="single" w:color="B6DDE8" w:themeColor="accent5" w:themeTint="66" w:sz="4" w:space="0"/>
+        <w:bottom w:val="single" w:color="B6DDE8" w:themeColor="accent5" w:themeTint="66" w:sz="4" w:space="0"/>
+        <w:right w:val="single" w:color="B6DDE8" w:themeColor="accent5" w:themeTint="66" w:sz="4" w:space="0"/>
+        <w:insideH w:val="single" w:color="B6DDE8" w:themeColor="accent5" w:themeTint="66" w:sz="4" w:space="0"/>
+        <w:insideV w:val="single" w:color="B6DDE8" w:themeColor="accent5" w:themeTint="66" w:sz="4" w:space="0"/>
       </w:tblBorders>
     </w:tblPr>
     <w:tblStylePr w:type="firstRow">
@@ -29695,7 +29651,7 @@
       <w:tblPr/>
       <w:tcPr>
         <w:tcBorders>
-          <w:bottom w:val="single" w:sz="12" w:space="0" w:color="92CDDC" w:themeColor="accent5" w:themeTint="99"/>
+          <w:bottom w:val="single" w:color="92CDDC" w:themeColor="accent5" w:themeTint="99" w:sz="12" w:space="0"/>
         </w:tcBorders>
       </w:tcPr>
     </w:tblStylePr>
@@ -29707,7 +29663,7 @@
       <w:tblPr/>
       <w:tcPr>
         <w:tcBorders>
-          <w:top w:val="double" w:sz="2" w:space="0" w:color="92CDDC" w:themeColor="accent5" w:themeTint="99"/>
+          <w:top w:val="double" w:color="92CDDC" w:themeColor="accent5" w:themeTint="99" w:sz="2" w:space="0"/>
         </w:tcBorders>
       </w:tcPr>
     </w:tblStylePr>
@@ -29733,7 +29689,7 @@
       <w:spacing w:line="240" w:lineRule="auto"/>
     </w:pPr>
     <w:rPr>
-      <w:rFonts w:asciiTheme="minorHAnsi" w:eastAsiaTheme="minorHAnsi" w:hAnsiTheme="minorHAnsi" w:cstheme="minorBidi"/>
+      <w:rFonts w:asciiTheme="minorHAnsi" w:hAnsiTheme="minorHAnsi" w:eastAsiaTheme="minorHAnsi" w:cstheme="minorBidi"/>
       <w:kern w:val="2"/>
       <w:sz w:val="24"/>
       <w:szCs w:val="24"/>
@@ -29744,12 +29700,12 @@
       <w:tblStyleRowBandSize w:val="1"/>
       <w:tblStyleColBandSize w:val="1"/>
       <w:tblBorders>
-        <w:top w:val="single" w:sz="4" w:space="0" w:color="666666" w:themeColor="text1" w:themeTint="99"/>
-        <w:left w:val="single" w:sz="4" w:space="0" w:color="666666" w:themeColor="text1" w:themeTint="99"/>
-        <w:bottom w:val="single" w:sz="4" w:space="0" w:color="666666" w:themeColor="text1" w:themeTint="99"/>
-        <w:right w:val="single" w:sz="4" w:space="0" w:color="666666" w:themeColor="text1" w:themeTint="99"/>
-        <w:insideH w:val="single" w:sz="4" w:space="0" w:color="666666" w:themeColor="text1" w:themeTint="99"/>
-        <w:insideV w:val="single" w:sz="4" w:space="0" w:color="666666" w:themeColor="text1" w:themeTint="99"/>
+        <w:top w:val="single" w:color="666666" w:themeColor="text1" w:themeTint="99" w:sz="4" w:space="0"/>
+        <w:left w:val="single" w:color="666666" w:themeColor="text1" w:themeTint="99" w:sz="4" w:space="0"/>
+        <w:bottom w:val="single" w:color="666666" w:themeColor="text1" w:themeTint="99" w:sz="4" w:space="0"/>
+        <w:right w:val="single" w:color="666666" w:themeColor="text1" w:themeTint="99" w:sz="4" w:space="0"/>
+        <w:insideH w:val="single" w:color="666666" w:themeColor="text1" w:themeTint="99" w:sz="4" w:space="0"/>
+        <w:insideV w:val="single" w:color="666666" w:themeColor="text1" w:themeTint="99" w:sz="4" w:space="0"/>
       </w:tblBorders>
     </w:tblPr>
     <w:tblStylePr w:type="firstRow">
@@ -29839,7 +29795,7 @@
       <w:tblPr/>
       <w:tcPr>
         <w:tcBorders>
-          <w:bottom w:val="single" w:sz="4" w:space="0" w:color="666666" w:themeColor="text1" w:themeTint="99"/>
+          <w:bottom w:val="single" w:color="666666" w:themeColor="text1" w:themeTint="99" w:sz="4" w:space="0"/>
         </w:tcBorders>
       </w:tcPr>
     </w:tblStylePr>
@@ -29847,7 +29803,7 @@
       <w:tblPr/>
       <w:tcPr>
         <w:tcBorders>
-          <w:bottom w:val="single" w:sz="4" w:space="0" w:color="666666" w:themeColor="text1" w:themeTint="99"/>
+          <w:bottom w:val="single" w:color="666666" w:themeColor="text1" w:themeTint="99" w:sz="4" w:space="0"/>
         </w:tcBorders>
       </w:tcPr>
     </w:tblStylePr>
@@ -29855,7 +29811,7 @@
       <w:tblPr/>
       <w:tcPr>
         <w:tcBorders>
-          <w:top w:val="single" w:sz="4" w:space="0" w:color="666666" w:themeColor="text1" w:themeTint="99"/>
+          <w:top w:val="single" w:color="666666" w:themeColor="text1" w:themeTint="99" w:sz="4" w:space="0"/>
         </w:tcBorders>
       </w:tcPr>
     </w:tblStylePr>
@@ -29863,7 +29819,7 @@
       <w:tblPr/>
       <w:tcPr>
         <w:tcBorders>
-          <w:top w:val="single" w:sz="4" w:space="0" w:color="666666" w:themeColor="text1" w:themeTint="99"/>
+          <w:top w:val="single" w:color="666666" w:themeColor="text1" w:themeTint="99" w:sz="4" w:space="0"/>
         </w:tcBorders>
       </w:tcPr>
     </w:tblStylePr>
@@ -29877,7 +29833,7 @@
       <w:spacing w:line="240" w:lineRule="auto"/>
     </w:pPr>
     <w:rPr>
-      <w:rFonts w:asciiTheme="minorHAnsi" w:eastAsiaTheme="minorHAnsi" w:hAnsiTheme="minorHAnsi" w:cstheme="minorBidi"/>
+      <w:rFonts w:asciiTheme="minorHAnsi" w:hAnsiTheme="minorHAnsi" w:eastAsiaTheme="minorHAnsi" w:cstheme="minorBidi"/>
       <w:kern w:val="2"/>
       <w:sz w:val="24"/>
       <w:szCs w:val="24"/>
@@ -29888,12 +29844,12 @@
       <w:tblStyleRowBandSize w:val="1"/>
       <w:tblStyleColBandSize w:val="1"/>
       <w:tblBorders>
-        <w:top w:val="single" w:sz="4" w:space="0" w:color="B2A1C7" w:themeColor="accent4" w:themeTint="99"/>
-        <w:left w:val="single" w:sz="4" w:space="0" w:color="B2A1C7" w:themeColor="accent4" w:themeTint="99"/>
-        <w:bottom w:val="single" w:sz="4" w:space="0" w:color="B2A1C7" w:themeColor="accent4" w:themeTint="99"/>
-        <w:right w:val="single" w:sz="4" w:space="0" w:color="B2A1C7" w:themeColor="accent4" w:themeTint="99"/>
-        <w:insideH w:val="single" w:sz="4" w:space="0" w:color="B2A1C7" w:themeColor="accent4" w:themeTint="99"/>
-        <w:insideV w:val="single" w:sz="4" w:space="0" w:color="B2A1C7" w:themeColor="accent4" w:themeTint="99"/>
+        <w:top w:val="single" w:color="B2A1C7" w:themeColor="accent4" w:themeTint="99" w:sz="4" w:space="0"/>
+        <w:left w:val="single" w:color="B2A1C7" w:themeColor="accent4" w:themeTint="99" w:sz="4" w:space="0"/>
+        <w:bottom w:val="single" w:color="B2A1C7" w:themeColor="accent4" w:themeTint="99" w:sz="4" w:space="0"/>
+        <w:right w:val="single" w:color="B2A1C7" w:themeColor="accent4" w:themeTint="99" w:sz="4" w:space="0"/>
+        <w:insideH w:val="single" w:color="B2A1C7" w:themeColor="accent4" w:themeTint="99" w:sz="4" w:space="0"/>
+        <w:insideV w:val="single" w:color="B2A1C7" w:themeColor="accent4" w:themeTint="99" w:sz="4" w:space="0"/>
       </w:tblBorders>
     </w:tblPr>
     <w:tblStylePr w:type="firstRow">
@@ -29983,7 +29939,7 @@
       <w:tblPr/>
       <w:tcPr>
         <w:tcBorders>
-          <w:bottom w:val="single" w:sz="4" w:space="0" w:color="B2A1C7" w:themeColor="accent4" w:themeTint="99"/>
+          <w:bottom w:val="single" w:color="B2A1C7" w:themeColor="accent4" w:themeTint="99" w:sz="4" w:space="0"/>
         </w:tcBorders>
       </w:tcPr>
     </w:tblStylePr>
@@ -29991,7 +29947,7 @@
       <w:tblPr/>
       <w:tcPr>
         <w:tcBorders>
-          <w:bottom w:val="single" w:sz="4" w:space="0" w:color="B2A1C7" w:themeColor="accent4" w:themeTint="99"/>
+          <w:bottom w:val="single" w:color="B2A1C7" w:themeColor="accent4" w:themeTint="99" w:sz="4" w:space="0"/>
         </w:tcBorders>
       </w:tcPr>
     </w:tblStylePr>
@@ -29999,7 +29955,7 @@
       <w:tblPr/>
       <w:tcPr>
         <w:tcBorders>
-          <w:top w:val="single" w:sz="4" w:space="0" w:color="B2A1C7" w:themeColor="accent4" w:themeTint="99"/>
+          <w:top w:val="single" w:color="B2A1C7" w:themeColor="accent4" w:themeTint="99" w:sz="4" w:space="0"/>
         </w:tcBorders>
       </w:tcPr>
     </w:tblStylePr>
@@ -30007,7 +29963,7 @@
       <w:tblPr/>
       <w:tcPr>
         <w:tcBorders>
-          <w:top w:val="single" w:sz="4" w:space="0" w:color="B2A1C7" w:themeColor="accent4" w:themeTint="99"/>
+          <w:top w:val="single" w:color="B2A1C7" w:themeColor="accent4" w:themeTint="99" w:sz="4" w:space="0"/>
         </w:tcBorders>
       </w:tcPr>
     </w:tblStylePr>
@@ -30021,7 +29977,7 @@
       <w:spacing w:line="240" w:lineRule="auto"/>
     </w:pPr>
     <w:rPr>
-      <w:rFonts w:asciiTheme="minorHAnsi" w:eastAsiaTheme="minorHAnsi" w:hAnsiTheme="minorHAnsi" w:cstheme="minorBidi"/>
+      <w:rFonts w:asciiTheme="minorHAnsi" w:hAnsiTheme="minorHAnsi" w:eastAsiaTheme="minorHAnsi" w:cstheme="minorBidi"/>
       <w:kern w:val="2"/>
       <w:sz w:val="24"/>
       <w:szCs w:val="24"/>
@@ -30032,12 +29988,12 @@
       <w:tblStyleRowBandSize w:val="1"/>
       <w:tblStyleColBandSize w:val="1"/>
       <w:tblBorders>
-        <w:top w:val="single" w:sz="4" w:space="0" w:color="C2D69B" w:themeColor="accent3" w:themeTint="99"/>
-        <w:left w:val="single" w:sz="4" w:space="0" w:color="C2D69B" w:themeColor="accent3" w:themeTint="99"/>
-        <w:bottom w:val="single" w:sz="4" w:space="0" w:color="C2D69B" w:themeColor="accent3" w:themeTint="99"/>
-        <w:right w:val="single" w:sz="4" w:space="0" w:color="C2D69B" w:themeColor="accent3" w:themeTint="99"/>
-        <w:insideH w:val="single" w:sz="4" w:space="0" w:color="C2D69B" w:themeColor="accent3" w:themeTint="99"/>
-        <w:insideV w:val="single" w:sz="4" w:space="0" w:color="C2D69B" w:themeColor="accent3" w:themeTint="99"/>
+        <w:top w:val="single" w:color="C2D69B" w:themeColor="accent3" w:themeTint="99" w:sz="4" w:space="0"/>
+        <w:left w:val="single" w:color="C2D69B" w:themeColor="accent3" w:themeTint="99" w:sz="4" w:space="0"/>
+        <w:bottom w:val="single" w:color="C2D69B" w:themeColor="accent3" w:themeTint="99" w:sz="4" w:space="0"/>
+        <w:right w:val="single" w:color="C2D69B" w:themeColor="accent3" w:themeTint="99" w:sz="4" w:space="0"/>
+        <w:insideH w:val="single" w:color="C2D69B" w:themeColor="accent3" w:themeTint="99" w:sz="4" w:space="0"/>
+        <w:insideV w:val="single" w:color="C2D69B" w:themeColor="accent3" w:themeTint="99" w:sz="4" w:space="0"/>
       </w:tblBorders>
     </w:tblPr>
     <w:tblStylePr w:type="firstRow">
@@ -30127,7 +30083,7 @@
       <w:tblPr/>
       <w:tcPr>
         <w:tcBorders>
-          <w:bottom w:val="single" w:sz="4" w:space="0" w:color="C2D69B" w:themeColor="accent3" w:themeTint="99"/>
+          <w:bottom w:val="single" w:color="C2D69B" w:themeColor="accent3" w:themeTint="99" w:sz="4" w:space="0"/>
         </w:tcBorders>
       </w:tcPr>
     </w:tblStylePr>
@@ -30135,7 +30091,7 @@
       <w:tblPr/>
       <w:tcPr>
         <w:tcBorders>
-          <w:bottom w:val="single" w:sz="4" w:space="0" w:color="C2D69B" w:themeColor="accent3" w:themeTint="99"/>
+          <w:bottom w:val="single" w:color="C2D69B" w:themeColor="accent3" w:themeTint="99" w:sz="4" w:space="0"/>
         </w:tcBorders>
       </w:tcPr>
     </w:tblStylePr>
@@ -30143,7 +30099,7 @@
       <w:tblPr/>
       <w:tcPr>
         <w:tcBorders>
-          <w:top w:val="single" w:sz="4" w:space="0" w:color="C2D69B" w:themeColor="accent3" w:themeTint="99"/>
+          <w:top w:val="single" w:color="C2D69B" w:themeColor="accent3" w:themeTint="99" w:sz="4" w:space="0"/>
         </w:tcBorders>
       </w:tcPr>
     </w:tblStylePr>
@@ -30151,7 +30107,7 @@
       <w:tblPr/>
       <w:tcPr>
         <w:tcBorders>
-          <w:top w:val="single" w:sz="4" w:space="0" w:color="C2D69B" w:themeColor="accent3" w:themeTint="99"/>
+          <w:top w:val="single" w:color="C2D69B" w:themeColor="accent3" w:themeTint="99" w:sz="4" w:space="0"/>
         </w:tcBorders>
       </w:tcPr>
     </w:tblStylePr>
@@ -30168,12 +30124,12 @@
       <w:tblStyleRowBandSize w:val="1"/>
       <w:tblStyleColBandSize w:val="1"/>
       <w:tblBorders>
-        <w:top w:val="single" w:sz="4" w:space="0" w:color="C2D69B" w:themeColor="accent3" w:themeTint="99"/>
-        <w:left w:val="single" w:sz="4" w:space="0" w:color="C2D69B" w:themeColor="accent3" w:themeTint="99"/>
-        <w:bottom w:val="single" w:sz="4" w:space="0" w:color="C2D69B" w:themeColor="accent3" w:themeTint="99"/>
-        <w:right w:val="single" w:sz="4" w:space="0" w:color="C2D69B" w:themeColor="accent3" w:themeTint="99"/>
-        <w:insideH w:val="single" w:sz="4" w:space="0" w:color="C2D69B" w:themeColor="accent3" w:themeTint="99"/>
-        <w:insideV w:val="single" w:sz="4" w:space="0" w:color="C2D69B" w:themeColor="accent3" w:themeTint="99"/>
+        <w:top w:val="single" w:color="C2D69B" w:themeColor="accent3" w:themeTint="99" w:sz="4" w:space="0"/>
+        <w:left w:val="single" w:color="C2D69B" w:themeColor="accent3" w:themeTint="99" w:sz="4" w:space="0"/>
+        <w:bottom w:val="single" w:color="C2D69B" w:themeColor="accent3" w:themeTint="99" w:sz="4" w:space="0"/>
+        <w:right w:val="single" w:color="C2D69B" w:themeColor="accent3" w:themeTint="99" w:sz="4" w:space="0"/>
+        <w:insideH w:val="single" w:color="C2D69B" w:themeColor="accent3" w:themeTint="99" w:sz="4" w:space="0"/>
+        <w:insideV w:val="single" w:color="C2D69B" w:themeColor="accent3" w:themeTint="99" w:sz="4" w:space="0"/>
       </w:tblBorders>
     </w:tblPr>
     <w:tblStylePr w:type="firstRow">
@@ -30185,10 +30141,10 @@
       <w:tblPr/>
       <w:tcPr>
         <w:tcBorders>
-          <w:top w:val="single" w:sz="4" w:space="0" w:color="9BBB59" w:themeColor="accent3"/>
-          <w:left w:val="single" w:sz="4" w:space="0" w:color="9BBB59" w:themeColor="accent3"/>
-          <w:bottom w:val="single" w:sz="4" w:space="0" w:color="9BBB59" w:themeColor="accent3"/>
-          <w:right w:val="single" w:sz="4" w:space="0" w:color="9BBB59" w:themeColor="accent3"/>
+          <w:top w:val="single" w:color="9BBB59" w:themeColor="accent3" w:sz="4" w:space="0"/>
+          <w:left w:val="single" w:color="9BBB59" w:themeColor="accent3" w:sz="4" w:space="0"/>
+          <w:bottom w:val="single" w:color="9BBB59" w:themeColor="accent3" w:sz="4" w:space="0"/>
+          <w:right w:val="single" w:color="9BBB59" w:themeColor="accent3" w:sz="4" w:space="0"/>
           <w:insideH w:val="nil"/>
           <w:insideV w:val="nil"/>
         </w:tcBorders>
@@ -30203,7 +30159,7 @@
       <w:tblPr/>
       <w:tcPr>
         <w:tcBorders>
-          <w:top w:val="double" w:sz="4" w:space="0" w:color="9BBB59" w:themeColor="accent3"/>
+          <w:top w:val="double" w:color="9BBB59" w:themeColor="accent3" w:sz="4" w:space="0"/>
         </w:tcBorders>
       </w:tcPr>
     </w:tblStylePr>
@@ -30244,12 +30200,12 @@
       <w:tblStyleRowBandSize w:val="1"/>
       <w:tblStyleColBandSize w:val="1"/>
       <w:tblBorders>
-        <w:top w:val="single" w:sz="4" w:space="0" w:color="92CDDC" w:themeColor="accent5" w:themeTint="99"/>
-        <w:left w:val="single" w:sz="4" w:space="0" w:color="92CDDC" w:themeColor="accent5" w:themeTint="99"/>
-        <w:bottom w:val="single" w:sz="4" w:space="0" w:color="92CDDC" w:themeColor="accent5" w:themeTint="99"/>
-        <w:right w:val="single" w:sz="4" w:space="0" w:color="92CDDC" w:themeColor="accent5" w:themeTint="99"/>
-        <w:insideH w:val="single" w:sz="4" w:space="0" w:color="92CDDC" w:themeColor="accent5" w:themeTint="99"/>
-        <w:insideV w:val="single" w:sz="4" w:space="0" w:color="92CDDC" w:themeColor="accent5" w:themeTint="99"/>
+        <w:top w:val="single" w:color="92CDDC" w:themeColor="accent5" w:themeTint="99" w:sz="4" w:space="0"/>
+        <w:left w:val="single" w:color="92CDDC" w:themeColor="accent5" w:themeTint="99" w:sz="4" w:space="0"/>
+        <w:bottom w:val="single" w:color="92CDDC" w:themeColor="accent5" w:themeTint="99" w:sz="4" w:space="0"/>
+        <w:right w:val="single" w:color="92CDDC" w:themeColor="accent5" w:themeTint="99" w:sz="4" w:space="0"/>
+        <w:insideH w:val="single" w:color="92CDDC" w:themeColor="accent5" w:themeTint="99" w:sz="4" w:space="0"/>
+        <w:insideV w:val="single" w:color="92CDDC" w:themeColor="accent5" w:themeTint="99" w:sz="4" w:space="0"/>
       </w:tblBorders>
     </w:tblPr>
     <w:tblStylePr w:type="firstRow">
@@ -30339,7 +30295,7 @@
       <w:tblPr/>
       <w:tcPr>
         <w:tcBorders>
-          <w:bottom w:val="single" w:sz="4" w:space="0" w:color="92CDDC" w:themeColor="accent5" w:themeTint="99"/>
+          <w:bottom w:val="single" w:color="92CDDC" w:themeColor="accent5" w:themeTint="99" w:sz="4" w:space="0"/>
         </w:tcBorders>
       </w:tcPr>
     </w:tblStylePr>
@@ -30347,7 +30303,7 @@
       <w:tblPr/>
       <w:tcPr>
         <w:tcBorders>
-          <w:bottom w:val="single" w:sz="4" w:space="0" w:color="92CDDC" w:themeColor="accent5" w:themeTint="99"/>
+          <w:bottom w:val="single" w:color="92CDDC" w:themeColor="accent5" w:themeTint="99" w:sz="4" w:space="0"/>
         </w:tcBorders>
       </w:tcPr>
     </w:tblStylePr>
@@ -30355,7 +30311,7 @@
       <w:tblPr/>
       <w:tcPr>
         <w:tcBorders>
-          <w:top w:val="single" w:sz="4" w:space="0" w:color="92CDDC" w:themeColor="accent5" w:themeTint="99"/>
+          <w:top w:val="single" w:color="92CDDC" w:themeColor="accent5" w:themeTint="99" w:sz="4" w:space="0"/>
         </w:tcBorders>
       </w:tcPr>
     </w:tblStylePr>
@@ -30363,7 +30319,7 @@
       <w:tblPr/>
       <w:tcPr>
         <w:tcBorders>
-          <w:top w:val="single" w:sz="4" w:space="0" w:color="92CDDC" w:themeColor="accent5" w:themeTint="99"/>
+          <w:top w:val="single" w:color="92CDDC" w:themeColor="accent5" w:themeTint="99" w:sz="4" w:space="0"/>
         </w:tcBorders>
       </w:tcPr>
     </w:tblStylePr>
@@ -30377,7 +30333,7 @@
       <w:spacing w:line="240" w:lineRule="auto"/>
     </w:pPr>
     <w:rPr>
-      <w:rFonts w:asciiTheme="minorHAnsi" w:eastAsiaTheme="minorHAnsi" w:hAnsiTheme="minorHAnsi" w:cstheme="minorBidi"/>
+      <w:rFonts w:asciiTheme="minorHAnsi" w:hAnsiTheme="minorHAnsi" w:eastAsiaTheme="minorHAnsi" w:cstheme="minorBidi"/>
       <w:kern w:val="2"/>
       <w:sz w:val="24"/>
       <w:szCs w:val="24"/>
@@ -30388,12 +30344,12 @@
       <w:tblStyleRowBandSize w:val="1"/>
       <w:tblStyleColBandSize w:val="1"/>
       <w:tblBorders>
-        <w:top w:val="single" w:sz="4" w:space="0" w:color="FFFFFF" w:themeColor="background1"/>
-        <w:left w:val="single" w:sz="4" w:space="0" w:color="FFFFFF" w:themeColor="background1"/>
-        <w:bottom w:val="single" w:sz="4" w:space="0" w:color="FFFFFF" w:themeColor="background1"/>
-        <w:right w:val="single" w:sz="4" w:space="0" w:color="FFFFFF" w:themeColor="background1"/>
-        <w:insideH w:val="single" w:sz="4" w:space="0" w:color="FFFFFF" w:themeColor="background1"/>
-        <w:insideV w:val="single" w:sz="4" w:space="0" w:color="FFFFFF" w:themeColor="background1"/>
+        <w:top w:val="single" w:color="FFFFFF" w:themeColor="background1" w:sz="4" w:space="0"/>
+        <w:left w:val="single" w:color="FFFFFF" w:themeColor="background1" w:sz="4" w:space="0"/>
+        <w:bottom w:val="single" w:color="FFFFFF" w:themeColor="background1" w:sz="4" w:space="0"/>
+        <w:right w:val="single" w:color="FFFFFF" w:themeColor="background1" w:sz="4" w:space="0"/>
+        <w:insideH w:val="single" w:color="FFFFFF" w:themeColor="background1" w:sz="4" w:space="0"/>
+        <w:insideV w:val="single" w:color="FFFFFF" w:themeColor="background1" w:sz="4" w:space="0"/>
       </w:tblBorders>
     </w:tblPr>
     <w:tcPr>
@@ -30408,9 +30364,9 @@
       <w:tblPr/>
       <w:tcPr>
         <w:tcBorders>
-          <w:top w:val="single" w:sz="4" w:space="0" w:color="FFFFFF" w:themeColor="background1"/>
-          <w:left w:val="single" w:sz="4" w:space="0" w:color="FFFFFF" w:themeColor="background1"/>
-          <w:right w:val="single" w:sz="4" w:space="0" w:color="FFFFFF" w:themeColor="background1"/>
+          <w:top w:val="single" w:color="FFFFFF" w:themeColor="background1" w:sz="4" w:space="0"/>
+          <w:left w:val="single" w:color="FFFFFF" w:themeColor="background1" w:sz="4" w:space="0"/>
+          <w:right w:val="single" w:color="FFFFFF" w:themeColor="background1" w:sz="4" w:space="0"/>
           <w:insideH w:val="nil"/>
           <w:insideV w:val="nil"/>
         </w:tcBorders>
@@ -30426,9 +30382,9 @@
       <w:tblPr/>
       <w:tcPr>
         <w:tcBorders>
-          <w:left w:val="single" w:sz="4" w:space="0" w:color="FFFFFF" w:themeColor="background1"/>
-          <w:bottom w:val="single" w:sz="4" w:space="0" w:color="FFFFFF" w:themeColor="background1"/>
-          <w:right w:val="single" w:sz="4" w:space="0" w:color="FFFFFF" w:themeColor="background1"/>
+          <w:left w:val="single" w:color="FFFFFF" w:themeColor="background1" w:sz="4" w:space="0"/>
+          <w:bottom w:val="single" w:color="FFFFFF" w:themeColor="background1" w:sz="4" w:space="0"/>
+          <w:right w:val="single" w:color="FFFFFF" w:themeColor="background1" w:sz="4" w:space="0"/>
           <w:insideH w:val="nil"/>
           <w:insideV w:val="nil"/>
         </w:tcBorders>
@@ -30444,9 +30400,9 @@
       <w:tblPr/>
       <w:tcPr>
         <w:tcBorders>
-          <w:top w:val="single" w:sz="4" w:space="0" w:color="FFFFFF" w:themeColor="background1"/>
-          <w:left w:val="single" w:sz="4" w:space="0" w:color="FFFFFF" w:themeColor="background1"/>
-          <w:bottom w:val="single" w:sz="4" w:space="0" w:color="FFFFFF" w:themeColor="background1"/>
+          <w:top w:val="single" w:color="FFFFFF" w:themeColor="background1" w:sz="4" w:space="0"/>
+          <w:left w:val="single" w:color="FFFFFF" w:themeColor="background1" w:sz="4" w:space="0"/>
+          <w:bottom w:val="single" w:color="FFFFFF" w:themeColor="background1" w:sz="4" w:space="0"/>
           <w:insideV w:val="nil"/>
         </w:tcBorders>
         <w:shd w:val="clear" w:color="auto" w:fill="8064A2" w:themeFill="accent4"/>
@@ -30461,9 +30417,9 @@
       <w:tblPr/>
       <w:tcPr>
         <w:tcBorders>
-          <w:top w:val="single" w:sz="4" w:space="0" w:color="FFFFFF" w:themeColor="background1"/>
-          <w:bottom w:val="single" w:sz="4" w:space="0" w:color="FFFFFF" w:themeColor="background1"/>
-          <w:right w:val="single" w:sz="4" w:space="0" w:color="FFFFFF" w:themeColor="background1"/>
+          <w:top w:val="single" w:color="FFFFFF" w:themeColor="background1" w:sz="4" w:space="0"/>
+          <w:bottom w:val="single" w:color="FFFFFF" w:themeColor="background1" w:sz="4" w:space="0"/>
+          <w:right w:val="single" w:color="FFFFFF" w:themeColor="background1" w:sz="4" w:space="0"/>
           <w:insideV w:val="nil"/>
         </w:tcBorders>
         <w:shd w:val="clear" w:color="auto" w:fill="8064A2" w:themeFill="accent4"/>
@@ -30491,7 +30447,7 @@
       <w:spacing w:line="240" w:lineRule="auto"/>
     </w:pPr>
     <w:rPr>
-      <w:rFonts w:asciiTheme="minorHAnsi" w:eastAsiaTheme="minorHAnsi" w:hAnsiTheme="minorHAnsi" w:cstheme="minorBidi"/>
+      <w:rFonts w:asciiTheme="minorHAnsi" w:hAnsiTheme="minorHAnsi" w:eastAsiaTheme="minorHAnsi" w:cstheme="minorBidi"/>
       <w:kern w:val="2"/>
       <w:sz w:val="24"/>
       <w:szCs w:val="24"/>
@@ -30502,12 +30458,12 @@
       <w:tblStyleRowBandSize w:val="1"/>
       <w:tblStyleColBandSize w:val="1"/>
       <w:tblBorders>
-        <w:top w:val="single" w:sz="4" w:space="0" w:color="B2A1C7" w:themeColor="accent4" w:themeTint="99"/>
-        <w:left w:val="single" w:sz="4" w:space="0" w:color="B2A1C7" w:themeColor="accent4" w:themeTint="99"/>
-        <w:bottom w:val="single" w:sz="4" w:space="0" w:color="B2A1C7" w:themeColor="accent4" w:themeTint="99"/>
-        <w:right w:val="single" w:sz="4" w:space="0" w:color="B2A1C7" w:themeColor="accent4" w:themeTint="99"/>
-        <w:insideH w:val="single" w:sz="4" w:space="0" w:color="B2A1C7" w:themeColor="accent4" w:themeTint="99"/>
-        <w:insideV w:val="single" w:sz="4" w:space="0" w:color="B2A1C7" w:themeColor="accent4" w:themeTint="99"/>
+        <w:top w:val="single" w:color="B2A1C7" w:themeColor="accent4" w:themeTint="99" w:sz="4" w:space="0"/>
+        <w:left w:val="single" w:color="B2A1C7" w:themeColor="accent4" w:themeTint="99" w:sz="4" w:space="0"/>
+        <w:bottom w:val="single" w:color="B2A1C7" w:themeColor="accent4" w:themeTint="99" w:sz="4" w:space="0"/>
+        <w:right w:val="single" w:color="B2A1C7" w:themeColor="accent4" w:themeTint="99" w:sz="4" w:space="0"/>
+        <w:insideH w:val="single" w:color="B2A1C7" w:themeColor="accent4" w:themeTint="99" w:sz="4" w:space="0"/>
+        <w:insideV w:val="single" w:color="B2A1C7" w:themeColor="accent4" w:themeTint="99" w:sz="4" w:space="0"/>
       </w:tblBorders>
     </w:tblPr>
     <w:tblStylePr w:type="firstRow">
@@ -30519,10 +30475,10 @@
       <w:tblPr/>
       <w:tcPr>
         <w:tcBorders>
-          <w:top w:val="single" w:sz="4" w:space="0" w:color="8064A2" w:themeColor="accent4"/>
-          <w:left w:val="single" w:sz="4" w:space="0" w:color="8064A2" w:themeColor="accent4"/>
-          <w:bottom w:val="single" w:sz="4" w:space="0" w:color="8064A2" w:themeColor="accent4"/>
-          <w:right w:val="single" w:sz="4" w:space="0" w:color="8064A2" w:themeColor="accent4"/>
+          <w:top w:val="single" w:color="8064A2" w:themeColor="accent4" w:sz="4" w:space="0"/>
+          <w:left w:val="single" w:color="8064A2" w:themeColor="accent4" w:sz="4" w:space="0"/>
+          <w:bottom w:val="single" w:color="8064A2" w:themeColor="accent4" w:sz="4" w:space="0"/>
+          <w:right w:val="single" w:color="8064A2" w:themeColor="accent4" w:sz="4" w:space="0"/>
           <w:insideH w:val="nil"/>
           <w:insideV w:val="nil"/>
         </w:tcBorders>
@@ -30537,7 +30493,7 @@
       <w:tblPr/>
       <w:tcPr>
         <w:tcBorders>
-          <w:top w:val="double" w:sz="4" w:space="0" w:color="8064A2" w:themeColor="accent4"/>
+          <w:top w:val="double" w:color="8064A2" w:themeColor="accent4" w:sz="4" w:space="0"/>
         </w:tcBorders>
       </w:tcPr>
     </w:tblStylePr>
@@ -30578,12 +30534,12 @@
       <w:tblStyleRowBandSize w:val="1"/>
       <w:tblStyleColBandSize w:val="1"/>
       <w:tblBorders>
-        <w:top w:val="single" w:sz="4" w:space="0" w:color="B8CCE4" w:themeColor="accent1" w:themeTint="66"/>
-        <w:left w:val="single" w:sz="4" w:space="0" w:color="B8CCE4" w:themeColor="accent1" w:themeTint="66"/>
-        <w:bottom w:val="single" w:sz="4" w:space="0" w:color="B8CCE4" w:themeColor="accent1" w:themeTint="66"/>
-        <w:right w:val="single" w:sz="4" w:space="0" w:color="B8CCE4" w:themeColor="accent1" w:themeTint="66"/>
-        <w:insideH w:val="single" w:sz="4" w:space="0" w:color="B8CCE4" w:themeColor="accent1" w:themeTint="66"/>
-        <w:insideV w:val="single" w:sz="4" w:space="0" w:color="B8CCE4" w:themeColor="accent1" w:themeTint="66"/>
+        <w:top w:val="single" w:color="B8CCE4" w:themeColor="accent1" w:themeTint="66" w:sz="4" w:space="0"/>
+        <w:left w:val="single" w:color="B8CCE4" w:themeColor="accent1" w:themeTint="66" w:sz="4" w:space="0"/>
+        <w:bottom w:val="single" w:color="B8CCE4" w:themeColor="accent1" w:themeTint="66" w:sz="4" w:space="0"/>
+        <w:right w:val="single" w:color="B8CCE4" w:themeColor="accent1" w:themeTint="66" w:sz="4" w:space="0"/>
+        <w:insideH w:val="single" w:color="B8CCE4" w:themeColor="accent1" w:themeTint="66" w:sz="4" w:space="0"/>
+        <w:insideV w:val="single" w:color="B8CCE4" w:themeColor="accent1" w:themeTint="66" w:sz="4" w:space="0"/>
       </w:tblBorders>
     </w:tblPr>
     <w:tblStylePr w:type="firstRow">
@@ -30594,7 +30550,7 @@
       <w:tblPr/>
       <w:tcPr>
         <w:tcBorders>
-          <w:bottom w:val="single" w:sz="12" w:space="0" w:color="95B3D7" w:themeColor="accent1" w:themeTint="99"/>
+          <w:bottom w:val="single" w:color="95B3D7" w:themeColor="accent1" w:themeTint="99" w:sz="12" w:space="0"/>
         </w:tcBorders>
       </w:tcPr>
     </w:tblStylePr>
@@ -30606,7 +30562,7 @@
       <w:tblPr/>
       <w:tcPr>
         <w:tcBorders>
-          <w:top w:val="double" w:sz="2" w:space="0" w:color="95B3D7" w:themeColor="accent1" w:themeTint="99"/>
+          <w:top w:val="double" w:color="95B3D7" w:themeColor="accent1" w:themeTint="99" w:sz="2" w:space="0"/>
         </w:tcBorders>
       </w:tcPr>
     </w:tblStylePr>
@@ -30623,7 +30579,7 @@
       </w:rPr>
     </w:tblStylePr>
   </w:style>
-  <w:style w:type="character" w:customStyle="1" w:styleId="SubttuloCar">
+  <w:style w:type="character" w:styleId="SubttuloCar" w:customStyle="1">
     <w:name w:val="Subtítulo Car"/>
     <w:basedOn w:val="Fuentedeprrafopredeter"/>
     <w:link w:val="Subttulo"/>
@@ -31411,7 +31367,7 @@
               <a:latin typeface="Arial" panose="020B0604020202020204" pitchFamily="34" charset="0"/>
               <a:cs typeface="Arial" panose="020B0604020202020204" pitchFamily="34" charset="0"/>
             </a:rPr>
-            <a:t>Perfil del cliente</a:t>
+            <a:t>Perfil del consumidor</a:t>
           </a:r>
         </a:p>
       </dgm:t>
@@ -35444,7 +35400,7 @@
               <a:latin typeface="Arial" panose="020B0604020202020204" pitchFamily="34" charset="0"/>
               <a:cs typeface="Arial" panose="020B0604020202020204" pitchFamily="34" charset="0"/>
             </a:rPr>
-            <a:t>Perfil del cliente</a:t>
+            <a:t>Perfil del consumidor</a:t>
           </a:r>
         </a:p>
       </dsp:txBody>
@@ -39974,15 +39930,27 @@
 </file>
 
 <file path=customXml/item1.xml><?xml version="1.0" encoding="utf-8"?>
-<?mso-contentType ?>
-<FormTemplates xmlns="http://schemas.microsoft.com/sharepoint/v3/contenttype/forms">
-  <Display>DocumentLibraryForm</Display>
-  <Edit>DocumentLibraryForm</Edit>
-  <New>DocumentLibraryForm</New>
-</FormTemplates>
+<p:properties xmlns:p="http://schemas.microsoft.com/office/2006/metadata/properties" xmlns:xsi="http://www.w3.org/2001/XMLSchema-instance" xmlns:pc="http://schemas.microsoft.com/office/infopath/2007/PartnerControls">
+  <documentManagement>
+    <TaxCatchAll xmlns="67a0edcd-0de5-43ed-8c27-e32f38a00c91" xsi:nil="true"/>
+    <lcf76f155ced4ddcb4097134ff3c332f xmlns="42760c81-fd8e-4d59-8953-7cdb9f38b14f">
+      <Terms xmlns="http://schemas.microsoft.com/office/infopath/2007/PartnerControls"/>
+    </lcf76f155ced4ddcb4097134ff3c332f>
+  </documentManagement>
+</p:properties>
 </file>
 
 <file path=customXml/item2.xml><?xml version="1.0" encoding="utf-8"?>
+<b:Sources xmlns:b="http://schemas.openxmlformats.org/officeDocument/2006/bibliography" xmlns="http://schemas.openxmlformats.org/officeDocument/2006/bibliography" SelectedStyle="\APASixthEditionOfficeOnline.xsl" StyleName="APA" Version="6"/>
+</file>
+
+<file path=customXml/item3.xml><?xml version="1.0" encoding="utf-8"?>
+<go:gDocsCustomXmlDataStorage xmlns:go="http://customooxmlschemas.google.com/" xmlns:r="http://schemas.openxmlformats.org/officeDocument/2006/relationships">
+  <go:docsCustomData xmlns:go="http://customooxmlschemas.google.com/" roundtripDataSignature="AMtx7mgVwfTnThMJ3osM2v0+q+LoagmeAQ==">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</go:docsCustomData>
+</go:gDocsCustomXmlDataStorage>
+</file>
+
+<file path=customXml/item4.xml><?xml version="1.0" encoding="utf-8"?>
 <ct:contentTypeSchema xmlns:ct="http://schemas.microsoft.com/office/2006/metadata/contentType" xmlns:ma="http://schemas.microsoft.com/office/2006/metadata/properties/metaAttributes" ct:_="" ma:_="" ma:contentTypeName="Documento" ma:contentTypeID="0x01010005252A1EF3BD024F856B47B579AB5244" ma:contentTypeVersion="12" ma:contentTypeDescription="Crear nuevo documento." ma:contentTypeScope="" ma:versionID="32d0e18b85ac20c34eab62df21c0cf58">
   <xsd:schema xmlns:xsd="http://www.w3.org/2001/XMLSchema" xmlns:xs="http://www.w3.org/2001/XMLSchema" xmlns:p="http://schemas.microsoft.com/office/2006/metadata/properties" xmlns:ns2="42760c81-fd8e-4d59-8953-7cdb9f38b14f" xmlns:ns3="67a0edcd-0de5-43ed-8c27-e32f38a00c91" targetNamespace="http://schemas.microsoft.com/office/2006/metadata/properties" ma:root="true" ma:fieldsID="cc2c149e99f10870fd5bc3964e5386d3" ns2:_="" ns3:_="">
     <xsd:import namespace="42760c81-fd8e-4d59-8953-7cdb9f38b14f"/>
@@ -40183,36 +40151,44 @@
 </ct:contentTypeSchema>
 </file>
 
-<file path=customXml/item3.xml><?xml version="1.0" encoding="utf-8"?>
-<go:gDocsCustomXmlDataStorage xmlns:go="http://customooxmlschemas.google.com/" xmlns:r="http://schemas.openxmlformats.org/officeDocument/2006/relationships">
-  <go:docsCustomData xmlns:go="http://customooxmlschemas.google.com/" roundtripDataSignature="AMtx7mgVwfTnThMJ3osM2v0+q+LoagmeAQ==">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</go:docsCustomData>
-</go:gDocsCustomXmlDataStorage>
-</file>
-
-<file path=customXml/item4.xml><?xml version="1.0" encoding="utf-8"?>
-<b:Sources xmlns:b="http://schemas.openxmlformats.org/officeDocument/2006/bibliography" xmlns="http://schemas.openxmlformats.org/officeDocument/2006/bibliography" SelectedStyle="\APASixthEditionOfficeOnline.xsl" StyleName="APA" Version="6"/>
-</file>
-
 <file path=customXml/item5.xml><?xml version="1.0" encoding="utf-8"?>
-<p:properties xmlns:p="http://schemas.microsoft.com/office/2006/metadata/properties" xmlns:xsi="http://www.w3.org/2001/XMLSchema-instance" xmlns:pc="http://schemas.microsoft.com/office/infopath/2007/PartnerControls">
-  <documentManagement>
-    <TaxCatchAll xmlns="67a0edcd-0de5-43ed-8c27-e32f38a00c91" xsi:nil="true"/>
-    <lcf76f155ced4ddcb4097134ff3c332f xmlns="42760c81-fd8e-4d59-8953-7cdb9f38b14f">
-      <Terms xmlns="http://schemas.microsoft.com/office/infopath/2007/PartnerControls"/>
-    </lcf76f155ced4ddcb4097134ff3c332f>
-  </documentManagement>
-</p:properties>
+<?mso-contentType ?>
+<FormTemplates xmlns="http://schemas.microsoft.com/sharepoint/v3/contenttype/forms">
+  <Display>DocumentLibraryForm</Display>
+  <Edit>DocumentLibraryForm</Edit>
+  <New>DocumentLibraryForm</New>
+</FormTemplates>
 </file>
 
 <file path=customXml/itemProps1.xml><?xml version="1.0" encoding="utf-8"?>
-<ds:datastoreItem xmlns:ds="http://schemas.openxmlformats.org/officeDocument/2006/customXml" ds:itemID="{7E446165-1B4B-4805-A1B6-93D4094688E3}">
+<ds:datastoreItem xmlns:ds="http://schemas.openxmlformats.org/officeDocument/2006/customXml" ds:itemID="{F37F9110-465B-45DF-8B3C-CE0F643F750C}">
   <ds:schemaRefs>
-    <ds:schemaRef ds:uri="http://schemas.microsoft.com/sharepoint/v3/contenttype/forms"/>
+    <ds:schemaRef ds:uri="http://schemas.microsoft.com/office/2006/metadata/properties"/>
+    <ds:schemaRef ds:uri="http://schemas.microsoft.com/office/infopath/2007/PartnerControls"/>
+    <ds:schemaRef ds:uri="67a0edcd-0de5-43ed-8c27-e32f38a00c91"/>
+    <ds:schemaRef ds:uri="42760c81-fd8e-4d59-8953-7cdb9f38b14f"/>
   </ds:schemaRefs>
 </ds:datastoreItem>
 </file>
 
 <file path=customXml/itemProps2.xml><?xml version="1.0" encoding="utf-8"?>
+<ds:datastoreItem xmlns:ds="http://schemas.openxmlformats.org/officeDocument/2006/customXml" ds:itemID="{C89CCF24-26B8-4CD2-A8D8-0B590468495C}">
+  <ds:schemaRefs>
+    <ds:schemaRef ds:uri="http://schemas.openxmlformats.org/officeDocument/2006/bibliography"/>
+  </ds:schemaRefs>
+</ds:datastoreItem>
+</file>
+
+<file path=customXml/itemProps3.xml><?xml version="1.0" encoding="utf-8"?>
+<ds:datastoreItem xmlns:ds="http://schemas.openxmlformats.org/officeDocument/2006/customXml" ds:itemID="{11111111-1234-1234-1234-123412341234}">
+  <ds:schemaRefs>
+    <ds:schemaRef ds:uri="http://customooxmlschemas.google.com/"/>
+    <ds:schemaRef ds:uri="http://schemas.openxmlformats.org/officeDocument/2006/relationships"/>
+  </ds:schemaRefs>
+</ds:datastoreItem>
+</file>
+
+<file path=customXml/itemProps4.xml><?xml version="1.0" encoding="utf-8"?>
 <ds:datastoreItem xmlns:ds="http://schemas.openxmlformats.org/officeDocument/2006/customXml" ds:itemID="{02724517-01D7-4F80-A0EA-B16E4B8F3A08}">
   <ds:schemaRefs>
     <ds:schemaRef ds:uri="http://schemas.microsoft.com/office/2006/metadata/contentType"/>
@@ -40231,30 +40207,10 @@
 </ds:datastoreItem>
 </file>
 
-<file path=customXml/itemProps3.xml><?xml version="1.0" encoding="utf-8"?>
-<ds:datastoreItem xmlns:ds="http://schemas.openxmlformats.org/officeDocument/2006/customXml" ds:itemID="{11111111-1234-1234-1234-123412341234}">
+<file path=customXml/itemProps5.xml><?xml version="1.0" encoding="utf-8"?>
+<ds:datastoreItem xmlns:ds="http://schemas.openxmlformats.org/officeDocument/2006/customXml" ds:itemID="{7E446165-1B4B-4805-A1B6-93D4094688E3}">
   <ds:schemaRefs>
-    <ds:schemaRef ds:uri="http://customooxmlschemas.google.com/"/>
-    <ds:schemaRef ds:uri="http://schemas.openxmlformats.org/officeDocument/2006/relationships"/>
-  </ds:schemaRefs>
-</ds:datastoreItem>
-</file>
-
-<file path=customXml/itemProps4.xml><?xml version="1.0" encoding="utf-8"?>
-<ds:datastoreItem xmlns:ds="http://schemas.openxmlformats.org/officeDocument/2006/customXml" ds:itemID="{C89CCF24-26B8-4CD2-A8D8-0B590468495C}">
-  <ds:schemaRefs>
-    <ds:schemaRef ds:uri="http://schemas.openxmlformats.org/officeDocument/2006/bibliography"/>
-  </ds:schemaRefs>
-</ds:datastoreItem>
-</file>
-
-<file path=customXml/itemProps5.xml><?xml version="1.0" encoding="utf-8"?>
-<ds:datastoreItem xmlns:ds="http://schemas.openxmlformats.org/officeDocument/2006/customXml" ds:itemID="{F37F9110-465B-45DF-8B3C-CE0F643F750C}">
-  <ds:schemaRefs>
-    <ds:schemaRef ds:uri="http://schemas.microsoft.com/office/2006/metadata/properties"/>
-    <ds:schemaRef ds:uri="http://schemas.microsoft.com/office/infopath/2007/PartnerControls"/>
-    <ds:schemaRef ds:uri="67a0edcd-0de5-43ed-8c27-e32f38a00c91"/>
-    <ds:schemaRef ds:uri="42760c81-fd8e-4d59-8953-7cdb9f38b14f"/>
+    <ds:schemaRef ds:uri="http://schemas.microsoft.com/sharepoint/v3/contenttype/forms"/>
   </ds:schemaRefs>
 </ds:datastoreItem>
 </file>
</xml_diff>